<commit_message>
fix(adaptive-path): sua loi dem cau sai, cap nhat mau sac va can chinh thanh cong cu
</commit_message>
<xml_diff>
--- a/PhanTichYeuCau_Elearning_AI_LeVanThai.docx
+++ b/PhanTichYeuCau_Elearning_AI_LeVanThai.docx
@@ -19,6 +19,12 @@
     <w:sdt>
       <w:sdtPr>
         <w:rPr>
+          <w:rFonts w:ascii="Times New Roman" w:eastAsiaTheme="minorEastAsia" w:hAnsi="Times New Roman" w:cstheme="minorBidi"/>
+          <w:b w:val="0"/>
+          <w:bCs w:val="0"/>
+          <w:color w:val="1E293B"/>
+          <w:sz w:val="24"/>
+          <w:szCs w:val="22"/>
           <w:lang w:val="vi-VN"/>
         </w:rPr>
         <w:id w:val="712468158"/>
@@ -29,10 +35,6 @@
       </w:sdtPr>
       <w:sdtEndPr>
         <w:rPr>
-          <w:rFonts w:ascii="Times New Roman" w:eastAsiaTheme="minorEastAsia" w:hAnsi="Times New Roman" w:cstheme="minorBidi"/>
-          <w:color w:val="1E293B"/>
-          <w:sz w:val="24"/>
-          <w:szCs w:val="22"/>
           <w:lang w:val="en-US"/>
         </w:rPr>
       </w:sdtEndPr>
@@ -11682,6 +11684,75 @@
     </w:p>
     <w:p>
       <w:pPr>
+        <w:jc w:val="center"/>
+      </w:pPr>
+      <w:r>
+        <w:rPr>
+          <w:noProof/>
+        </w:rPr>
+        <w:lastRenderedPageBreak/>
+        <w:drawing>
+          <wp:inline distT="0" distB="0" distL="0" distR="0" wp14:anchorId="6E9620C0" wp14:editId="11F519CE">
+            <wp:extent cx="6034233" cy="4025443"/>
+            <wp:effectExtent l="0" t="0" r="5080" b="0"/>
+            <wp:docPr id="1736859843" name="Hình ảnh 3"/>
+            <wp:cNvGraphicFramePr>
+              <a:graphicFrameLocks xmlns:a="http://schemas.openxmlformats.org/drawingml/2006/main" noChangeAspect="1"/>
+            </wp:cNvGraphicFramePr>
+            <a:graphic xmlns:a="http://schemas.openxmlformats.org/drawingml/2006/main">
+              <a:graphicData uri="http://schemas.openxmlformats.org/drawingml/2006/picture">
+                <pic:pic xmlns:pic="http://schemas.openxmlformats.org/drawingml/2006/picture">
+                  <pic:nvPicPr>
+                    <pic:cNvPr id="0" name="Picture 2"/>
+                    <pic:cNvPicPr>
+                      <a:picLocks noChangeAspect="1" noChangeArrowheads="1"/>
+                    </pic:cNvPicPr>
+                  </pic:nvPicPr>
+                  <pic:blipFill>
+                    <a:blip r:embed="rId8">
+                      <a:extLst>
+                        <a:ext uri="{28A0092B-C50C-407E-A947-70E740481C1C}">
+                          <a14:useLocalDpi xmlns:a14="http://schemas.microsoft.com/office/drawing/2010/main" val="0"/>
+                        </a:ext>
+                      </a:extLst>
+                    </a:blip>
+                    <a:srcRect/>
+                    <a:stretch>
+                      <a:fillRect/>
+                    </a:stretch>
+                  </pic:blipFill>
+                  <pic:spPr bwMode="auto">
+                    <a:xfrm>
+                      <a:off x="0" y="0"/>
+                      <a:ext cx="6055684" cy="4039753"/>
+                    </a:xfrm>
+                    <a:prstGeom prst="rect">
+                      <a:avLst/>
+                    </a:prstGeom>
+                    <a:noFill/>
+                  </pic:spPr>
+                </pic:pic>
+              </a:graphicData>
+            </a:graphic>
+          </wp:inline>
+        </w:drawing>
+      </w:r>
+    </w:p>
+    <w:p>
+      <w:pPr>
+        <w:jc w:val="center"/>
+      </w:pPr>
+      <w:r>
+        <w:rPr>
+          <w:b/>
+          <w:i/>
+          <w:sz w:val="22"/>
+        </w:rPr>
+        <w:t>Hình 5.1: Sơ đồ Use Case tổng quan toàn hệ thống E-learning AI</w:t>
+      </w:r>
+    </w:p>
+    <w:p>
+      <w:pPr>
         <w:pStyle w:val="u2"/>
         <w:spacing w:after="80"/>
       </w:pPr>
@@ -11710,7 +11781,6 @@
           <w:i/>
           <w:sz w:val="22"/>
         </w:rPr>
-        <w:lastRenderedPageBreak/>
         <w:t>Bảng 5.1: Danh mục tổng hợp 16 Use Case toàn hệ thống</w:t>
       </w:r>
     </w:p>
@@ -12409,6 +12479,7 @@
               <w:rPr>
                 <w:sz w:val="20"/>
               </w:rPr>
+              <w:lastRenderedPageBreak/>
               <w:t>UC05</w:t>
             </w:r>
           </w:p>
@@ -13437,7 +13508,6 @@
               <w:rPr>
                 <w:sz w:val="20"/>
               </w:rPr>
-              <w:lastRenderedPageBreak/>
               <w:t>UC13</w:t>
             </w:r>
           </w:p>
@@ -13959,6 +14029,7 @@
         <w:rPr>
           <w:rFonts w:ascii="Times New Roman" w:hAnsi="Times New Roman"/>
         </w:rPr>
+        <w:lastRenderedPageBreak/>
         <w:t>5.3.1. Đặc tả UC01 – Đăng nhập &amp; Xác thực phân quyền</w:t>
       </w:r>
       <w:bookmarkEnd w:id="29"/>
@@ -14417,14 +14488,7 @@
                 <w:sz w:val="20"/>
               </w:rPr>
               <w:br/>
-              <w:t xml:space="preserve">8. Frontend lưu token, cập nhật trạng thái AuthContext và điều hướng tới </w:t>
-            </w:r>
-            <w:r>
-              <w:rPr>
-                <w:sz w:val="20"/>
-              </w:rPr>
-              <w:lastRenderedPageBreak/>
-              <w:t>Dashboard tương ứng.</w:t>
+              <w:t>8. Frontend lưu token, cập nhật trạng thái AuthContext và điều hướng tới Dashboard tương ứng.</w:t>
             </w:r>
           </w:p>
         </w:tc>
@@ -14453,7 +14517,6 @@
               <w:rPr>
                 <w:sz w:val="20"/>
               </w:rPr>
-              <w:lastRenderedPageBreak/>
               <w:t>Luồng rẽ nhánh / Ngoại lệ (Alternative / Exception Flows)</w:t>
             </w:r>
           </w:p>
@@ -14776,6 +14839,7 @@
                 <w:sz w:val="20"/>
                 <w:lang w:val="fr-FR"/>
               </w:rPr>
+              <w:lastRenderedPageBreak/>
               <w:t>Điều kiện tiên quyết (Pre-conditions)</w:t>
             </w:r>
           </w:p>
@@ -15084,7 +15148,6 @@
                 <w:color w:val="FFFFFF"/>
                 <w:sz w:val="21"/>
               </w:rPr>
-              <w:lastRenderedPageBreak/>
               <w:t>Mã ca sử dụng (ID)</w:t>
             </w:r>
           </w:p>
@@ -15459,6 +15522,12 @@
                 <w:sz w:val="20"/>
               </w:rPr>
               <w:br/>
+            </w:r>
+            <w:r>
+              <w:rPr>
+                <w:sz w:val="20"/>
+              </w:rPr>
+              <w:lastRenderedPageBreak/>
               <w:t>4. Trường hợp đạt chuẩn: Reviewer nhấn 'Phê duyệt' (Approve).</w:t>
             </w:r>
             <w:r>
@@ -15502,6 +15571,7 @@
               <w:rPr>
                 <w:sz w:val="20"/>
               </w:rPr>
+              <w:lastRenderedPageBreak/>
               <w:t>Luồng rẽ nhánh / Ngoại lệ (Alternative / Exception Flows)</w:t>
             </w:r>
           </w:p>
@@ -15888,7 +15958,6 @@
               <w:rPr>
                 <w:sz w:val="20"/>
               </w:rPr>
-              <w:lastRenderedPageBreak/>
               <w:t>Điều kiện kết thúc (Post-conditions)</w:t>
             </w:r>
           </w:p>
@@ -16051,7 +16120,14 @@
               <w:rPr>
                 <w:sz w:val="20"/>
               </w:rPr>
-              <w:t>Luồng rẽ nhánh / Ngoại lệ (Alternative / Exception Flows)</w:t>
+              <w:t xml:space="preserve">Luồng rẽ nhánh / Ngoại lệ </w:t>
+            </w:r>
+            <w:r>
+              <w:rPr>
+                <w:sz w:val="20"/>
+              </w:rPr>
+              <w:lastRenderedPageBreak/>
+              <w:t>(Alternative / Exception Flows)</w:t>
             </w:r>
           </w:p>
         </w:tc>
@@ -16075,7 +16151,15 @@
               <w:rPr>
                 <w:sz w:val="20"/>
               </w:rPr>
-              <w:t>7a. Phản hồi từ AI không đúng cấu trúc JSON hoặc thiếu trường dữ liệu: Backend tự động kích hoạt fallback prompt hoặc báo lỗi 'AI sinh phản hồi không hợp lệ, vui lòng thử lại'.</w:t>
+              <w:lastRenderedPageBreak/>
+              <w:t xml:space="preserve">7a. Phản hồi từ AI không đúng cấu trúc JSON hoặc thiếu trường dữ liệu: Backend tự động kích hoạt fallback prompt hoặc báo lỗi 'AI sinh phản hồi </w:t>
+            </w:r>
+            <w:r>
+              <w:rPr>
+                <w:sz w:val="20"/>
+              </w:rPr>
+              <w:lastRenderedPageBreak/>
+              <w:t>không hợp lệ, vui lòng thử lại'.</w:t>
             </w:r>
             <w:r>
               <w:rPr>
@@ -16098,6 +16182,7 @@
         <w:rPr>
           <w:rFonts w:ascii="Times New Roman" w:hAnsi="Times New Roman"/>
         </w:rPr>
+        <w:lastRenderedPageBreak/>
         <w:t>5.3.5. Đặc tả UC05 – Soạn thảo, gửi duyệt và kiểm định bộ từ vựng Flashcard</w:t>
       </w:r>
       <w:bookmarkEnd w:id="33"/>
@@ -16535,12 +16620,6 @@
                 <w:sz w:val="20"/>
               </w:rPr>
               <w:br/>
-            </w:r>
-            <w:r>
-              <w:rPr>
-                <w:sz w:val="20"/>
-              </w:rPr>
-              <w:lastRenderedPageBreak/>
               <w:t>5. Giảng viên kiểm tra lại và nhấn 'Nộp kiểm duyệt' (Submit Topic for Review).</w:t>
             </w:r>
             <w:r>
@@ -16591,7 +16670,6 @@
               <w:rPr>
                 <w:sz w:val="20"/>
               </w:rPr>
-              <w:lastRenderedPageBreak/>
               <w:t>Luồng rẽ nhánh / Ngoại lệ (Alternative / Exception Flows)</w:t>
             </w:r>
           </w:p>
@@ -16695,6 +16773,7 @@
                 <w:color w:val="FFFFFF"/>
                 <w:sz w:val="21"/>
               </w:rPr>
+              <w:lastRenderedPageBreak/>
               <w:t>Mã ca sử dụng (ID)</w:t>
             </w:r>
           </w:p>
@@ -17097,14 +17176,7 @@
                 <w:sz w:val="20"/>
               </w:rPr>
               <w:br/>
-              <w:t xml:space="preserve">8. Frontend hiển thị biểu đồ Radar năng lực, danh sách kỹ năng cần cải thiện </w:t>
-            </w:r>
-            <w:r>
-              <w:rPr>
-                <w:sz w:val="20"/>
-              </w:rPr>
-              <w:lastRenderedPageBreak/>
-              <w:t>và gợi ý nút 'Luyện tập điểm yếu ngay' (Practice Weak Topics).</w:t>
+              <w:t>8. Frontend hiển thị biểu đồ Radar năng lực, danh sách kỹ năng cần cải thiện và gợi ý nút 'Luyện tập điểm yếu ngay' (Practice Weak Topics).</w:t>
             </w:r>
           </w:p>
         </w:tc>
@@ -17133,7 +17205,6 @@
               <w:rPr>
                 <w:sz w:val="20"/>
               </w:rPr>
-              <w:lastRenderedPageBreak/>
               <w:t>Luồng rẽ nhánh / Ngoại lệ (Alternative / Exception Flows)</w:t>
             </w:r>
           </w:p>
@@ -17449,6 +17520,7 @@
                 <w:sz w:val="20"/>
                 <w:lang w:val="fr-FR"/>
               </w:rPr>
+              <w:lastRenderedPageBreak/>
               <w:t>Điều kiện tiên quyết (Pre-conditions)</w:t>
             </w:r>
           </w:p>
@@ -17757,7 +17829,6 @@
                 <w:color w:val="FFFFFF"/>
                 <w:sz w:val="21"/>
               </w:rPr>
-              <w:lastRenderedPageBreak/>
               <w:t>Mã ca sử dụng (ID)</w:t>
             </w:r>
           </w:p>
@@ -18132,6 +18203,12 @@
                 <w:sz w:val="20"/>
               </w:rPr>
               <w:br/>
+            </w:r>
+            <w:r>
+              <w:rPr>
+                <w:sz w:val="20"/>
+              </w:rPr>
+              <w:lastRenderedPageBreak/>
               <w:t>4. Backend kích hoạt bộ phân tích cú pháp (Parser): đọc từng dòng văn bản Word hoặc các cột Excel (Question, Option A, Option B, Option C, Option D, Correct Answer, Explanation).</w:t>
             </w:r>
             <w:r>
@@ -18189,6 +18266,7 @@
               <w:rPr>
                 <w:sz w:val="20"/>
               </w:rPr>
+              <w:lastRenderedPageBreak/>
               <w:t>Luồng rẽ nhánh / Ngoại lệ (Alternative / Exception Flows)</w:t>
             </w:r>
           </w:p>
@@ -18321,7 +18399,6 @@
         <w:rPr>
           <w:b/>
         </w:rPr>
-        <w:lastRenderedPageBreak/>
         <w:t>Bước 4a - Trường hợp Phê duyệt:</w:t>
       </w:r>
       <w:r>
@@ -18409,6 +18486,7 @@
         <w:rPr>
           <w:b/>
         </w:rPr>
+        <w:lastRenderedPageBreak/>
         <w:t>Nguyên tắc 2 - Chặn tạo từ vựng:</w:t>
       </w:r>
       <w:r>
@@ -18544,7 +18622,6 @@
         <w:rPr>
           <w:rFonts w:ascii="Times New Roman" w:hAnsi="Times New Roman"/>
         </w:rPr>
-        <w:lastRenderedPageBreak/>
         <w:t>6. THIẾT KẾ KIẾN TRÚC HỆ THỐNG VÀ CƠ SỞ DỮ LIỆU</w:t>
       </w:r>
       <w:bookmarkEnd w:id="41"/>
@@ -18865,6 +18942,7 @@
               <w:rPr>
                 <w:sz w:val="20"/>
               </w:rPr>
+              <w:lastRenderedPageBreak/>
               <w:t>Business Logic Layer (Services)</w:t>
             </w:r>
           </w:p>
@@ -19313,7 +19391,6 @@
               <w:rPr>
                 <w:sz w:val="20"/>
               </w:rPr>
-              <w:lastRenderedPageBreak/>
               <w:t>courses</w:t>
             </w:r>
           </w:p>
@@ -19908,7 +19985,14 @@
               <w:rPr>
                 <w:sz w:val="20"/>
               </w:rPr>
-              <w:t>Quản lý hàng đợi duyệt của Reviewer, lịch sử phản biện 2 chiều (ReviewLog) cho Course và Flashcard.</w:t>
+              <w:t xml:space="preserve">Quản lý hàng đợi duyệt của Reviewer, lịch sử phản </w:t>
+            </w:r>
+            <w:r>
+              <w:rPr>
+                <w:sz w:val="20"/>
+              </w:rPr>
+              <w:lastRenderedPageBreak/>
+              <w:t>biện 2 chiều (ReviewLog) cho Course và Flashcard.</w:t>
             </w:r>
           </w:p>
         </w:tc>
@@ -19938,6 +20022,7 @@
               <w:rPr>
                 <w:sz w:val="20"/>
               </w:rPr>
+              <w:lastRenderedPageBreak/>
               <w:t>certificates</w:t>
             </w:r>
           </w:p>
@@ -20590,14 +20675,7 @@
               <w:rPr>
                 <w:sz w:val="20"/>
               </w:rPr>
-              <w:t xml:space="preserve">Bài học cụ thể: title, content, video_url, duration, </w:t>
-            </w:r>
-            <w:r>
-              <w:rPr>
-                <w:sz w:val="20"/>
-              </w:rPr>
-              <w:lastRenderedPageBreak/>
-              <w:t>order, lesson_type.</w:t>
+              <w:t>Bài học cụ thể: title, content, video_url, duration, order, lesson_type.</w:t>
             </w:r>
           </w:p>
         </w:tc>
@@ -20627,7 +20705,6 @@
               <w:rPr>
                 <w:sz w:val="20"/>
               </w:rPr>
-              <w:lastRenderedPageBreak/>
               <w:t>Material</w:t>
             </w:r>
           </w:p>
@@ -21174,6 +21251,7 @@
               <w:rPr>
                 <w:sz w:val="20"/>
               </w:rPr>
+              <w:lastRenderedPageBreak/>
               <w:t>VocabularyTopic</w:t>
             </w:r>
           </w:p>
@@ -21453,7 +21531,6 @@
           <w:i/>
           <w:sz w:val="22"/>
         </w:rPr>
-        <w:lastRenderedPageBreak/>
         <w:t>Bảng 6.4: Danh mục các RESTful API endpoints tiêu biểu trong hệ thống</w:t>
       </w:r>
     </w:p>
@@ -22097,7 +22174,14 @@
               <w:rPr>
                 <w:sz w:val="20"/>
               </w:rPr>
-              <w:t>Phản biện khóa học: Phê duyệt (Approve) hoặc Từ chối (Reject)</w:t>
+              <w:t xml:space="preserve">Phản biện khóa học: Phê </w:t>
+            </w:r>
+            <w:r>
+              <w:rPr>
+                <w:sz w:val="20"/>
+              </w:rPr>
+              <w:lastRenderedPageBreak/>
+              <w:t>duyệt (Approve) hoặc Từ chối (Reject)</w:t>
             </w:r>
           </w:p>
         </w:tc>
@@ -22127,6 +22211,7 @@
               <w:rPr>
                 <w:sz w:val="20"/>
               </w:rPr>
+              <w:lastRenderedPageBreak/>
               <w:t>POST</w:t>
             </w:r>
           </w:p>
@@ -22632,7 +22717,6 @@
         <w:rPr>
           <w:rFonts w:ascii="Times New Roman" w:hAnsi="Times New Roman"/>
         </w:rPr>
-        <w:lastRenderedPageBreak/>
         <w:t>7. THIẾT KẾ VÀ TÍCH HỢP 4 TÍNH NĂNG TRÍ TUỆ NHÂN TẠO (AI) &amp; TIỆN ÍCH HỌC TẬP</w:t>
       </w:r>
       <w:bookmarkEnd w:id="47"/>
@@ -22741,6 +22825,7 @@
         <w:rPr>
           <w:b/>
         </w:rPr>
+        <w:lastRenderedPageBreak/>
         <w:t xml:space="preserve">Đầu vào kiểm soát (Controlled Input): </w:t>
       </w:r>
       <w:r>
@@ -22844,7 +22929,6 @@
         <w:rPr>
           <w:b/>
         </w:rPr>
-        <w:lastRenderedPageBreak/>
         <w:t xml:space="preserve">Kiến tạo lộ trình thích ứng: </w:t>
       </w:r>
       <w:r>
@@ -22971,6 +23055,7 @@
         <w:rPr>
           <w:b/>
         </w:rPr>
+        <w:lastRenderedPageBreak/>
         <w:t>Đa dạng định dạng:</w:t>
       </w:r>
       <w:r>
@@ -23090,7 +23175,6 @@
         <w:rPr>
           <w:rFonts w:ascii="Times New Roman" w:hAnsi="Times New Roman"/>
         </w:rPr>
-        <w:lastRenderedPageBreak/>
         <w:t>8. CÁC SƠ ĐỒ THIẾT KẾ VÀ TÀI LIỆU KỸ THUẬT CẦN HOÀN THIỆN</w:t>
       </w:r>
       <w:bookmarkEnd w:id="54"/>
@@ -23798,6 +23882,7 @@
               <w:rPr>
                 <w:sz w:val="20"/>
               </w:rPr>
+              <w:lastRenderedPageBreak/>
               <w:t>6</w:t>
             </w:r>
           </w:p>
@@ -24505,7 +24590,6 @@
         <w:rPr>
           <w:rFonts w:ascii="Times New Roman" w:hAnsi="Times New Roman"/>
         </w:rPr>
-        <w:lastRenderedPageBreak/>
         <w:t>8.2. Danh mục Sequence Diagram bắt buộc ưu tiên</w:t>
       </w:r>
       <w:bookmarkEnd w:id="56"/>
@@ -24623,6 +24707,7 @@
         <w:rPr>
           <w:b/>
         </w:rPr>
+        <w:lastRenderedPageBreak/>
         <w:t xml:space="preserve">Integration &amp; API Testing (Kiểm thử tích hợp): </w:t>
       </w:r>
       <w:r>
@@ -24821,14 +24906,7 @@
               <w:rPr>
                 <w:sz w:val="20"/>
               </w:rPr>
-              <w:t xml:space="preserve">Độ chuẩn xác cấu trúc </w:t>
-            </w:r>
-            <w:r>
-              <w:rPr>
-                <w:sz w:val="20"/>
-              </w:rPr>
-              <w:lastRenderedPageBreak/>
-              <w:t>(JSON Schema)</w:t>
+              <w:t>Độ chuẩn xác cấu trúc (JSON Schema)</w:t>
             </w:r>
           </w:p>
         </w:tc>
@@ -24853,15 +24931,7 @@
               <w:rPr>
                 <w:sz w:val="20"/>
               </w:rPr>
-              <w:lastRenderedPageBreak/>
-              <w:t xml:space="preserve">Đạt 100% qua bộ kiểm </w:t>
-            </w:r>
-            <w:r>
-              <w:rPr>
-                <w:sz w:val="20"/>
-              </w:rPr>
-              <w:lastRenderedPageBreak/>
-              <w:t>duyệt</w:t>
+              <w:t>Đạt 100% qua bộ kiểm duyệt</w:t>
             </w:r>
           </w:p>
         </w:tc>
@@ -24885,15 +24955,7 @@
               <w:rPr>
                 <w:sz w:val="20"/>
               </w:rPr>
-              <w:lastRenderedPageBreak/>
-              <w:t xml:space="preserve">Toàn bộ ngõ ra của AI Quiz Generator phải tuân thủ nghiêm ngặt schema JSON; không được </w:t>
-            </w:r>
-            <w:r>
-              <w:rPr>
-                <w:sz w:val="20"/>
-              </w:rPr>
-              <w:lastRenderedPageBreak/>
-              <w:t>chứa mã Markdown bọc ngoài hay thiếu trường dữ liệu.</w:t>
+              <w:t>Toàn bộ ngõ ra của AI Quiz Generator phải tuân thủ nghiêm ngặt schema JSON; không được chứa mã Markdown bọc ngoài hay thiếu trường dữ liệu.</w:t>
             </w:r>
           </w:p>
         </w:tc>
@@ -24923,7 +24985,6 @@
               <w:rPr>
                 <w:sz w:val="20"/>
               </w:rPr>
-              <w:lastRenderedPageBreak/>
               <w:t>Tính sư phạm và chính xác tiếng Anh</w:t>
             </w:r>
           </w:p>
@@ -25226,6 +25287,7 @@
         <w:rPr>
           <w:rFonts w:ascii="Times New Roman" w:hAnsi="Times New Roman"/>
         </w:rPr>
+        <w:lastRenderedPageBreak/>
         <w:t>10. KẾ HOẠCH VÀ LỘ TRÌNH THỰC HIỆN ĐỒ ÁN</w:t>
       </w:r>
       <w:bookmarkEnd w:id="60"/>
@@ -25491,7 +25553,6 @@
               <w:rPr>
                 <w:sz w:val="20"/>
               </w:rPr>
-              <w:lastRenderedPageBreak/>
               <w:t>Giai đoạn 1: Khởi động &amp; Phân tích</w:t>
             </w:r>
           </w:p>
@@ -25850,7 +25911,14 @@
               <w:rPr>
                 <w:sz w:val="20"/>
               </w:rPr>
-              <w:t>Tích hợp Gemini AI (AI Tutor, AI Quiz Generator có JSON Schema, Adaptive Roadmap), phân hệ Import đề thi từ Word/Excel và Web Speech Text-to-Speech.</w:t>
+              <w:t xml:space="preserve">Tích hợp Gemini AI (AI Tutor, AI Quiz Generator có JSON Schema, </w:t>
+            </w:r>
+            <w:r>
+              <w:rPr>
+                <w:sz w:val="20"/>
+              </w:rPr>
+              <w:lastRenderedPageBreak/>
+              <w:t>Adaptive Roadmap), phân hệ Import đề thi từ Word/Excel và Web Speech Text-to-Speech.</w:t>
             </w:r>
           </w:p>
         </w:tc>
@@ -25874,7 +25942,15 @@
               <w:rPr>
                 <w:sz w:val="20"/>
               </w:rPr>
-              <w:t>Hệ thống hoàn chỉnh tích hợp 4 tính năng AI, hoàn thành Sprint 4-5.</w:t>
+              <w:lastRenderedPageBreak/>
+              <w:t xml:space="preserve">Hệ thống hoàn chỉnh tích hợp 4 tính năng </w:t>
+            </w:r>
+            <w:r>
+              <w:rPr>
+                <w:sz w:val="20"/>
+              </w:rPr>
+              <w:lastRenderedPageBreak/>
+              <w:t>AI, hoàn thành Sprint 4-5.</w:t>
             </w:r>
           </w:p>
         </w:tc>
@@ -25904,6 +25980,7 @@
               <w:rPr>
                 <w:sz w:val="20"/>
               </w:rPr>
+              <w:lastRenderedPageBreak/>
               <w:t>Giai đoạn 5: Kiểm thử, Tối ưu &amp; Tổng kết</w:t>
             </w:r>
           </w:p>
@@ -26073,7 +26150,6 @@
         <w:jc w:val="both"/>
       </w:pPr>
       <w:r>
-        <w:lastRenderedPageBreak/>
         <w:t>Kho mã nguồn hoàn chỉnh được quản lý bằng Git/GitHub kèm tài liệu hướng dẫn cài đặt và vận hành chi tiết.</w:t>
       </w:r>
     </w:p>
@@ -26151,6 +26227,7 @@
         <w:jc w:val="both"/>
       </w:pPr>
       <w:r>
+        <w:lastRenderedPageBreak/>
         <w:t>[7] PostgreSQL Global Development Group. PostgreSQL 15+ Reference Manual. https://www.postgresql.org/docs/</w:t>
       </w:r>
     </w:p>
@@ -26241,7 +26318,6 @@
         <w:jc w:val="both"/>
       </w:pPr>
       <w:r>
-        <w:lastRenderedPageBreak/>
         <w:t>Đồng bộ hóa toàn bộ quy trình nghiệp vụ thực tế: Chặn tạo từ vựng khi chưa có chủ đề, cơ chế phản biện 2 chiều Reviewer ↔ Teacher, phân trang 8 khóa học/trang và thông báo Toast cố định góc dưới bên phải màn hình.</w:t>
       </w:r>
     </w:p>
@@ -26264,6 +26340,56 @@
     </w:sectPr>
   </w:body>
 </w:document>
+</file>
+
+<file path=word/endnotes.xml><?xml version="1.0" encoding="utf-8"?>
+<w:endnotes xmlns:wpc="http://schemas.microsoft.com/office/word/2010/wordprocessingCanvas" xmlns:cx="http://schemas.microsoft.com/office/drawing/2014/chartex" xmlns:cx1="http://schemas.microsoft.com/office/drawing/2015/9/8/chartex" xmlns:cx2="http://schemas.microsoft.com/office/drawing/2015/10/21/chartex" xmlns:cx3="http://schemas.microsoft.com/office/drawing/2016/5/9/chartex" xmlns:cx4="http://schemas.microsoft.com/office/drawing/2016/5/10/chartex" xmlns:cx5="http://schemas.microsoft.com/office/drawing/2016/5/11/chartex" xmlns:cx6="http://schemas.microsoft.com/office/drawing/2016/5/12/chartex" xmlns:cx7="http://schemas.microsoft.com/office/drawing/2016/5/13/chartex" xmlns:cx8="http://schemas.microsoft.com/office/drawing/2016/5/14/chartex" xmlns:mc="http://schemas.openxmlformats.org/markup-compatibility/2006" xmlns:aink="http://schemas.microsoft.com/office/drawing/2016/ink" xmlns:am3d="http://schemas.microsoft.com/office/drawing/2017/model3d" xmlns:o="urn:schemas-microsoft-com:office:office" xmlns:oel="http://schemas.microsoft.com/office/2019/extlst" xmlns:r="http://schemas.openxmlformats.org/officeDocument/2006/relationships" xmlns:m="http://schemas.openxmlformats.org/officeDocument/2006/math" xmlns:v="urn:schemas-microsoft-com:vml" xmlns:wp14="http://schemas.microsoft.com/office/word/2010/wordprocessingDrawing" xmlns:wp="http://schemas.openxmlformats.org/drawingml/2006/wordprocessingDrawing" xmlns:w10="urn:schemas-microsoft-com:office:word" xmlns:w="http://schemas.openxmlformats.org/wordprocessingml/2006/main" xmlns:w14="http://schemas.microsoft.com/office/word/2010/wordml" xmlns:w15="http://schemas.microsoft.com/office/word/2012/wordml" xmlns:w16cex="http://schemas.microsoft.com/office/word/2018/wordml/cex" xmlns:w16cid="http://schemas.microsoft.com/office/word/2016/wordml/cid" xmlns:w16="http://schemas.microsoft.com/office/word/2018/wordml" xmlns:w16du="http://schemas.microsoft.com/office/word/2023/wordml/word16du" xmlns:w16sdtdh="http://schemas.microsoft.com/office/word/2020/wordml/sdtdatahash" xmlns:w16sdtfl="http://schemas.microsoft.com/office/word/2024/wordml/sdtformatlock" xmlns:w16se="http://schemas.microsoft.com/office/word/2015/wordml/symex" xmlns:wpg="http://schemas.microsoft.com/office/word/2010/wordprocessingGroup" xmlns:wpi="http://schemas.microsoft.com/office/word/2010/wordprocessingInk" xmlns:wne="http://schemas.microsoft.com/office/word/2006/wordml" xmlns:wps="http://schemas.microsoft.com/office/word/2010/wordprocessingShape" mc:Ignorable="w14 w15 w16se w16cid w16 w16cex w16sdtdh w16sdtfl w16du wp14">
+  <w:endnote w:type="separator" w:id="-1">
+    <w:p>
+      <w:pPr>
+        <w:spacing w:after="0" w:line="240" w:lineRule="auto"/>
+      </w:pPr>
+      <w:r>
+        <w:separator/>
+      </w:r>
+    </w:p>
+  </w:endnote>
+  <w:endnote w:type="continuationSeparator" w:id="0">
+    <w:p>
+      <w:pPr>
+        <w:spacing w:after="0" w:line="240" w:lineRule="auto"/>
+      </w:pPr>
+      <w:r>
+        <w:continuationSeparator/>
+      </w:r>
+    </w:p>
+  </w:endnote>
+</w:endnotes>
+</file>
+
+<file path=word/footnotes.xml><?xml version="1.0" encoding="utf-8"?>
+<w:footnotes xmlns:wpc="http://schemas.microsoft.com/office/word/2010/wordprocessingCanvas" xmlns:cx="http://schemas.microsoft.com/office/drawing/2014/chartex" xmlns:cx1="http://schemas.microsoft.com/office/drawing/2015/9/8/chartex" xmlns:cx2="http://schemas.microsoft.com/office/drawing/2015/10/21/chartex" xmlns:cx3="http://schemas.microsoft.com/office/drawing/2016/5/9/chartex" xmlns:cx4="http://schemas.microsoft.com/office/drawing/2016/5/10/chartex" xmlns:cx5="http://schemas.microsoft.com/office/drawing/2016/5/11/chartex" xmlns:cx6="http://schemas.microsoft.com/office/drawing/2016/5/12/chartex" xmlns:cx7="http://schemas.microsoft.com/office/drawing/2016/5/13/chartex" xmlns:cx8="http://schemas.microsoft.com/office/drawing/2016/5/14/chartex" xmlns:mc="http://schemas.openxmlformats.org/markup-compatibility/2006" xmlns:aink="http://schemas.microsoft.com/office/drawing/2016/ink" xmlns:am3d="http://schemas.microsoft.com/office/drawing/2017/model3d" xmlns:o="urn:schemas-microsoft-com:office:office" xmlns:oel="http://schemas.microsoft.com/office/2019/extlst" xmlns:r="http://schemas.openxmlformats.org/officeDocument/2006/relationships" xmlns:m="http://schemas.openxmlformats.org/officeDocument/2006/math" xmlns:v="urn:schemas-microsoft-com:vml" xmlns:wp14="http://schemas.microsoft.com/office/word/2010/wordprocessingDrawing" xmlns:wp="http://schemas.openxmlformats.org/drawingml/2006/wordprocessingDrawing" xmlns:w10="urn:schemas-microsoft-com:office:word" xmlns:w="http://schemas.openxmlformats.org/wordprocessingml/2006/main" xmlns:w14="http://schemas.microsoft.com/office/word/2010/wordml" xmlns:w15="http://schemas.microsoft.com/office/word/2012/wordml" xmlns:w16cex="http://schemas.microsoft.com/office/word/2018/wordml/cex" xmlns:w16cid="http://schemas.microsoft.com/office/word/2016/wordml/cid" xmlns:w16="http://schemas.microsoft.com/office/word/2018/wordml" xmlns:w16du="http://schemas.microsoft.com/office/word/2023/wordml/word16du" xmlns:w16sdtdh="http://schemas.microsoft.com/office/word/2020/wordml/sdtdatahash" xmlns:w16sdtfl="http://schemas.microsoft.com/office/word/2024/wordml/sdtformatlock" xmlns:w16se="http://schemas.microsoft.com/office/word/2015/wordml/symex" xmlns:wpg="http://schemas.microsoft.com/office/word/2010/wordprocessingGroup" xmlns:wpi="http://schemas.microsoft.com/office/word/2010/wordprocessingInk" xmlns:wne="http://schemas.microsoft.com/office/word/2006/wordml" xmlns:wps="http://schemas.microsoft.com/office/word/2010/wordprocessingShape" mc:Ignorable="w14 w15 w16se w16cid w16 w16cex w16sdtdh w16sdtfl w16du wp14">
+  <w:footnote w:type="separator" w:id="-1">
+    <w:p>
+      <w:pPr>
+        <w:spacing w:after="0" w:line="240" w:lineRule="auto"/>
+      </w:pPr>
+      <w:r>
+        <w:separator/>
+      </w:r>
+    </w:p>
+  </w:footnote>
+  <w:footnote w:type="continuationSeparator" w:id="0">
+    <w:p>
+      <w:pPr>
+        <w:spacing w:after="0" w:line="240" w:lineRule="auto"/>
+      </w:pPr>
+      <w:r>
+        <w:continuationSeparator/>
+      </w:r>
+    </w:p>
+  </w:footnote>
+</w:footnotes>
 </file>
 
 <file path=word/numbering.xml><?xml version="1.0" encoding="utf-8"?>

</xml_diff>

<commit_message>
feat(courses): tich hop dong giang day (co_teachers) va phan cong tham dinh vien (assigned_reviewer)
</commit_message>
<xml_diff>
--- a/PhanTichYeuCau_Elearning_AI_LeVanThai.docx
+++ b/PhanTichYeuCau_Elearning_AI_LeVanThai.docx
@@ -4975,13 +4975,7 @@
         <w:jc w:val="both"/>
       </w:pPr>
       <w:r>
-        <w:rPr>
-          <w:b/>
-        </w:rPr>
-        <w:t xml:space="preserve">Về quản trị đào tạo và nội dung: </w:t>
-      </w:r>
-      <w:r>
-        <w:t>Xây dựng hệ thống quản lý Course, Chapter, Lesson, Video học tập, tài liệu đính kèm (Material) và theo dõi tiến độ học tập chi tiết (Learning Progress Tracker).</w:t>
+        <w:t>Về quản trị đào tạo và nội dung: Xây dựng quy trình quản trị đào tạo chuẩn mực: Quản trị viên (Admin) quy hoạch và khởi tạo khung khóa học, phân công Giảng viên phụ trách chuyên môn và chỉ định Giảng viên phản biện; Giảng viên biên soạn cấu trúc Chương, Bài học, Video học tập, tài liệu đính kèm (Material); hệ thống tự động theo dõi tiến độ học tập chi tiết (Learning Progress Tracker).</w:t>
       </w:r>
     </w:p>
     <w:p>
@@ -5104,13 +5098,7 @@
         <w:jc w:val="both"/>
       </w:pPr>
       <w:r>
-        <w:rPr>
-          <w:b/>
-        </w:rPr>
-        <w:t xml:space="preserve">Về quy trình phản biện khóa học: </w:t>
-      </w:r>
-      <w:r>
-        <w:t>Xây dựng quy trình thẩm định giáo trình 2 chiều: Giảng viên gửi nộp -&gt; Reviewer kiểm tra, ghi chú phản biện nếu từ chối -&gt; Giảng viên cập nhật -&gt; Reviewer phê duyệt công khai.</w:t>
+        <w:t>Về quy trình quản trị và phản biện khóa học: Xây dựng quy trình quản trị đào tạo và thẩm định 3 cấp: Admin khởi tạo &amp; phân công -&gt; Giảng viên xây dựng nội dung giáo trình -&gt; Reviewer thẩm định chuyên môn 2 chiều (phê duyệt công khai hoặc yêu cầu chỉnh sửa kèm lý do).</w:t>
       </w:r>
     </w:p>
     <w:p>
@@ -5705,14 +5693,8 @@
             <w:vAlign w:val="center"/>
           </w:tcPr>
           <w:p>
-            <w:pPr>
-              <w:spacing w:before="30" w:after="30"/>
-            </w:pPr>
-            <w:r>
-              <w:rPr>
-                <w:sz w:val="20"/>
-              </w:rPr>
-              <w:t>Xây dựng khóa học, bài học, tải học liệu, biên soạn câu hỏi thủ công hoặc bằng AI Quiz Generator, import đề thi từ Word/Excel, tạo chủ đề từ vựng, theo dõi Gradebook.</w:t>
+            <w:r>
+              <w:t>Tiếp nhận các khóa học do Admin khởi tạo và phân công phụ trách; xây dựng cấu trúc bài học, tải học liệu, biên soạn câu hỏi thủ công hoặc bằng AI Quiz Generator, import đề thi từ Word/Excel, tạo chủ đề từ vựng và nộp kiểm định giáo trình; theo dõi Gradebook.</w:t>
             </w:r>
           </w:p>
         </w:tc>
@@ -5783,14 +5765,8 @@
             <w:vAlign w:val="center"/>
           </w:tcPr>
           <w:p>
-            <w:pPr>
-              <w:spacing w:before="30" w:after="30"/>
-            </w:pPr>
-            <w:r>
-              <w:rPr>
-                <w:sz w:val="20"/>
-              </w:rPr>
-              <w:t>Truy cập Reviewer Studio, kiểm định nội dung khóa học và bộ từ vựng Flashcard, đưa ra phản biện 2 chiều (phê duyệt hoặc yêu cầu chỉnh sửa kèm lý do).</w:t>
+            <w:r>
+              <w:t>Tiếp nhận các khóa học và bộ từ vựng Flashcard được Admin phân công kiểm định; truy cập Reviewer Studio, kiểm định toàn diện nội dung học liệu, thực hiện cơ chế phản biện 2 chiều (phê duyệt xuất bản hoặc yêu cầu chỉnh sửa kèm nhận xét chuyên môn chi tiết).</w:t>
             </w:r>
           </w:p>
         </w:tc>
@@ -5861,14 +5837,8 @@
             <w:vAlign w:val="center"/>
           </w:tcPr>
           <w:p>
-            <w:pPr>
-              <w:spacing w:before="30" w:after="30"/>
-            </w:pPr>
-            <w:r>
-              <w:rPr>
-                <w:sz w:val="20"/>
-              </w:rPr>
-              <w:t>Quản lý toàn bộ người dùng và phân quyền (RBAC), quản lý danh mục khóa học, giám sát trạng thái hệ thống, cấu hình tham số nền tảng và xem báo cáo thống kê tổng hợp.</w:t>
+            <w:r>
+              <w:t>Quản lý toàn bộ người dùng và phân quyền (RBAC); quản lý danh mục; quy hoạch và khởi tạo khung khóa học mới, trực tiếp phân công Giảng viên chính phụ trách biên soạn và gán Giảng viên phản biện chuyên môn; giám sát trạng thái toàn hệ thống và xem báo cáo thống kê tổng hợp.</w:t>
             </w:r>
           </w:p>
         </w:tc>
@@ -5914,7 +5884,7 @@
         <w:jc w:val="both"/>
       </w:pPr>
       <w:r>
-        <w:t>Phân hệ Quản trị Khóa học (Course Management): Khởi tạo, chỉnh sửa chương mục, bài giảng, video trực tuyến, tài liệu đính kèm, phân trang hiển thị 8 khóa học/trang cho giảng viên.</w:t>
+        <w:t>Phân hệ Quản trị Khóa học (Course Management): Admin khởi tạo khung khóa học, chọn danh mục, phân công Giảng viên phụ trách và Giảng viên phản biện. Giảng viên được phân công toàn quyền xây dựng giáo trình, chỉnh sửa chương mục, bài giảng, video trực tuyến, tài liệu đính kèm, phân trang hiển thị 8 khóa học/trang.</w:t>
       </w:r>
     </w:p>
     <w:p>
@@ -5965,7 +5935,7 @@
         <w:jc w:val="both"/>
       </w:pPr>
       <w:r>
-        <w:t>Phân hệ Thẩm định &amp; Phản biện (Course Reviewer Studio): Cơ chế phản biện 2 chiều đảm bảo kiểm soát chất lượng nội dung trước khi xuất bản công khai.</w:t>
+        <w:t>Phân hệ Thẩm định &amp; Phản biện (Course Reviewer Studio): Reviewer tiếp nhận các khóa học được Admin phân công thẩm định, kiểm tra toàn diện chất lượng và thực hiện cơ chế phản biện 2 chiều đảm bảo kiểm soát chất lượng nội dung trước khi xuất bản công khai.</w:t>
       </w:r>
     </w:p>
     <w:p>
@@ -6133,8 +6103,7 @@
         <w:jc w:val="both"/>
       </w:pPr>
       <w:r>
-        <w:lastRenderedPageBreak/>
-        <w:t>Quản lý danh mục: Thêm, sửa, xóa các danh mục khóa học (Grammar, Vocabulary, IELTS, TOEIC, Giao tiếp,...).</w:t>
+        <w:t>Quản lý danh mục &amp; Khởi tạo khóa học: Thêm, sửa, xóa các danh mục khóa học (Grammar, Vocabulary, IELTS, TOEIC, Giao tiếp,...); khởi tạo khung khóa học mới, thiết lập chuẩn đầu ra và trực tiếp phân công Giảng viên chính phụ trách biên soạn cùng Giảng viên phản biện kiểm duyệt chéo.</w:t>
       </w:r>
     </w:p>
     <w:p>
@@ -6178,7 +6147,7 @@
         <w:jc w:val="both"/>
       </w:pPr>
       <w:r>
-        <w:t>Reviewer Studio: Giao diện làm việc chuyên biệt hiển thị danh sách các khóa học và bộ Flashcard đang ở trạng thái 'Pending Review'.</w:t>
+        <w:t>Reviewer Studio: Giao diện làm việc chuyên biệt hiển thị danh sách các khóa học và bộ Flashcard được Admin phân công và đang ở trạng thái 'Pending Review' do Giảng viên gửi nộp.</w:t>
       </w:r>
     </w:p>
     <w:p>
@@ -6232,7 +6201,7 @@
         <w:jc w:val="both"/>
       </w:pPr>
       <w:r>
-        <w:t>Quản lý khóa học cá nhân: Tạo mới, chỉnh sửa, xóa khóa học do chính mình tạo ra, hiển thị phân trang chuẩn 8 khóa học/trang.</w:t>
+        <w:t>Quản lý khóa học được phân công: Tiếp nhận danh sách các khóa học do Admin giao quyền phụ trách, hiển thị phân trang chuẩn 8 khóa học/trang; chủ động quản lý và cập nhật nội dung bài giảng.</w:t>
       </w:r>
     </w:p>
     <w:p>
@@ -6242,7 +6211,7 @@
         <w:jc w:val="both"/>
       </w:pPr>
       <w:r>
-        <w:t>Soạn thảo giáo trình (Curriculum Builder): Thêm chương (Chapter), bài học (Lesson), liên kết video bài giảng và tài liệu học tập.</w:t>
+        <w:t>Soạn thảo giáo trình (Curriculum Builder): Giảng viên xây dựng cấu trúc bài giảng cho các khóa học được phân công: thêm chương (Chapter), bài học (Lesson), liên kết video bài giảng, tài liệu học tập, bài thi trắc nghiệm và Flashcard.</w:t>
       </w:r>
     </w:p>
     <w:p>
@@ -9506,14 +9475,8 @@
             <w:vAlign w:val="center"/>
           </w:tcPr>
           <w:p>
-            <w:pPr>
-              <w:spacing w:before="30" w:after="30"/>
-            </w:pPr>
-            <w:r>
-              <w:rPr>
-                <w:sz w:val="20"/>
-              </w:rPr>
-              <w:t>Tạo và quản lý khóa học với phân trang 8 khóa học/trang</w:t>
+            <w:r>
+              <w:t>Quản lý và biên soạn khóa học được phân công với phân trang 8 khóa học/trang</w:t>
             </w:r>
           </w:p>
         </w:tc>
@@ -9530,14 +9493,8 @@
             <w:vAlign w:val="center"/>
           </w:tcPr>
           <w:p>
-            <w:pPr>
-              <w:spacing w:before="30" w:after="30"/>
-            </w:pPr>
-            <w:r>
-              <w:rPr>
-                <w:sz w:val="20"/>
-              </w:rPr>
-              <w:t>Sắp xếp quản lý học liệu trực quan, gọn gàng</w:t>
+            <w:r>
+              <w:t>Tiếp nhận khóa học từ Admin và xây dựng giáo trình chuyên sâu, trực quan</w:t>
             </w:r>
           </w:p>
         </w:tc>
@@ -10883,14 +10840,8 @@
             <w:vAlign w:val="center"/>
           </w:tcPr>
           <w:p>
-            <w:pPr>
-              <w:spacing w:before="30" w:after="30"/>
-            </w:pPr>
-            <w:r>
-              <w:rPr>
-                <w:sz w:val="20"/>
-              </w:rPr>
-              <w:t>Quản lý toàn diện tài khoản, vai trò và thống kê nền tảng</w:t>
+            <w:r>
+              <w:t>Quản lý toàn diện tài khoản, danh mục, tạo khung khóa học và phân công GV + Phản biện</w:t>
             </w:r>
           </w:p>
         </w:tc>
@@ -10907,14 +10858,8 @@
             <w:vAlign w:val="center"/>
           </w:tcPr>
           <w:p>
-            <w:pPr>
-              <w:spacing w:before="30" w:after="30"/>
-            </w:pPr>
-            <w:r>
-              <w:rPr>
-                <w:sz w:val="20"/>
-              </w:rPr>
-              <w:t>Đảm bảo an ninh và giám sát vận hành hệ thống</w:t>
+            <w:r>
+              <w:t>Quy hoạch chương trình đào tạo, phân quyền rõ ràng và kiểm soát chất lượng từ gốc</w:t>
             </w:r>
           </w:p>
         </w:tc>
@@ -11278,14 +11223,8 @@
             <w:vAlign w:val="center"/>
           </w:tcPr>
           <w:p>
-            <w:pPr>
-              <w:spacing w:before="30" w:after="30"/>
-            </w:pPr>
-            <w:r>
-              <w:rPr>
-                <w:sz w:val="20"/>
-              </w:rPr>
-              <w:t>Giảng viên có trên 8 khóa học trong danh sách của mình</w:t>
+            <w:r>
+              <w:t>Giảng viên được Admin phân công trên 8 khóa học</w:t>
             </w:r>
           </w:p>
         </w:tc>
@@ -11584,14 +11523,8 @@
             <w:vAlign w:val="center"/>
           </w:tcPr>
           <w:p>
-            <w:pPr>
-              <w:spacing w:before="30" w:after="30"/>
-            </w:pPr>
-            <w:r>
-              <w:rPr>
-                <w:sz w:val="20"/>
-              </w:rPr>
-              <w:t>Khóa học ở trạng thái 'Pending Review' gửi từ Giảng viên</w:t>
+            <w:r>
+              <w:t>Khóa học ở trạng thái 'Pending Review' thuộc danh sách Reviewer được Admin phân công</w:t>
             </w:r>
           </w:p>
         </w:tc>
@@ -13190,14 +13123,8 @@
             <w:vAlign w:val="center"/>
           </w:tcPr>
           <w:p>
-            <w:pPr>
-              <w:spacing w:before="30" w:after="30"/>
-            </w:pPr>
-            <w:r>
-              <w:rPr>
-                <w:sz w:val="20"/>
-              </w:rPr>
-              <w:t>Xây dựng khóa học, chương mục, bài giảng, tài liệu đính kèm (Curriculum)</w:t>
+            <w:r>
+              <w:t>Tiếp nhận khóa học được phân công, xây dựng chương mục, bài giảng, tài liệu đính kèm (Curriculum Studio)</w:t>
             </w:r>
           </w:p>
         </w:tc>
@@ -13702,14 +13629,8 @@
             <w:vAlign w:val="center"/>
           </w:tcPr>
           <w:p>
-            <w:pPr>
-              <w:spacing w:before="30" w:after="30"/>
-            </w:pPr>
-            <w:r>
-              <w:rPr>
-                <w:sz w:val="20"/>
-              </w:rPr>
-              <w:t>Chuyên gia kiểm duyệt chất lượng giáo trình, thực hiện phản biện 2 chiều (Approve/Reject)</w:t>
+            <w:r>
+              <w:t>Thẩm định chất lượng khóa học được phân công, thực hiện phản biện 2 chiều (Approve/Reject)</w:t>
             </w:r>
           </w:p>
         </w:tc>
@@ -13909,14 +13830,8 @@
             <w:vAlign w:val="center"/>
           </w:tcPr>
           <w:p>
-            <w:pPr>
-              <w:spacing w:before="30" w:after="30"/>
-            </w:pPr>
-            <w:r>
-              <w:rPr>
-                <w:sz w:val="20"/>
-              </w:rPr>
-              <w:t>Quản trị người dùng &amp; Thống kê</w:t>
+            <w:r>
+              <w:t>Quản trị đào tạo &amp; Người dùng</w:t>
             </w:r>
           </w:p>
         </w:tc>
@@ -13958,14 +13873,8 @@
             <w:vAlign w:val="center"/>
           </w:tcPr>
           <w:p>
-            <w:pPr>
-              <w:spacing w:before="30" w:after="30"/>
-            </w:pPr>
-            <w:r>
-              <w:rPr>
-                <w:sz w:val="20"/>
-              </w:rPr>
-              <w:t>Quản lý tài khoản, gán quyền RBAC, giám sát trạng thái hệ thống và xem báo cáo</w:t>
+            <w:r>
+              <w:t>Quản lý tài khoản, gán quyền RBAC, tạo khung khóa học, phân công Giảng viên + Phản biện và xem báo cáo</w:t>
             </w:r>
           </w:p>
         </w:tc>
@@ -14799,14 +14708,8 @@
             <w:vAlign w:val="center"/>
           </w:tcPr>
           <w:p>
-            <w:pPr>
-              <w:spacing w:before="30" w:after="30"/>
-            </w:pPr>
-            <w:r>
-              <w:rPr>
-                <w:sz w:val="20"/>
-              </w:rPr>
-              <w:t>Giảng viên nhấn 'Tạo khóa học mới' hoặc chọn chỉnh sửa khóa học trong Dashboard cá nhân.</w:t>
+            <w:r>
+              <w:t>Giảng viên truy cập Dashboard cá nhân, mở một khóa học đã được Admin phân công phụ trách để biên soạn hoặc chỉnh sửa giáo trình.</w:t>
             </w:r>
           </w:p>
         </w:tc>
@@ -14857,18 +14760,8 @@
             <w:vAlign w:val="center"/>
           </w:tcPr>
           <w:p>
-            <w:pPr>
-              <w:spacing w:before="30" w:after="30"/>
-              <w:rPr>
-                <w:lang w:val="fr-FR"/>
-              </w:rPr>
-            </w:pPr>
-            <w:r>
-              <w:rPr>
-                <w:sz w:val="20"/>
-                <w:lang w:val="fr-FR"/>
-              </w:rPr>
-              <w:t>Giảng viên đã đăng nhập thành công với vai trò Teacher.</w:t>
+            <w:r>
+              <w:t>Giảng viên đã đăng nhập tài khoản Teacher và đã được Admin phân công phụ trách ít nhất 01 khóa học.</w:t>
             </w:r>
           </w:p>
         </w:tc>
@@ -14967,63 +14860,8 @@
             <w:vAlign w:val="center"/>
           </w:tcPr>
           <w:p>
-            <w:pPr>
-              <w:spacing w:before="30" w:after="30"/>
-            </w:pPr>
-            <w:r>
-              <w:rPr>
-                <w:sz w:val="20"/>
-              </w:rPr>
-              <w:t>1. Giảng viên truy cập giao diện Quản lý Khóa học (hiển thị phân trang 8 khóa học/trang).</w:t>
-            </w:r>
-            <w:r>
-              <w:rPr>
-                <w:sz w:val="20"/>
-              </w:rPr>
-              <w:br/>
-              <w:t>2. Giảng viên nhập thông tin cơ bản: Tên khóa học, danh mục, cấp độ (A1–C2), mô tả, ảnh thumbnail.</w:t>
-            </w:r>
-            <w:r>
-              <w:rPr>
-                <w:sz w:val="20"/>
-              </w:rPr>
-              <w:br/>
-              <w:t>3. Giảng viên thêm các Chương (Chapter) và các Bài học (Lesson) tương ứng.</w:t>
-            </w:r>
-            <w:r>
-              <w:rPr>
-                <w:sz w:val="20"/>
-              </w:rPr>
-              <w:br/>
-              <w:t>4. Trong từng bài học, giảng viên tải tài liệu học tập (PDF/DOCX) và liên kết video bài giảng.</w:t>
-            </w:r>
-            <w:r>
-              <w:rPr>
-                <w:sz w:val="20"/>
-              </w:rPr>
-              <w:br/>
-              <w:t>5. Giảng viên thêm bài kiểm tra trắc nghiệm (tạo thủ công, dùng AI Quiz hoặc Import file).</w:t>
-            </w:r>
-            <w:r>
-              <w:rPr>
-                <w:sz w:val="20"/>
-              </w:rPr>
-              <w:br/>
-              <w:t>6. Giảng viên xem lại toàn bộ đề cương ở chế độ xem trước (Preview).</w:t>
-            </w:r>
-            <w:r>
-              <w:rPr>
-                <w:sz w:val="20"/>
-              </w:rPr>
-              <w:br/>
-              <w:t>7. Giảng viên nhấn 'Nộp phê duyệt' (Submit for Review).</w:t>
-            </w:r>
-            <w:r>
-              <w:rPr>
-                <w:sz w:val="20"/>
-              </w:rPr>
-              <w:br/>
-              <w:t>8. Hệ thống kiểm tra điều kiện tối thiểu (phải có ít nhất 1 chương và 1 bài học), đổi trạng thái khóa học sang 'PENDING' và gửi thông báo tới Reviewer.</w:t>
+            <w:r>
+              <w:t>1. Giảng viên truy cập giao diện Quản lý Khóa học (hiển thị danh sách khóa học được phân công, phân trang 8 khóa học/trang). 2. Giảng viên chọn khóa học cần biên soạn để mở Curriculum Studio. 3. Giảng viên thêm các Chương (Chapter) và các Bài học (Lesson) tương ứng. 4. Trong từng bài học, giảng viên tải tài liệu học tập (PDF/DOCX) và liên kết video bài giảng. 5. Giảng viên thêm bài kiểm tra trắc nghiệm (tạo thủ công, dùng AI Quiz hoặc Import file). 6. Giảng viên xem lại toàn bộ đề cương ở chế độ xem trước (Preview). 7. Giảng viên nhấn 'Nộp phê duyệt' (Submit for Review). 8. Hệ thống kiểm tra điều kiện tối thiểu (phải có ít nhất 1 chương và 1 bài học), đổi trạng thái khóa học sang 'PENDING' và chuyển thông báo đến Reviewer đã được Admin chỉ định cho khóa học này.</w:t>
             </w:r>
           </w:p>
         </w:tc>
@@ -15327,14 +15165,8 @@
             <w:vAlign w:val="center"/>
           </w:tcPr>
           <w:p>
-            <w:pPr>
-              <w:spacing w:before="30" w:after="30"/>
-            </w:pPr>
-            <w:r>
-              <w:rPr>
-                <w:sz w:val="20"/>
-              </w:rPr>
-              <w:t>Reviewer mở danh sách các khóa học đang chờ duyệt trong Reviewer Studio.</w:t>
+            <w:r>
+              <w:t>Reviewer mở danh sách các khóa học được Admin phân công và đang chờ duyệt trong Reviewer Studio.</w:t>
             </w:r>
           </w:p>
         </w:tc>
@@ -15384,18 +15216,8 @@
             <w:vAlign w:val="center"/>
           </w:tcPr>
           <w:p>
-            <w:pPr>
-              <w:spacing w:before="30" w:after="30"/>
-              <w:rPr>
-                <w:lang w:val="fr-FR"/>
-              </w:rPr>
-            </w:pPr>
-            <w:r>
-              <w:rPr>
-                <w:sz w:val="20"/>
-                <w:lang w:val="fr-FR"/>
-              </w:rPr>
-              <w:t>Reviewer đã đăng nhập tài khoản có quyền Reviewer; Khóa học đang ở trạng thái 'PENDING'.</w:t>
+            <w:r>
+              <w:t>Reviewer đã đăng nhập tài khoản có quyền Reviewer; Khóa học thuộc danh sách được Admin chỉ định và đang ở trạng thái 'PENDING'.</w:t>
             </w:r>
           </w:p>
         </w:tc>
@@ -15494,55 +15316,8 @@
             <w:vAlign w:val="center"/>
           </w:tcPr>
           <w:p>
-            <w:pPr>
-              <w:spacing w:before="30" w:after="30"/>
-            </w:pPr>
-            <w:r>
-              <w:rPr>
-                <w:sz w:val="20"/>
-              </w:rPr>
-              <w:t>1. Reviewer truy cập Reviewer Studio và lọc danh sách khóa học trạng thái 'Pending Review'.</w:t>
-            </w:r>
-            <w:r>
-              <w:rPr>
-                <w:sz w:val="20"/>
-              </w:rPr>
-              <w:br/>
-              <w:t>2. Reviewer chọn khóa học cần thẩm định để mở màn hình chi tiết.</w:t>
-            </w:r>
-            <w:r>
-              <w:rPr>
-                <w:sz w:val="20"/>
-              </w:rPr>
-              <w:br/>
-              <w:t>3. Reviewer kiểm tra lần lượt: Tên, mô tả, video bài giảng, tài liệu đính kèm và ngân hàng câu hỏi.</w:t>
-            </w:r>
-            <w:r>
-              <w:rPr>
-                <w:sz w:val="20"/>
-              </w:rPr>
-              <w:br/>
-            </w:r>
-            <w:r>
-              <w:rPr>
-                <w:sz w:val="20"/>
-              </w:rPr>
-              <w:lastRenderedPageBreak/>
-              <w:t>4. Trường hợp đạt chuẩn: Reviewer nhấn 'Phê duyệt' (Approve).</w:t>
-            </w:r>
-            <w:r>
-              <w:rPr>
-                <w:sz w:val="20"/>
-              </w:rPr>
-              <w:br/>
-              <w:t>5. Hệ thống cập nhật trạng thái khóa học thành 'PUBLISHED', hiển thị công khai trên trang chủ cho học viên ghi danh.</w:t>
-            </w:r>
-            <w:r>
-              <w:rPr>
-                <w:sz w:val="20"/>
-              </w:rPr>
-              <w:br/>
-              <w:t>6. Hệ thống gửi thông báo chúc mừng tới Giảng viên tạo khóa học.</w:t>
+            <w:r>
+              <w:t>1. Reviewer truy cập Reviewer Studio và lọc danh sách các khóa học được phân công thẩm định có trạng thái 'Pending Review'. 2. Reviewer chọn khóa học cần thẩm định để mở màn hình chi tiết. 3. Reviewer kiểm tra lần lượt: Tên, mô tả, video bài giảng, tài liệu đính kèm và ngân hàng câu hỏi. 4. Trường hợp đạt chuẩn: Reviewer nhấn 'Phê duyệt' (Approve). 5. Hệ thống cập nhật trạng thái khóa học thành 'PUBLISHED', ghi nhận reviewer_id và thời gian duyệt, hiển thị công khai trên trang chủ cho học viên ghi danh. 6. Hệ thống gửi thông báo chúc mừng tới Giảng viên phụ trách khóa học.</w:t>
             </w:r>
           </w:p>
         </w:tc>
@@ -18323,14 +18098,9 @@
         <w:pStyle w:val="u3"/>
         <w:spacing w:before="120" w:after="40"/>
       </w:pPr>
-      <w:bookmarkStart w:id="38" w:name="_Toc242445199"/>
       <w:r>
-        <w:rPr>
-          <w:rFonts w:ascii="Times New Roman" w:hAnsi="Times New Roman"/>
-        </w:rPr>
-        <w:t>5.4.1. Quy trình thẩm định khóa học hai chiều (Teacher ↔ Reviewer)</w:t>
+        <w:t>5.4.1. Quy trình quản trị đào tạo và thẩm định khóa học 3 cấp (Admin → Teacher ↔ Reviewer)</w:t>
       </w:r>
-      <w:bookmarkEnd w:id="38"/>
     </w:p>
     <w:p>
       <w:pPr>
@@ -18338,7 +18108,7 @@
         <w:jc w:val="both"/>
       </w:pPr>
       <w:r>
-        <w:t>Quy trình thẩm định khóa học được thiết kế khép kín nhằm bảo đảm 100% nội dung bài giảng và đề thi đạt chất lượng sư phạm cao trước khi phát hành tới học viên:</w:t>
+        <w:t>Quy trình quản lý và thẩm định khóa học được thiết kế chuẩn mực theo mô hình Quản trị Đào tạo Học viện (Academic Governance), đảm bảo sự phối hợp chặt chẽ giữa Ban Quản trị, Giảng viên chuyên môn và Hội đồng thẩm định trước khi phát hành tới học viên:</w:t>
       </w:r>
     </w:p>
     <w:p>
@@ -18348,13 +18118,7 @@
         <w:jc w:val="both"/>
       </w:pPr>
       <w:r>
-        <w:rPr>
-          <w:b/>
-        </w:rPr>
-        <w:t>Bước 1 - Khởi tạo:</w:t>
-      </w:r>
-      <w:r>
-        <w:t>Giảng viên biên soạn đề cương, tải video bài giảng, tài liệu đính kèm và ngân hàng đề thi. Trạng thái khóa học: DRAFT (Bản nháp).</w:t>
+        <w:t>Bước 1 - Khởi tạo &amp; Phân công (Admin): Quản trị viên (Admin) tạo khung khóa học mới (Course Shell): nhập tên khóa học, danh mục, cấp độ CEFR, mô tả tổng quan, ảnh bìa; đồng thời trực tiếp chỉ định 01 Giảng viên phụ trách chuyên môn và 01 Giảng viên phản biện. Trạng thái khóa học: DRAFT (Bản nháp).</w:t>
       </w:r>
     </w:p>
     <w:p>
@@ -18364,13 +18128,7 @@
         <w:jc w:val="both"/>
       </w:pPr>
       <w:r>
-        <w:rPr>
-          <w:b/>
-        </w:rPr>
-        <w:t>Bước 2 - Nộp duyệt:</w:t>
-      </w:r>
-      <w:r>
-        <w:t>Giảng viên kiểm tra tổng thể và nhấn 'Nộp kiểm duyệt'. Trạng thái chuyển thành: PENDING (Chờ duyệt). Khóa học được khóa chỉnh sửa tạm thời.</w:t>
+        <w:t>Bước 2 - Biên soạn giáo trình (Teacher): Giảng viên được phân công tiếp nhận khóa học trong Dashboard cá nhân, tiến hành biên soạn các Chương (Chapter), Bài học (Lesson), tải video bài giảng, tài liệu đính kèm, xây dựng đề kiểm tra và Flashcard.</w:t>
       </w:r>
     </w:p>
     <w:p>
@@ -18380,13 +18138,7 @@
         <w:jc w:val="both"/>
       </w:pPr>
       <w:r>
-        <w:rPr>
-          <w:b/>
-        </w:rPr>
-        <w:t>Bước 3 - Tiếp nhận thẩm định:</w:t>
-      </w:r>
-      <w:r>
-        <w:t>Hệ thống đưa khóa học vào Reviewer Studio. Chuyên gia thẩm định mở khóa học, kiểm tra kỹ lưỡng nội dung từng bài học và đề kiểm tra.</w:t>
+        <w:t>Bước 3 - Nộp thẩm định (Teacher): Sau khi hoàn thiện nội dung giáo trình đạt chuẩn tối thiểu, Giảng viên nhấn 'Nộp kiểm duyệt'. Trạng thái chuyển thành: PENDING (Chờ duyệt). Khóa học được chuyển sang Reviewer đã được Admin chỉ định.</w:t>
       </w:r>
     </w:p>
     <w:p>
@@ -18396,13 +18148,7 @@
         <w:jc w:val="both"/>
       </w:pPr>
       <w:r>
-        <w:rPr>
-          <w:b/>
-        </w:rPr>
-        <w:t>Bước 4a - Trường hợp Phê duyệt:</w:t>
-      </w:r>
-      <w:r>
-        <w:t>Nếu đạt chuẩn: Reviewer bấm 'Phê duyệt'. Trạng thái chuyển thành PUBLISHED. Khóa học hiển thị công khai trên cổng E-learning.</w:t>
+        <w:t>Bước 4 - Tiếp nhận &amp; Thẩm định (Reviewer): Reviewer được chỉ định truy cập Reviewer Studio, mở khóa học và kiểm tra toàn diện chất lượng video, học liệu và câu hỏi thi.</w:t>
       </w:r>
     </w:p>
     <w:p>
@@ -18412,13 +18158,7 @@
         <w:jc w:val="both"/>
       </w:pPr>
       <w:r>
-        <w:rPr>
-          <w:b/>
-        </w:rPr>
-        <w:t>Bước 4b - Trường hợp Phản biện:</w:t>
-      </w:r>
-      <w:r>
-        <w:t>Nếu cần sửa đổi: Reviewer bấm 'Từ chối / Yêu cầu sửa', nhập nội dung nhận xét chi tiết. Trạng thái chuyển thành REJECTED. Hệ thống gửi thông báo phản biện về hộp thư Giảng viên.</w:t>
+        <w:t>Bước 5a - Phê duyệt xuất bản (Reviewer): Nếu nội dung đạt chuẩn sư phạm, Reviewer bấm 'Phê duyệt'. Trạng thái chuyển thành PUBLISHED. Khóa học được công khai trên cổng E-learning cho học viên đăng ký.</w:t>
       </w:r>
     </w:p>
     <w:p>
@@ -18428,13 +18168,7 @@
         <w:jc w:val="both"/>
       </w:pPr>
       <w:r>
-        <w:rPr>
-          <w:b/>
-        </w:rPr>
-        <w:t>Bước 5 - Cập nhật &amp; Nộp lại:</w:t>
-      </w:r>
-      <w:r>
-        <w:t>Giảng viên đọc phản biện của Reviewer, tiến hành chỉnh sửa các điểm thiếu sót và bấm 'Nộp duyệt lại'. Quy trình quay lại Bước 3 cho đến khi được phê duyệt hoàn toàn.</w:t>
+        <w:t>Bước 5b - Phản biện &amp; Yêu cầu chỉnh sửa (Reviewer): Nếu cần sửa đổi, Reviewer bấm 'Từ chối / Yêu cầu sửa', nhập nội dung nhận xét phản biện chi tiết. Trạng thái chuyển thành REJECTED. Hệ thống gửi thông báo phản biện về hộp thư Giảng viên phụ trách. Giảng viên cập nhật lại các điểm thiếu sót và nộp duyệt lại (Bước 3).</w:t>
       </w:r>
     </w:p>
     <w:p>
@@ -20488,14 +20222,8 @@
             <w:vAlign w:val="center"/>
           </w:tcPr>
           <w:p>
-            <w:pPr>
-              <w:spacing w:before="30" w:after="30"/>
-            </w:pPr>
-            <w:r>
-              <w:rPr>
-                <w:sz w:val="20"/>
-              </w:rPr>
-              <w:t>PK: id, FK: teacher_id, category_id</w:t>
+            <w:r>
+              <w:t>PK: id, FK: teacher_id, reviewer_id, category_id</w:t>
             </w:r>
           </w:p>
         </w:tc>
@@ -20512,14 +20240,8 @@
             <w:vAlign w:val="center"/>
           </w:tcPr>
           <w:p>
-            <w:pPr>
-              <w:spacing w:before="30" w:after="30"/>
-            </w:pPr>
-            <w:r>
-              <w:rPr>
-                <w:sz w:val="20"/>
-              </w:rPr>
-              <w:t>Thông tin khóa học: title, description, thumbnail, price, status (Draft/Pending/Published/Rejected).</w:t>
+            <w:r>
+              <w:t>Thông tin khóa học: title, description, thumbnail, price, status (Draft/Pending/Published/Rejected), teacher_id (Giảng viên phụ trách), reviewer_id (Thẩm định viên được phân công), rejection_reason, reviewed_at.</w:t>
             </w:r>
           </w:p>
         </w:tc>
@@ -21405,13 +21127,7 @@
         <w:jc w:val="both"/>
       </w:pPr>
       <w:r>
-        <w:rPr>
-          <w:b/>
-        </w:rPr>
-        <w:t xml:space="preserve">Cấu trúc phân cấp đào tạo: </w:t>
-      </w:r>
-      <w:r>
-        <w:t>Giảng viên (Teacher) sở hữu nhiều Khóa học (1 - N). Mỗi Khóa học có nhiều Chương (1 - N), mỗi Chương có nhiều Bài học (1 - N).</w:t>
+        <w:t>Cấu trúc phân cấp đào tạo: Admin khởi tạo Khóa học và phân công 01 Giảng viên chính (Teacher) biên soạn và 01 Chuyên gia thẩm định (Reviewer) kiểm duyệt. Mỗi Giảng viên phụ trách nhiều Khóa học (1 - N). Mỗi Khóa học gồm nhiều Chương (1 - N), mỗi Chương gồm nhiều Bài học (1 - N).</w:t>
       </w:r>
     </w:p>
     <w:p>
@@ -21961,14 +21677,8 @@
             <w:vAlign w:val="center"/>
           </w:tcPr>
           <w:p>
-            <w:pPr>
-              <w:spacing w:before="30" w:after="30"/>
-            </w:pPr>
-            <w:r>
-              <w:rPr>
-                <w:sz w:val="20"/>
-              </w:rPr>
-              <w:t>Lấy danh sách khóa học (phân trang 8 khóa/trang) hoặc tạo mới</w:t>
+            <w:r>
+              <w:t>GET: Lấy danh sách khóa học (phân trang 8 khóa/trang); POST (Admin): Khởi tạo khung khóa học mới và phân công GV + Phản biện</w:t>
             </w:r>
           </w:p>
         </w:tc>
@@ -22064,14 +21774,8 @@
             <w:vAlign w:val="center"/>
           </w:tcPr>
           <w:p>
-            <w:pPr>
-              <w:spacing w:before="30" w:after="30"/>
-            </w:pPr>
-            <w:r>
-              <w:rPr>
-                <w:sz w:val="20"/>
-              </w:rPr>
-              <w:t>Nộp khóa học sang Reviewer Studio chờ thẩm định</w:t>
+            <w:r>
+              <w:t>Giảng viên nộp khóa học được phân công sang Reviewer Studio chờ thẩm định</w:t>
             </w:r>
           </w:p>
         </w:tc>
@@ -22167,21 +21871,8 @@
             <w:vAlign w:val="center"/>
           </w:tcPr>
           <w:p>
-            <w:pPr>
-              <w:spacing w:before="30" w:after="30"/>
-            </w:pPr>
-            <w:r>
-              <w:rPr>
-                <w:sz w:val="20"/>
-              </w:rPr>
-              <w:t xml:space="preserve">Phản biện khóa học: Phê </w:t>
-            </w:r>
-            <w:r>
-              <w:rPr>
-                <w:sz w:val="20"/>
-              </w:rPr>
-              <w:lastRenderedPageBreak/>
-              <w:t>duyệt (Approve) hoặc Từ chối (Reject)</w:t>
+            <w:r>
+              <w:t>Reviewer phản biện khóa học được phân công: Phê duyệt (Approve) hoặc Từ chối (Reject)</w:t>
             </w:r>
           </w:p>
         </w:tc>
@@ -26130,7 +25821,7 @@
         <w:jc w:val="both"/>
       </w:pPr>
       <w:r>
-        <w:t>Quy trình kiểm định giáo trình 2 chiều giữa Giảng viên và Reviewer, đảm bảo chất lượng học liệu trước khi xuất bản.</w:t>
+        <w:t>Quy trình quản trị đào tạo và kiểm định giáo trình 3 cấp khép kín giữa Admin, Giảng viên và Reviewer, đảm bảo chất lượng học liệu trước khi xuất bản.</w:t>
       </w:r>
     </w:p>
     <w:p>
@@ -26318,7 +26009,7 @@
         <w:jc w:val="both"/>
       </w:pPr>
       <w:r>
-        <w:t>Đồng bộ hóa toàn bộ quy trình nghiệp vụ thực tế: Chặn tạo từ vựng khi chưa có chủ đề, cơ chế phản biện 2 chiều Reviewer ↔ Teacher, phân trang 8 khóa học/trang và thông báo Toast cố định góc dưới bên phải màn hình.</w:t>
+        <w:t>Đồng bộ hóa toàn bộ quy trình nghiệp vụ thực tế: Admin tạo khung khóa học &amp; phân công GV + Phản biện, Teacher biên soạn giáo trình, Reviewer thẩm định 2 chiều, chặn tạo từ vựng khi chưa có chủ đề, phân trang 8 khóa học/trang và thông báo Toast cố định góc dưới bên phải màn hình.</w:t>
       </w:r>
     </w:p>
     <w:p>

</xml_diff>

<commit_message>
feat(teacher): tich hop quan ly hoc vien so diem theo khoa hoc va tim kiem truc quan
</commit_message>
<xml_diff>
--- a/PhanTichYeuCau_Elearning_AI_LeVanThai.docx
+++ b/PhanTichYeuCau_Elearning_AI_LeVanThai.docx
@@ -4975,7 +4975,7 @@
         <w:jc w:val="both"/>
       </w:pPr>
       <w:r>
-        <w:t>Về quản trị đào tạo và nội dung: Xây dựng quy trình quản trị đào tạo chuẩn mực: Quản trị viên (Admin) quy hoạch và khởi tạo khung khóa học, phân công Giảng viên phụ trách chuyên môn và chỉ định Giảng viên phản biện; Giảng viên biên soạn cấu trúc Chương, Bài học, Video học tập, tài liệu đính kèm (Material); hệ thống tự động theo dõi tiến độ học tập chi tiết (Learning Progress Tracker).</w:t>
+        <w:t>Về quản trị đào tạo và nội dung: Xây dựng quy trình quản trị đào tạo chuẩn mực: Quản trị viên (Admin) tạo và quản lý Danh mục các khóa học (Categories); Giảng viên chủ động tự tạo khóa học (chọn danh mục phù hợp) và biên soạn cấu trúc Chương, Bài học, Video học tập, tài liệu đính kèm (Material); Admin phân công Thẩm định viên (Reviewer) xem xét, đánh giá chất lượng; hệ thống tự động theo dõi tiến độ học tập chi tiết (Learning Progress Tracker).</w:t>
       </w:r>
     </w:p>
     <w:p>
@@ -5098,7 +5098,7 @@
         <w:jc w:val="both"/>
       </w:pPr>
       <w:r>
-        <w:t>Về quy trình quản trị và phản biện khóa học: Xây dựng quy trình quản trị đào tạo và thẩm định 3 cấp: Admin khởi tạo &amp; phân công -&gt; Giảng viên xây dựng nội dung giáo trình -&gt; Reviewer thẩm định chuyên môn 2 chiều (phê duyệt công khai hoặc yêu cầu chỉnh sửa kèm lý do).</w:t>
+        <w:t>Về quy trình quản trị và phản biện khóa học: Xây dựng quy trình quản trị đào tạo và thẩm định 3 cấp: Admin tạo Danh mục &amp; cấp tài khoản -&gt; Giảng viên tự tạo khóa học &amp; biên soạn giáo trình -&gt; Admin phân công Thẩm định viên -&gt; Reviewer thẩm định chuyên môn 2 chiều (phê duyệt công khai hoặc yêu cầu chỉnh sửa kèm lý do).</w:t>
       </w:r>
     </w:p>
     <w:p>
@@ -5544,7 +5544,7 @@
               <w:rPr>
                 <w:sz w:val="20"/>
               </w:rPr>
-              <w:t>Khám phá trang chủ, tìm kiếm khóa học công khai, xem đề cương bài giảng và học thử từ vựng Flashcard mẫu, đăng ký tài khoản mới.</w:t>
+              <w:t>Khám phá trang chủ, tìm kiếm khóa học công khai, xem đề cương bài giảng và học thử từ vựng Flashcard mẫu, đăng ký tài khoản học viên mới (tài khoản Giảng viên do Admin cấp).</w:t>
             </w:r>
           </w:p>
         </w:tc>
@@ -5694,7 +5694,7 @@
           </w:tcPr>
           <w:p>
             <w:r>
-              <w:t>Tiếp nhận các khóa học do Admin khởi tạo và phân công phụ trách; xây dựng cấu trúc bài học, tải học liệu, biên soạn câu hỏi thủ công hoặc bằng AI Quiz Generator, import đề thi từ Word/Excel, tạo chủ đề từ vựng và nộp kiểm định giáo trình; theo dõi Gradebook.</w:t>
+              <w:t>Chủ động tự tạo khóa học mới (chọn Danh mục do Admin tạo sẵn); xây dựng cấu trúc bài học, tải học liệu, biên soạn câu hỏi thủ công hoặc bằng AI Quiz Generator, import đề thi từ Word/Excel, tạo chủ đề từ vựng và nộp kiểm định giáo trình; theo dõi Gradebook.</w:t>
             </w:r>
           </w:p>
         </w:tc>
@@ -5838,7 +5838,7 @@
           </w:tcPr>
           <w:p>
             <w:r>
-              <w:t>Quản lý toàn bộ người dùng và phân quyền (RBAC); quản lý danh mục; quy hoạch và khởi tạo khung khóa học mới, trực tiếp phân công Giảng viên chính phụ trách biên soạn và gán Giảng viên phản biện chuyên môn; giám sát trạng thái toàn hệ thống và xem báo cáo thống kê tổng hợp.</w:t>
+              <w:t>Quản lý toàn bộ người dùng và phân quyền (RBAC); tạo và cấp tài khoản Giảng viên/Thẩm định viên sau khi xác minh; tạo và quản lý Danh mục các khóa học; tiếp nhận khóa học do Giảng viên tạo và trực tiếp phân công Thẩm định viên chuyên môn kiểm duyệt; giám sát trạng thái toàn hệ thống và xem báo cáo thống kê tổng hợp.</w:t>
             </w:r>
           </w:p>
         </w:tc>
@@ -5874,7 +5874,7 @@
         <w:jc w:val="both"/>
       </w:pPr>
       <w:r>
-        <w:t>Phân hệ Xác thực &amp; Phân quyền (Authentication &amp; Authorization): Đăng ký, đăng nhập JWT, làm mới token, quên mật khẩu, cập nhật hồ sơ cá nhân và phân quyền RBAC.</w:t>
+        <w:t>Phân hệ Xác thực &amp; Phân quyền (Authentication &amp; Authorization): Đăng ký tài khoản (dành cho Học viên; tài khoản Giảng viên và Thẩm định viên do Admin cấp phát), đăng nhập JWT, làm mới token, quên mật khẩu, cập nhật hồ sơ cá nhân và phân quyền RBAC.</w:t>
       </w:r>
     </w:p>
     <w:p>
@@ -5884,7 +5884,7 @@
         <w:jc w:val="both"/>
       </w:pPr>
       <w:r>
-        <w:t>Phân hệ Quản trị Khóa học (Course Management): Admin khởi tạo khung khóa học, chọn danh mục, phân công Giảng viên phụ trách và Giảng viên phản biện. Giảng viên được phân công toàn quyền xây dựng giáo trình, chỉnh sửa chương mục, bài giảng, video trực tuyến, tài liệu đính kèm, phân trang hiển thị 8 khóa học/trang.</w:t>
+        <w:t>Phân hệ Quản trị Khóa học (Course Management): Admin tạo và quản lý danh mục khóa học (Categories), phân công Thẩm định viên kiểm duyệt. Giảng viên chủ động tự tạo khóa học mới, chọn danh mục phù hợp, toàn quyền xây dựng giáo trình, chỉnh sửa chương mục, bài giảng, video trực tuyến, tài liệu đính kèm, phân trang hiển thị 8 khóa học/trang.</w:t>
       </w:r>
     </w:p>
     <w:p>
@@ -6103,7 +6103,7 @@
         <w:jc w:val="both"/>
       </w:pPr>
       <w:r>
-        <w:t>Quản lý danh mục &amp; Khởi tạo khóa học: Thêm, sửa, xóa các danh mục khóa học (Grammar, Vocabulary, IELTS, TOEIC, Giao tiếp,...); khởi tạo khung khóa học mới, thiết lập chuẩn đầu ra và trực tiếp phân công Giảng viên chính phụ trách biên soạn cùng Giảng viên phản biện kiểm duyệt chéo.</w:t>
+        <w:t>Quản lý danh mục &amp; Phân công thẩm định: Thêm, sửa, xóa các danh mục khóa học (Grammar, Vocabulary, IELTS, TOEIC, Giao tiếp,...); tiếp nhận các khóa học do Giảng viên tạo, trực tiếp phân công Thẩm định viên kiểm duyệt chất lượng và phê duyệt xuất bản.</w:t>
       </w:r>
     </w:p>
     <w:p>
@@ -6201,7 +6201,7 @@
         <w:jc w:val="both"/>
       </w:pPr>
       <w:r>
-        <w:t>Quản lý khóa học được phân công: Tiếp nhận danh sách các khóa học do Admin giao quyền phụ trách, hiển thị phân trang chuẩn 8 khóa học/trang; chủ động quản lý và cập nhật nội dung bài giảng.</w:t>
+        <w:t>Tự tạo và quản lý khóa học: Chủ động khởi tạo các khóa học mới (chọn Danh mục do Admin tạo sẵn), hiển thị phân trang chuẩn 8 khóa học/trang; chủ động quản lý và biên soạn nội dung bài giảng.</w:t>
       </w:r>
     </w:p>
     <w:p>
@@ -6211,7 +6211,7 @@
         <w:jc w:val="both"/>
       </w:pPr>
       <w:r>
-        <w:t>Soạn thảo giáo trình (Curriculum Builder): Giảng viên xây dựng cấu trúc bài giảng cho các khóa học được phân công: thêm chương (Chapter), bài học (Lesson), liên kết video bài giảng, tài liệu học tập, bài thi trắc nghiệm và Flashcard.</w:t>
+        <w:t>Soạn thảo giáo trình (Curriculum Builder): Giảng viên xây dựng cấu trúc bài giảng cho các khóa học của mình: thêm chương (Chapter), bài học (Lesson), liên kết video bài giảng, tài liệu học tập, bài thi trắc nghiệm và Flashcard.</w:t>
       </w:r>
     </w:p>
     <w:p>
@@ -6410,7 +6410,7 @@
         <w:jc w:val="both"/>
       </w:pPr>
       <w:r>
-        <w:t>Đăng ký tài khoản học viên để tham gia chính thức vào nền tảng.</w:t>
+        <w:t>Đăng ký tài khoản học viên để tham gia chính thức vào nền tảng (tài khoản Giảng viên và Thẩm định viên do Quản trị viên trực tiếp khởi tạo và cấp phát sau khi xác minh danh tính/chứng chỉ).</w:t>
       </w:r>
     </w:p>
     <w:p>
@@ -7324,7 +7324,7 @@
               <w:rPr>
                 <w:sz w:val="20"/>
               </w:rPr>
-              <w:t>Đăng ký tài khoản người dùng mới với email và mật khẩu</w:t>
+              <w:t>Đăng ký tài khoản học viên mới với email và mật khẩu (tài khoản Giảng viên do Admin cấp)</w:t>
             </w:r>
           </w:p>
         </w:tc>
@@ -7348,7 +7348,7 @@
               <w:rPr>
                 <w:sz w:val="20"/>
               </w:rPr>
-              <w:t>Tạo tài khoản cá nhân để tham gia nền tảng</w:t>
+              <w:t>Tạo tài khoản học viên cá nhân để tham gia nền tảng</w:t>
             </w:r>
           </w:p>
         </w:tc>
@@ -9476,7 +9476,7 @@
           </w:tcPr>
           <w:p>
             <w:r>
-              <w:t>Quản lý và biên soạn khóa học được phân công với phân trang 8 khóa học/trang</w:t>
+              <w:t>Tự tạo khóa học mới theo danh mục và biên soạn giáo trình với phân trang 8 khóa học/trang</w:t>
             </w:r>
           </w:p>
         </w:tc>
@@ -9494,7 +9494,7 @@
           </w:tcPr>
           <w:p>
             <w:r>
-              <w:t>Tiếp nhận khóa học từ Admin và xây dựng giáo trình chuyên sâu, trực quan</w:t>
+              <w:t>Giảng viên chủ động tạo khóa học và xây dựng giáo trình chuyên sâu, trực quan</w:t>
             </w:r>
           </w:p>
         </w:tc>
@@ -10841,7 +10841,7 @@
           </w:tcPr>
           <w:p>
             <w:r>
-              <w:t>Quản lý toàn diện tài khoản, danh mục, tạo khung khóa học và phân công GV + Phản biện</w:t>
+              <w:t>Quản lý toàn diện tài khoản, danh mục, phân công Thẩm định viên và phê duyệt khóa học</w:t>
             </w:r>
           </w:p>
         </w:tc>
@@ -10859,7 +10859,7 @@
           </w:tcPr>
           <w:p>
             <w:r>
-              <w:t>Quy hoạch chương trình đào tạo, phân quyền rõ ràng và kiểm soát chất lượng từ gốc</w:t>
+              <w:t>Quy hoạch danh mục đào tạo, phân quyền tài khoản rõ ràng và phân công thẩm định kiểm soát chất lượng</w:t>
             </w:r>
           </w:p>
         </w:tc>
@@ -11224,7 +11224,7 @@
           </w:tcPr>
           <w:p>
             <w:r>
-              <w:t>Giảng viên được Admin phân công trên 8 khóa học</w:t>
+              <w:t>Giảng viên truy cập Studio Giảng dạy</w:t>
             </w:r>
           </w:p>
         </w:tc>
@@ -11248,7 +11248,7 @@
               <w:rPr>
                 <w:sz w:val="20"/>
               </w:rPr>
-              <w:t>Giảng viên truy cập trang quản lý Course Management</w:t>
+              <w:t>Giảng viên bấm 'Tạo khóa học mới', chọn danh mục do Admin tạo và điền thông tin</w:t>
             </w:r>
           </w:p>
         </w:tc>
@@ -11272,7 +11272,7 @@
               <w:rPr>
                 <w:sz w:val="20"/>
               </w:rPr>
-              <w:t>Hệ thống hiển thị đúng tối đa 8 khóa học trên một trang kèm thanh điều hướng phân trang mượt mà.</w:t>
+              <w:t>Hệ thống tạo khóa học mới ở trạng thái DRAFT/PENDING, hiển thị trong danh sách phân trang 8 khóa/trang để giảng viên biên soạn.</w:t>
             </w:r>
           </w:p>
         </w:tc>
@@ -11924,7 +11924,7 @@
               <w:rPr>
                 <w:sz w:val="20"/>
               </w:rPr>
-              <w:t>Đăng ký &amp; Đăng nhập</w:t>
+              <w:t>Đăng ký (Học viên) &amp; Đăng nhập</w:t>
             </w:r>
           </w:p>
         </w:tc>
@@ -11973,7 +11973,7 @@
               <w:rPr>
                 <w:sz w:val="20"/>
               </w:rPr>
-              <w:t>Xác thực danh tính người dùng bằng email/mật khẩu và cấp quyền JWT token</w:t>
+              <w:t>Xác thực danh tính học viên qua đăng ký và đăng nhập JWT cho mọi người dùng đã kích hoạt</w:t>
             </w:r>
           </w:p>
         </w:tc>
@@ -13081,7 +13081,7 @@
               <w:rPr>
                 <w:sz w:val="20"/>
               </w:rPr>
-              <w:t>Soạn thảo giáo trình khóa học</w:t>
+              <w:t>Tạo &amp; Biên soạn giáo trình khóa học</w:t>
             </w:r>
           </w:p>
         </w:tc>
@@ -13124,7 +13124,7 @@
           </w:tcPr>
           <w:p>
             <w:r>
-              <w:t>Tiếp nhận khóa học được phân công, xây dựng chương mục, bài giảng, tài liệu đính kèm (Curriculum Studio)</w:t>
+              <w:t>Giảng viên tự tạo khóa học, xây dựng chương mục, bài giảng, tài liệu đính kèm và nộp duyệt (Curriculum Studio)</w:t>
             </w:r>
           </w:p>
         </w:tc>
@@ -13831,7 +13831,7 @@
           </w:tcPr>
           <w:p>
             <w:r>
-              <w:t>Quản trị đào tạo &amp; Người dùng</w:t>
+              <w:t>Quản trị danh mục, tài khoản &amp; Phân công</w:t>
             </w:r>
           </w:p>
         </w:tc>
@@ -13874,7 +13874,7 @@
           </w:tcPr>
           <w:p>
             <w:r>
-              <w:t>Quản lý tài khoản, gán quyền RBAC, tạo khung khóa học, phân công Giảng viên + Phản biện và xem báo cáo</w:t>
+              <w:t>Tạo danh mục khóa học, cấp tài khoản Giảng viên/PB, phân công Thẩm định viên kiểm duyệt và xem báo cáo</w:t>
             </w:r>
           </w:p>
         </w:tc>
@@ -14075,7 +14075,7 @@
               <w:rPr>
                 <w:sz w:val="20"/>
               </w:rPr>
-              <w:t>Đăng ký &amp; Đăng nhập phân quyền hệ thống</w:t>
+              <w:t>Đăng ký (Học viên) &amp; Đăng nhập phân quyền hệ thống</w:t>
             </w:r>
           </w:p>
         </w:tc>
@@ -14348,56 +14348,42 @@
               <w:rPr>
                 <w:sz w:val="20"/>
               </w:rPr>
-              <w:t>1. Người dùng chọn chức năng 'Đăng nhập' trên thanh điều hướng.</w:t>
-            </w:r>
-            <w:r>
-              <w:rPr>
-                <w:sz w:val="20"/>
-              </w:rPr>
-              <w:br/>
-              <w:t>2. Hệ thống hiển thị biểu mẫu yêu cầu nhập Email và Mật khẩu.</w:t>
-            </w:r>
-            <w:r>
-              <w:rPr>
-                <w:sz w:val="20"/>
-              </w:rPr>
-              <w:br/>
-              <w:t>3. Người dùng nhập thông tin và nhấn nút 'Đăng nhập'.</w:t>
-            </w:r>
-            <w:r>
-              <w:rPr>
-                <w:sz w:val="20"/>
-              </w:rPr>
-              <w:br/>
-              <w:t>4. Hệ thống kiểm tra định dạng dữ liệu phía Client và gửi POST request tới `/api/v1/auth/login`.</w:t>
-            </w:r>
-            <w:r>
-              <w:rPr>
-                <w:sz w:val="20"/>
-              </w:rPr>
-              <w:br/>
-              <w:t>5. Backend xác thực mật khẩu qua thuật toán băm Bcrypt.</w:t>
-            </w:r>
-            <w:r>
-              <w:rPr>
-                <w:sz w:val="20"/>
-              </w:rPr>
-              <w:br/>
-              <w:t>6. Backend tạo cặp JWT Access Token (hạn 60 phút) và Refresh Token (hạn 7 ngày).</w:t>
-            </w:r>
-            <w:r>
-              <w:rPr>
-                <w:sz w:val="20"/>
-              </w:rPr>
-              <w:br/>
-              <w:t>7. Hệ thống trả về token kèm thông tin hồ sơ và vai trò (Role: student, teacher, reviewer, admin).</w:t>
-            </w:r>
-            <w:r>
-              <w:rPr>
-                <w:sz w:val="20"/>
-              </w:rPr>
-              <w:br/>
-              <w:t>8. Frontend lưu token, cập nhật trạng thái AuthContext và điều hướng tới Dashboard tương ứng.</w:t>
+              <w:t>1. Người dùng chọn chức năng 'Đăng nhập' hoặc 'Đăng ký' trên thanh điều hướng. 2. Khách vãng lai đăng ký tài khoản mới mặc định nhận vai trò Học viên (STUDENT); tài khoản Giảng viên và Thẩm định viên do Quản trị viên (Admin) trực tiếp khởi tạo và cấp phát sau khi xác minh năng lực. 3. Người dùng nhập thông tin và nhấn nút 'Đăng nhập' (hoặc 'Đăng ký'). 4. Hệ thống kiểm tra định dạng dữ liệu phía Client và gửi POST request tới `/api/v1/auth/login` (hoặc `/api/v1/auth/register/`). 5. Backend xác thực mật khẩu qua thuật toán băm Bcrypt / PBKDF2. 6. Backend tạo cặp JWT Access Token (hạn 60 phút) và Refresh Token (hạn 7 ngày). 7. Hệ thống trả về token kèm thông tin hồ sơ và vai trò (Role: student, teacher, reviewer, admin). 8. Frontend lưu token, cập nhật trạng thái AuthContext và điều hướng tới Dashboard tương ứng.</w:t>
+            </w:r>
+            <w:r>
+              <w:rPr>
+                <w:sz w:val="20"/>
+              </w:rPr>
+            </w:r>
+            <w:r>
+              <w:rPr>
+                <w:sz w:val="20"/>
+              </w:rPr>
+            </w:r>
+            <w:r>
+              <w:rPr>
+                <w:sz w:val="20"/>
+              </w:rPr>
+            </w:r>
+            <w:r>
+              <w:rPr>
+                <w:sz w:val="20"/>
+              </w:rPr>
+            </w:r>
+            <w:r>
+              <w:rPr>
+                <w:sz w:val="20"/>
+              </w:rPr>
+            </w:r>
+            <w:r>
+              <w:rPr>
+                <w:sz w:val="20"/>
+              </w:rPr>
+            </w:r>
+            <w:r>
+              <w:rPr>
+                <w:sz w:val="20"/>
+              </w:rPr>
             </w:r>
           </w:p>
         </w:tc>
@@ -14609,7 +14595,7 @@
               <w:rPr>
                 <w:sz w:val="20"/>
               </w:rPr>
-              <w:t>Soạn thảo giáo trình và nộp duyệt khóa học (Curriculum Studio)</w:t>
+              <w:t>Tạo khóa học, soạn thảo giáo trình và nộp duyệt (Curriculum Studio)</w:t>
             </w:r>
           </w:p>
         </w:tc>
@@ -14709,7 +14695,7 @@
           </w:tcPr>
           <w:p>
             <w:r>
-              <w:t>Giảng viên truy cập Dashboard cá nhân, mở một khóa học đã được Admin phân công phụ trách để biên soạn hoặc chỉnh sửa giáo trình.</w:t>
+              <w:t>Giảng viên truy cập Studio Giảng dạy, tự tạo khóa học mới hoặc mở khóa học đã tạo để biên soạn giáo trình.</w:t>
             </w:r>
           </w:p>
         </w:tc>
@@ -14761,7 +14747,7 @@
           </w:tcPr>
           <w:p>
             <w:r>
-              <w:t>Giảng viên đã đăng nhập tài khoản Teacher và đã được Admin phân công phụ trách ít nhất 01 khóa học.</w:t>
+              <w:t>Giảng viên đã đăng nhập tài khoản Teacher được Admin cấp phát.</w:t>
             </w:r>
           </w:p>
         </w:tc>
@@ -14861,7 +14847,7 @@
           </w:tcPr>
           <w:p>
             <w:r>
-              <w:t>1. Giảng viên truy cập giao diện Quản lý Khóa học (hiển thị danh sách khóa học được phân công, phân trang 8 khóa học/trang). 2. Giảng viên chọn khóa học cần biên soạn để mở Curriculum Studio. 3. Giảng viên thêm các Chương (Chapter) và các Bài học (Lesson) tương ứng. 4. Trong từng bài học, giảng viên tải tài liệu học tập (PDF/DOCX) và liên kết video bài giảng. 5. Giảng viên thêm bài kiểm tra trắc nghiệm (tạo thủ công, dùng AI Quiz hoặc Import file). 6. Giảng viên xem lại toàn bộ đề cương ở chế độ xem trước (Preview). 7. Giảng viên nhấn 'Nộp phê duyệt' (Submit for Review). 8. Hệ thống kiểm tra điều kiện tối thiểu (phải có ít nhất 1 chương và 1 bài học), đổi trạng thái khóa học sang 'PENDING' và chuyển thông báo đến Reviewer đã được Admin chỉ định cho khóa học này.</w:t>
+              <w:t>1. Giảng viên vào Studio Giảng dạy, bấm 'Tạo khóa học mới', chọn Danh mục (do Admin tạo) và nhập thông tin cơ bản. 2. Giảng viên mở khóa học vừa tạo để vào Curriculum Studio (hiển thị danh sách phân trang 8 khóa học/trang). 3. Giảng viên thêm các Chương (Chapter) và các Bài học (Lesson) tương ứng. 4. Trong từng bài học, giảng viên tải tài liệu học tập (PDF/DOCX) và liên kết video bài giảng. 5. Giảng viên thêm bài kiểm tra trắc nghiệm (tạo thủ công, dùng AI Quiz hoặc Import file). 6. Giảng viên xem lại toàn bộ đề cương ở chế độ xem trước (Preview). 7. Giảng viên nhấn 'Nộp phê duyệt' (Submit for Review). 8. Hệ thống kiểm tra điều kiện tối thiểu (phải có ít nhất 1 chương và 1 bài học), đổi trạng thái khóa học sang 'PENDING' để Admin tiếp nhận và phân công Thẩm định viên xem xét.</w:t>
             </w:r>
           </w:p>
         </w:tc>
@@ -15166,7 +15152,7 @@
           </w:tcPr>
           <w:p>
             <w:r>
-              <w:t>Reviewer mở danh sách các khóa học được Admin phân công và đang chờ duyệt trong Reviewer Studio.</w:t>
+              <w:t>Reviewer mở danh sách các khóa học được Admin phân công thẩm định và đang chờ duyệt trong Reviewer Studio.</w:t>
             </w:r>
           </w:p>
         </w:tc>
@@ -15217,7 +15203,7 @@
           </w:tcPr>
           <w:p>
             <w:r>
-              <w:t>Reviewer đã đăng nhập tài khoản có quyền Reviewer; Khóa học thuộc danh sách được Admin chỉ định và đang ở trạng thái 'PENDING'.</w:t>
+              <w:t>Reviewer đã đăng nhập tài khoản có quyền Reviewer; Khóa học thuộc danh sách được Admin phân công và đang ở trạng thái 'PENDING'.</w:t>
             </w:r>
           </w:p>
         </w:tc>
@@ -18118,7 +18104,7 @@
         <w:jc w:val="both"/>
       </w:pPr>
       <w:r>
-        <w:t>Bước 1 - Khởi tạo &amp; Phân công (Admin): Quản trị viên (Admin) tạo khung khóa học mới (Course Shell): nhập tên khóa học, danh mục, cấp độ CEFR, mô tả tổng quan, ảnh bìa; đồng thời trực tiếp chỉ định 01 Giảng viên phụ trách chuyên môn và 01 Giảng viên phản biện. Trạng thái khóa học: DRAFT (Bản nháp).</w:t>
+        <w:t>Bước 1 - Tạo Danh mục &amp; Cấp tài khoản (Admin): Quản trị viên (Admin) tạo các Danh mục khóa học (Categories) trên hệ thống; đồng thời tiếp nhận hồ sơ, xác minh chứng chỉ và trực tiếp khởi tạo tài khoản Giảng viên (Teacher) hoặc Thẩm định viên (Reviewer).</w:t>
       </w:r>
     </w:p>
     <w:p>
@@ -18128,7 +18114,7 @@
         <w:jc w:val="both"/>
       </w:pPr>
       <w:r>
-        <w:t>Bước 2 - Biên soạn giáo trình (Teacher): Giảng viên được phân công tiếp nhận khóa học trong Dashboard cá nhân, tiến hành biên soạn các Chương (Chapter), Bài học (Lesson), tải video bài giảng, tài liệu đính kèm, xây dựng đề kiểm tra và Flashcard.</w:t>
+        <w:t>Bước 2 - Khởi tạo khóa học &amp; Biên soạn giáo trình (Teacher): Giảng viên chủ động tự tạo khóa học mới (chọn Danh mục do Admin tạo, nhập tên, cấp độ CEFR, học phí, ảnh bìa) và biên soạn các Chương (Chapter), Bài học (Lesson), tải video bài giảng, tài liệu đính kèm, xây dựng đề kiểm tra và Flashcard. Trạng thái khóa học: DRAFT (Bản nháp).</w:t>
       </w:r>
     </w:p>
     <w:p>
@@ -18138,7 +18124,7 @@
         <w:jc w:val="both"/>
       </w:pPr>
       <w:r>
-        <w:t>Bước 3 - Nộp thẩm định (Teacher): Sau khi hoàn thiện nội dung giáo trình đạt chuẩn tối thiểu, Giảng viên nhấn 'Nộp kiểm duyệt'. Trạng thái chuyển thành: PENDING (Chờ duyệt). Khóa học được chuyển sang Reviewer đã được Admin chỉ định.</w:t>
+        <w:t>Bước 3 - Nộp thẩm định (Teacher): Sau khi hoàn thiện nội dung giáo trình đạt chuẩn tối thiểu, Giảng viên nhấn 'Nộp kiểm duyệt'. Trạng thái chuyển thành: PENDING (Chờ duyệt).</w:t>
       </w:r>
     </w:p>
     <w:p>
@@ -18148,7 +18134,7 @@
         <w:jc w:val="both"/>
       </w:pPr>
       <w:r>
-        <w:t>Bước 4 - Tiếp nhận &amp; Thẩm định (Reviewer): Reviewer được chỉ định truy cập Reviewer Studio, mở khóa học và kiểm tra toàn diện chất lượng video, học liệu và câu hỏi thi.</w:t>
+        <w:t>Bước 4 - Phân công &amp; Tiếp nhận thẩm định (Admin -&gt; Reviewer): Admin tiếp nhận khóa học chờ duyệt trên bảng quản trị và phân công 01 Thẩm định viên (Reviewer) phụ trách. Reviewer được chỉ định truy cập Reviewer Studio, mở khóa học và kiểm tra toàn diện chất lượng video, học liệu và câu hỏi thi.</w:t>
       </w:r>
     </w:p>
     <w:p>
@@ -21127,7 +21113,7 @@
         <w:jc w:val="both"/>
       </w:pPr>
       <w:r>
-        <w:t>Cấu trúc phân cấp đào tạo: Admin khởi tạo Khóa học và phân công 01 Giảng viên chính (Teacher) biên soạn và 01 Chuyên gia thẩm định (Reviewer) kiểm duyệt. Mỗi Giảng viên phụ trách nhiều Khóa học (1 - N). Mỗi Khóa học gồm nhiều Chương (1 - N), mỗi Chương gồm nhiều Bài học (1 - N).</w:t>
+        <w:t>Cấu trúc phân cấp đào tạo: Admin tạo Danh mục khóa học (Category). Giảng viên (Teacher) tự khởi tạo Khóa học thuộc danh mục và biên soạn giáo trình (1 - N). Admin phân công Chuyên gia thẩm định (Reviewer) kiểm duyệt khóa học trước khi xuất bản. Mỗi Khóa học gồm nhiều Chương (1 - N), mỗi Chương gồm nhiều Bài học (1 - N).</w:t>
       </w:r>
     </w:p>
     <w:p>
@@ -21678,7 +21664,7 @@
           </w:tcPr>
           <w:p>
             <w:r>
-              <w:t>GET: Lấy danh sách khóa học (phân trang 8 khóa/trang); POST (Admin): Khởi tạo khung khóa học mới và phân công GV + Phản biện</w:t>
+              <w:t>GET: Lấy danh sách khóa học (phân trang 8 khóa/trang); POST (Teacher): Giảng viên khởi tạo khóa học mới; Admin quản lý và gán Thẩm định viên</w:t>
             </w:r>
           </w:p>
         </w:tc>
@@ -26009,7 +25995,7 @@
         <w:jc w:val="both"/>
       </w:pPr>
       <w:r>
-        <w:t>Đồng bộ hóa toàn bộ quy trình nghiệp vụ thực tế: Admin tạo khung khóa học &amp; phân công GV + Phản biện, Teacher biên soạn giáo trình, Reviewer thẩm định 2 chiều, chặn tạo từ vựng khi chưa có chủ đề, phân trang 8 khóa học/trang và thông báo Toast cố định góc dưới bên phải màn hình.</w:t>
+        <w:t>Đồng bộ hóa toàn bộ quy trình nghiệp vụ thực tế: Admin tạo danh mục khóa học &amp; cấp tài khoản, Teacher tự tạo khóa học &amp; biên soạn giáo trình, Admin phân công Thẩm định viên, Reviewer thẩm định 2 chiều, chặn tạo từ vựng khi chưa có chủ đề, phân trang 8 khóa học/trang và thông báo Toast cố định góc dưới bên phải màn hình.</w:t>
       </w:r>
     </w:p>
     <w:p>

</xml_diff>

<commit_message>
feat(courses): integrate step-by-step multi-stage AI roadmap wizard and hide ai roadmap from header
</commit_message>
<xml_diff>
--- a/PhanTichYeuCau_Elearning_AI_LeVanThai.docx
+++ b/PhanTichYeuCau_Elearning_AI_LeVanThai.docx
@@ -4975,7 +4975,7 @@
         <w:jc w:val="both"/>
       </w:pPr>
       <w:r>
-        <w:t>Về quản trị đào tạo và nội dung: Xây dựng quy trình quản trị đào tạo chuẩn mực: Quản trị viên (Admin) tạo và quản lý Danh mục các khóa học (Categories); Giảng viên chủ động tự tạo khóa học (chọn danh mục phù hợp) và biên soạn cấu trúc Chương, Bài học, Video học tập, tài liệu đính kèm (Material); Admin phân công Thẩm định viên (Reviewer) xem xét, đánh giá chất lượng; hệ thống tự động theo dõi tiến độ học tập chi tiết (Learning Progress Tracker).</w:t>
+        <w:t>Về quản trị đào tạo và nội dung: Xây dựng quy trình quản trị đào tạo chuẩn mực: Quản trị viên (Admin) tạo và quản lý Danh mục các khóa học (Categories); Giảng viên chủ động tự tạo khóa học (có cơ chế kiểm soát giới hạn tối đa 5 khóa học nháp/chờ duyệt và giãn cách 5 phút để chống spam) và biên soạn cấu trúc Chương, Bài học, Video học tập, tài liệu đính kèm (Material); Admin phân công riêng Thẩm định viên chính hoặc Hội đồng nhiều thẩm định viên (Reviewer) xem xét, đánh giá chất lượng; hệ thống tự động theo dõi tiến độ học tập và điểm kinh nghiệm (XP) tính toán thực tế từ cơ sở dữ liệu.</w:t>
       </w:r>
     </w:p>
     <w:p>
@@ -5068,6 +5068,7 @@
         <w:rPr>
           <w:b/>
         </w:rPr>
+        <w:lastRenderedPageBreak/>
         <w:t xml:space="preserve">Về phân hệ Import học liệu: </w:t>
       </w:r>
       <w:r>
@@ -5084,7 +5085,6 @@
         <w:rPr>
           <w:b/>
         </w:rPr>
-        <w:lastRenderedPageBreak/>
         <w:t xml:space="preserve">Về học từ vựng Flashcard: </w:t>
       </w:r>
       <w:r>
@@ -5098,7 +5098,14 @@
         <w:jc w:val="both"/>
       </w:pPr>
       <w:r>
-        <w:t>Về quy trình quản trị và phản biện khóa học: Xây dựng quy trình quản trị đào tạo và thẩm định 3 cấp: Admin tạo Danh mục &amp; cấp tài khoản -&gt; Giảng viên tự tạo khóa học &amp; biên soạn giáo trình -&gt; Admin phân công Thẩm định viên -&gt; Reviewer thẩm định chuyên môn 2 chiều (phê duyệt công khai hoặc yêu cầu chỉnh sửa kèm lý do).</w:t>
+        <w:rPr>
+          <w:b/>
+          <w:bCs/>
+        </w:rPr>
+        <w:t>Về quy trình quản trị và phản biện khóa học</w:t>
+      </w:r>
+      <w:r>
+        <w:t>: Xây dựng quy trình quản trị đào tạo và thẩm định 3 cấp: Admin tạo Danh mục &amp; cấp tài khoản -&gt; Giảng viên tự tạo khóa học &amp; biên soạn giáo trình (có giới hạn số lượng và chống spam) -&gt; Admin phân công riêng từng Thẩm định viên chính hoặc Hội đồng thẩm định phản biện chéo qua giao diện tinh gọn -&gt; Reviewer được phân công thẩm định chuyên môn 2 chiều (phê duyệt công khai hoặc yêu cầu chỉnh sửa kèm lý do).</w:t>
       </w:r>
     </w:p>
     <w:p>
@@ -5106,15 +5113,21 @@
         <w:pStyle w:val="Duudong"/>
         <w:spacing w:before="30" w:after="50" w:line="288" w:lineRule="auto"/>
         <w:jc w:val="both"/>
+        <w:rPr>
+          <w:bCs/>
+        </w:rPr>
       </w:pPr>
       <w:r>
         <w:rPr>
           <w:b/>
         </w:rPr>
-        <w:t xml:space="preserve">Về chứng nhận hoàn thành: </w:t>
+        <w:t xml:space="preserve">Về chứng nhận hoàn thành và tra cứu: </w:t>
       </w:r>
       <w:r>
-        <w:t>Tự động cấp chứng chỉ điện tử (Certificate of Completion) khi học viên hoàn thành 100% nội dung và vượt qua bài thi chuẩn đầu ra của khóa học.</w:t>
+        <w:rPr>
+          <w:bCs/>
+        </w:rPr>
+        <w:t>Tự động cấp chứng chỉ điện tử (Certificate of Completion) khi học viên hoàn thành 100% nội dung và vượt qua bài thi chuẩn đầu ra của khóa học; đồng thời cung cấp cổng tra cứu chứng chỉ công khai theo mã định danh và hỗ trợ in/xuất PDF khổ ngang (A4 Landscape) chuẩn hóa, tự động ẩn giao diện web khi in.</w:t>
       </w:r>
     </w:p>
     <w:p>
@@ -5153,7 +5166,7 @@
         <w:t xml:space="preserve">Frontend Client: </w:t>
       </w:r>
       <w:r>
-        <w:t>Sử dụng ReactJS (JavaScript JSX) phiên bản 18+ kết hợp Vite bundler tốc độ cao, thư viện giao diện TailwindCSS / CSS Modules, hệ thống icon hiện đại Lucide-React, đảm bảo giao diện đáp ứng (Responsive) mượt mà.</w:t>
+        <w:t>Sử dụng ReactJS (JavaScript JSX) kết hợp Vite bundler tốc độ cao, thư viện giao diện TailwindCSS / CSS Modules, hệ thống icon hiện đại Lucide-React, đảm bảo giao diện đáp ứng (Responsive) mượt mà.</w:t>
       </w:r>
     </w:p>
     <w:p>
@@ -5169,7 +5182,7 @@
         <w:t xml:space="preserve">Backend API Service: </w:t>
       </w:r>
       <w:r>
-        <w:t>Sử dụng Python 3.11+ và Django REST Framework (DRF) theo mô hình Modular Monolith, chia tách thành các Django App độc lập có trách nhiệm nghiệp vụ rõ ràng, dễ bảo trì.</w:t>
+        <w:t>Sử dụng Python 3.11 và Django REST Framework (DRF) theo mô hình Modular Monolith, chia tách thành các Django App độc lập có trách nhiệm nghiệp vụ rõ ràng, dễ bảo trì.</w:t>
       </w:r>
     </w:p>
     <w:p>
@@ -5230,6 +5243,7 @@
         <w:rPr>
           <w:rFonts w:ascii="Times New Roman" w:hAnsi="Times New Roman"/>
         </w:rPr>
+        <w:lastRenderedPageBreak/>
         <w:t>3. ĐỐI TƯỢNG VÀ PHẠM VI NGHIÊN CỨU</w:t>
       </w:r>
       <w:bookmarkEnd w:id="9"/>
@@ -5304,7 +5318,6 @@
         <w:jc w:val="both"/>
       </w:pPr>
       <w:r>
-        <w:lastRenderedPageBreak/>
         <w:t>Phương pháp phân tích dữ liệu học tập (Learning Analytics) dựa trên điểm số kiểm tra, tỷ lệ hoàn thành và lịch sử tương tác.</w:t>
       </w:r>
     </w:p>
@@ -5693,7 +5706,17 @@
             <w:vAlign w:val="center"/>
           </w:tcPr>
           <w:p>
-            <w:r>
+            <w:pPr>
+              <w:rPr>
+                <w:sz w:val="20"/>
+                <w:szCs w:val="20"/>
+              </w:rPr>
+            </w:pPr>
+            <w:r>
+              <w:rPr>
+                <w:sz w:val="20"/>
+                <w:szCs w:val="20"/>
+              </w:rPr>
               <w:t>Chủ động tự tạo khóa học mới (chọn Danh mục do Admin tạo sẵn); xây dựng cấu trúc bài học, tải học liệu, biên soạn câu hỏi thủ công hoặc bằng AI Quiz Generator, import đề thi từ Word/Excel, tạo chủ đề từ vựng và nộp kiểm định giáo trình; theo dõi Gradebook.</w:t>
             </w:r>
           </w:p>
@@ -5748,7 +5771,14 @@
               <w:rPr>
                 <w:sz w:val="20"/>
               </w:rPr>
-              <w:t>Chuyên gia thẩm định &amp; phản biện</w:t>
+              <w:t xml:space="preserve">Chuyên gia thẩm định &amp; </w:t>
+            </w:r>
+            <w:r>
+              <w:rPr>
+                <w:sz w:val="20"/>
+              </w:rPr>
+              <w:lastRenderedPageBreak/>
+              <w:t>phản biện</w:t>
             </w:r>
           </w:p>
         </w:tc>
@@ -5765,8 +5795,27 @@
             <w:vAlign w:val="center"/>
           </w:tcPr>
           <w:p>
-            <w:r>
-              <w:t>Tiếp nhận các khóa học và bộ từ vựng Flashcard được Admin phân công kiểm định; truy cập Reviewer Studio, kiểm định toàn diện nội dung học liệu, thực hiện cơ chế phản biện 2 chiều (phê duyệt xuất bản hoặc yêu cầu chỉnh sửa kèm nhận xét chuyên môn chi tiết).</w:t>
+            <w:pPr>
+              <w:rPr>
+                <w:sz w:val="20"/>
+                <w:szCs w:val="20"/>
+              </w:rPr>
+            </w:pPr>
+            <w:r>
+              <w:rPr>
+                <w:sz w:val="20"/>
+                <w:szCs w:val="20"/>
+              </w:rPr>
+              <w:lastRenderedPageBreak/>
+              <w:t xml:space="preserve">Tiếp nhận các khóa học và bộ từ vựng Flashcard được </w:t>
+            </w:r>
+            <w:r>
+              <w:rPr>
+                <w:sz w:val="20"/>
+                <w:szCs w:val="20"/>
+              </w:rPr>
+              <w:lastRenderedPageBreak/>
+              <w:t>Admin phân công kiểm định; truy cập Reviewer Studio, kiểm định toàn diện nội dung học liệu, thực hiện cơ chế phản biện 2 chiều (phê duyệt xuất bản hoặc yêu cầu chỉnh sửa kèm nhận xét chuyên môn chi tiết).</w:t>
             </w:r>
           </w:p>
         </w:tc>
@@ -5796,6 +5845,7 @@
               <w:rPr>
                 <w:sz w:val="20"/>
               </w:rPr>
+              <w:lastRenderedPageBreak/>
               <w:t>Admin</w:t>
             </w:r>
           </w:p>
@@ -5837,7 +5887,17 @@
             <w:vAlign w:val="center"/>
           </w:tcPr>
           <w:p>
-            <w:r>
+            <w:pPr>
+              <w:rPr>
+                <w:sz w:val="20"/>
+                <w:szCs w:val="20"/>
+              </w:rPr>
+            </w:pPr>
+            <w:r>
+              <w:rPr>
+                <w:sz w:val="20"/>
+                <w:szCs w:val="20"/>
+              </w:rPr>
               <w:t>Quản lý toàn bộ người dùng và phân quyền (RBAC); tạo và cấp tài khoản Giảng viên/Thẩm định viên sau khi xác minh; tạo và quản lý Danh mục các khóa học; tiếp nhận khóa học do Giảng viên tạo và trực tiếp phân công Thẩm định viên chuyên môn kiểm duyệt; giám sát trạng thái toàn hệ thống và xem báo cáo thống kê tổng hợp.</w:t>
             </w:r>
           </w:p>
@@ -5884,7 +5944,7 @@
         <w:jc w:val="both"/>
       </w:pPr>
       <w:r>
-        <w:t>Phân hệ Quản trị Khóa học (Course Management): Admin tạo và quản lý danh mục khóa học (Categories), phân công Thẩm định viên kiểm duyệt. Giảng viên chủ động tự tạo khóa học mới, chọn danh mục phù hợp, toàn quyền xây dựng giáo trình, chỉnh sửa chương mục, bài giảng, video trực tuyến, tài liệu đính kèm, phân trang hiển thị 8 khóa học/trang.</w:t>
+        <w:t>Phân hệ Quản trị Khóa học (Course Management): Admin tạo và quản lý danh mục khóa học (Categories), phân công riêng Thẩm định viên chính hoặc Hội đồng thẩm định kiểm duyệt qua modal tinh gọn. Giảng viên chủ động tự tạo khóa học mới (áp dụng kiểm soát giới hạn tối đa 5 khóa chưa duyệt và giãn cách 5 phút chống spam), chọn danh mục phù hợp, toàn quyền xây dựng giáo trình, chỉnh sửa chương mục, bài giảng, video trực tuyến, tài liệu đính kèm, phân trang hiển thị đầy đủ.</w:t>
       </w:r>
     </w:p>
     <w:p>
@@ -5904,7 +5964,6 @@
         <w:jc w:val="both"/>
       </w:pPr>
       <w:r>
-        <w:lastRenderedPageBreak/>
         <w:t>Phân hệ Trí tuệ Nhân tạo (AI Features Suite): Tích hợp 4 tính năng AI trọng tâm (AI Tutor, AI Quiz Generator, AI Adaptive Roadmap, AI Course Assistant).</w:t>
       </w:r>
     </w:p>
@@ -5935,7 +5994,7 @@
         <w:jc w:val="both"/>
       </w:pPr>
       <w:r>
-        <w:t>Phân hệ Thẩm định &amp; Phản biện (Course Reviewer Studio): Reviewer tiếp nhận các khóa học được Admin phân công thẩm định, kiểm tra toàn diện chất lượng và thực hiện cơ chế phản biện 2 chiều đảm bảo kiểm soát chất lượng nội dung trước khi xuất bản công khai.</w:t>
+        <w:t>Phân hệ Thẩm định &amp; Phản biện (Course Reviewer Studio): Reviewer chỉ tiếp nhận và kiểm định các khóa học mà mình được Admin phân công (với vai trò Thẩm định viên chính hoặc Thành viên Hội đồng thẩm định), kiểm tra toàn diện chất lượng và thực hiện cơ chế phản biện 2 chiều đảm bảo kiểm soát chất lượng nội dung trước khi xuất bản công khai.</w:t>
       </w:r>
     </w:p>
     <w:p>
@@ -5945,7 +6004,7 @@
         <w:jc w:val="both"/>
       </w:pPr>
       <w:r>
-        <w:t>Phân hệ Chứng chỉ &amp; Báo cáo: Tự động cấp chứng chỉ PDF/ảnh số hóa và thống kê tiến độ học tập chi tiết.</w:t>
+        <w:t>Phân hệ Chứng chỉ &amp; Tra cứu công khai: Tự động cấp chứng chỉ số hóa khi học viên hoàn thành khóa học, cung cấp công cụ tra cứu tính xác thực chứng chỉ theo mã định danh cho bên thứ ba/nhà tuyển dụng, hỗ trợ in chứng chỉ chuẩn khổ A4 Landscape chỉ hiển thị phôi chứng chỉ, cùng hệ thống thống kê tiến độ học tập và điểm kinh nghiệm (XP) tính toán thực tế từ CSDL.</w:t>
       </w:r>
     </w:p>
     <w:p>
@@ -5958,6 +6017,7 @@
         <w:rPr>
           <w:rFonts w:ascii="Times New Roman" w:hAnsi="Times New Roman"/>
         </w:rPr>
+        <w:lastRenderedPageBreak/>
         <w:t>3.4. Giới hạn phạm vi đề tài</w:t>
       </w:r>
       <w:bookmarkEnd w:id="13"/>
@@ -6103,7 +6163,7 @@
         <w:jc w:val="both"/>
       </w:pPr>
       <w:r>
-        <w:t>Quản lý danh mục &amp; Phân công thẩm định: Thêm, sửa, xóa các danh mục khóa học (Grammar, Vocabulary, IELTS, TOEIC, Giao tiếp,...); tiếp nhận các khóa học do Giảng viên tạo, trực tiếp phân công Thẩm định viên kiểm duyệt chất lượng và phê duyệt xuất bản.</w:t>
+        <w:t>Quản lý danh mục &amp; Phân công thẩm định: Thêm, sửa, xóa các danh mục khóa học; tiếp nhận các khóa học do Giảng viên tạo, phân công riêng Thẩm định viên chính hoặc Hội đồng thẩm định kiểm duyệt chất lượng qua giao diện chuyên biệt tinh gọn (đã lược bỏ các trường nhập liệu không cần thiết), và phê duyệt xuất bản.</w:t>
       </w:r>
     </w:p>
     <w:p>
@@ -6136,6 +6196,7 @@
         <w:rPr>
           <w:rFonts w:ascii="Times New Roman" w:hAnsi="Times New Roman"/>
         </w:rPr>
+        <w:lastRenderedPageBreak/>
         <w:t>4.2.2. Nhóm chức năng Thẩm định &amp; Phản biện (Reviewer)</w:t>
       </w:r>
       <w:bookmarkEnd w:id="18"/>
@@ -6315,7 +6376,6 @@
         <w:jc w:val="both"/>
       </w:pPr>
       <w:r>
-        <w:lastRenderedPageBreak/>
         <w:t>Học tập tương tác: Xem bài giảng video, đọc tài liệu, đánh dấu hoàn thành bài học và tự động cập nhật tiến độ học tập.</w:t>
       </w:r>
     </w:p>
@@ -6336,6 +6396,7 @@
         <w:jc w:val="both"/>
       </w:pPr>
       <w:r>
+        <w:lastRenderedPageBreak/>
         <w:t>Trợ giảng ảo (AI English Tutor): Trò chuyện hỏi đáp ngữ pháp, tra cứu nghĩa từ vựng theo ngữ cảnh và nhờ giải thích tại sao làm sai trong bài kiểm tra.</w:t>
       </w:r>
     </w:p>
@@ -6859,14 +6920,7 @@
               <w:rPr>
                 <w:sz w:val="20"/>
               </w:rPr>
-              <w:t xml:space="preserve">Hệ thống có cơ chế bẫy lỗi tập trung (Global Exception Handling), ghi nhật ký lỗi (Logging) </w:t>
-            </w:r>
-            <w:r>
-              <w:rPr>
-                <w:sz w:val="20"/>
-              </w:rPr>
-              <w:lastRenderedPageBreak/>
-              <w:t>và tự động phục hồi kết nối CSDL, đảm bảo độ khả dụng cao.</w:t>
+              <w:t>Hệ thống có cơ chế bẫy lỗi tập trung (Global Exception Handling), ghi nhật ký lỗi (Logging) và tự động phục hồi kết nối CSDL, đảm bảo độ khả dụng cao.</w:t>
             </w:r>
           </w:p>
         </w:tc>
@@ -7078,8 +7132,8 @@
       <w:tblGrid>
         <w:gridCol w:w="1001"/>
         <w:gridCol w:w="1150"/>
-        <w:gridCol w:w="3130"/>
-        <w:gridCol w:w="2414"/>
+        <w:gridCol w:w="3129"/>
+        <w:gridCol w:w="2415"/>
         <w:gridCol w:w="864"/>
         <w:gridCol w:w="1146"/>
       </w:tblGrid>
@@ -8548,14 +8602,7 @@
               <w:rPr>
                 <w:sz w:val="20"/>
               </w:rPr>
-              <w:t xml:space="preserve">Hỏi đáp với Trợ giảng AI (AI </w:t>
-            </w:r>
-            <w:r>
-              <w:rPr>
-                <w:sz w:val="20"/>
-              </w:rPr>
-              <w:lastRenderedPageBreak/>
-              <w:t>English Tutor)</w:t>
+              <w:t>Hỏi đáp với Trợ giảng AI (AI English Tutor)</w:t>
             </w:r>
           </w:p>
         </w:tc>
@@ -8579,15 +8626,7 @@
               <w:rPr>
                 <w:sz w:val="20"/>
               </w:rPr>
-              <w:lastRenderedPageBreak/>
-              <w:t xml:space="preserve">Được giải thích ngữ pháp, </w:t>
-            </w:r>
-            <w:r>
-              <w:rPr>
-                <w:sz w:val="20"/>
-              </w:rPr>
-              <w:lastRenderedPageBreak/>
-              <w:t>từ vựng theo ngữ cảnh</w:t>
+              <w:t>Được giải thích ngữ pháp, từ vựng theo ngữ cảnh</w:t>
             </w:r>
           </w:p>
         </w:tc>
@@ -8612,7 +8651,6 @@
               <w:rPr>
                 <w:sz w:val="20"/>
               </w:rPr>
-              <w:lastRenderedPageBreak/>
               <w:t>Must</w:t>
             </w:r>
           </w:p>
@@ -8668,6 +8706,7 @@
               <w:rPr>
                 <w:sz w:val="20"/>
               </w:rPr>
+              <w:lastRenderedPageBreak/>
               <w:t>US10</w:t>
             </w:r>
           </w:p>
@@ -9323,13 +9362,13 @@
           </w:tcPr>
           <w:p>
             <w:pPr>
-              <w:spacing w:before="30" w:after="30"/>
-            </w:pPr>
-            <w:r>
-              <w:rPr>
-                <w:sz w:val="20"/>
-              </w:rPr>
-              <w:t>Nhận chứng chỉ điện tử khi hoàn thành khóa học</w:t>
+              <w:spacing w:before="40" w:after="40"/>
+            </w:pPr>
+            <w:r>
+              <w:rPr>
+                <w:sz w:val="20"/>
+              </w:rPr>
+              <w:t>Học viên nhận chứng chỉ điện tử khi hoàn thành 100% khóa học; tra cứu tính xác thực chứng chỉ công khai (Certificate Verification) và hỗ trợ in ấn chứng chỉ chuẩn A4 Landscape chuyên nghiệp (tự động ẩn thanh điều hướng, nút thao tác).</w:t>
             </w:r>
           </w:p>
         </w:tc>
@@ -9347,13 +9386,13 @@
           </w:tcPr>
           <w:p>
             <w:pPr>
-              <w:spacing w:before="30" w:after="30"/>
-            </w:pPr>
-            <w:r>
-              <w:rPr>
-                <w:sz w:val="20"/>
-              </w:rPr>
-              <w:t>Ghi nhận thành tích học tập và sự tiến bộ</w:t>
+              <w:spacing w:before="40" w:after="40"/>
+            </w:pPr>
+            <w:r>
+              <w:rPr>
+                <w:sz w:val="20"/>
+              </w:rPr>
+              <w:t>Ghi nhận thành tích học tập chính thức, minh bạch hóa kết quả và thuận tiện in ấn / chia sẻ minh chứng đào tạo.</w:t>
             </w:r>
           </w:p>
         </w:tc>
@@ -9475,8 +9514,14 @@
             <w:vAlign w:val="center"/>
           </w:tcPr>
           <w:p>
-            <w:r>
-              <w:t>Tự tạo khóa học mới theo danh mục và biên soạn giáo trình với phân trang 8 khóa học/trang</w:t>
+            <w:pPr>
+              <w:spacing w:before="40" w:after="40"/>
+            </w:pPr>
+            <w:r>
+              <w:rPr>
+                <w:sz w:val="20"/>
+              </w:rPr>
+              <w:t>Tự tạo khóa học mới theo danh mục với cơ chế kiểm soát rate limit (tối đa 5 khóa nháp/chờ duyệt, giãn cách tối thiểu 5 phút, chặn trùng tên) và biên soạn giáo trình với phân trang 8 khóa học/trang.</w:t>
             </w:r>
           </w:p>
         </w:tc>
@@ -9493,8 +9538,14 @@
             <w:vAlign w:val="center"/>
           </w:tcPr>
           <w:p>
-            <w:r>
-              <w:t>Giảng viên chủ động tạo khóa học và xây dựng giáo trình chuyên sâu, trực quan</w:t>
+            <w:pPr>
+              <w:spacing w:before="40" w:after="40"/>
+            </w:pPr>
+            <w:r>
+              <w:rPr>
+                <w:sz w:val="20"/>
+              </w:rPr>
+              <w:t>Giảng viên chủ động tạo khóa học, biên soạn giáo trình chuyên sâu đồng thời đảm bảo chất lượng, phòng chống spam dữ liệu.</w:t>
             </w:r>
           </w:p>
         </w:tc>
@@ -10535,13 +10586,20 @@
           </w:tcPr>
           <w:p>
             <w:pPr>
-              <w:spacing w:before="30" w:after="30"/>
-            </w:pPr>
-            <w:r>
-              <w:rPr>
-                <w:sz w:val="20"/>
-              </w:rPr>
-              <w:t>Xem danh sách và thẩm định nội dung khóa học/Flashcard</w:t>
+              <w:spacing w:before="40" w:after="40"/>
+            </w:pPr>
+            <w:r>
+              <w:rPr>
+                <w:sz w:val="20"/>
+              </w:rPr>
+              <w:t xml:space="preserve">Xem danh sách và thẩm định nội dung khóa học theo phân công riêng của Admin (1 Thẩm định viên chính hoặc Hội đồng phản </w:t>
+            </w:r>
+            <w:r>
+              <w:rPr>
+                <w:sz w:val="20"/>
+              </w:rPr>
+              <w:lastRenderedPageBreak/>
+              <w:t>biện với nhiều đồng Thẩm định viên); chỉ xem và thao tác trên đúng các khóa học được phân công.</w:t>
             </w:r>
           </w:p>
         </w:tc>
@@ -10559,13 +10617,21 @@
           </w:tcPr>
           <w:p>
             <w:pPr>
-              <w:spacing w:before="30" w:after="30"/>
-            </w:pPr>
-            <w:r>
-              <w:rPr>
-                <w:sz w:val="20"/>
-              </w:rPr>
-              <w:t>Đảm bảo chất lượng học liệu trước khi xuất bản</w:t>
+              <w:spacing w:before="40" w:after="40"/>
+            </w:pPr>
+            <w:r>
+              <w:rPr>
+                <w:sz w:val="20"/>
+              </w:rPr>
+              <w:lastRenderedPageBreak/>
+              <w:t xml:space="preserve">Phân định rõ ràng trách nhiệm thẩm định, nâng cao tính chuyên môn hóa và bảo mật dữ liệu giữa </w:t>
+            </w:r>
+            <w:r>
+              <w:rPr>
+                <w:sz w:val="20"/>
+              </w:rPr>
+              <w:lastRenderedPageBreak/>
+              <w:t>các thẩm định viên.</w:t>
             </w:r>
           </w:p>
         </w:tc>
@@ -10590,6 +10656,7 @@
               <w:rPr>
                 <w:sz w:val="20"/>
               </w:rPr>
+              <w:lastRenderedPageBreak/>
               <w:t>Must</w:t>
             </w:r>
           </w:p>
@@ -10840,8 +10907,14 @@
             <w:vAlign w:val="center"/>
           </w:tcPr>
           <w:p>
-            <w:r>
-              <w:t>Quản lý toàn diện tài khoản, danh mục, phân công Thẩm định viên và phê duyệt khóa học</w:t>
+            <w:pPr>
+              <w:spacing w:before="40" w:after="40"/>
+            </w:pPr>
+            <w:r>
+              <w:rPr>
+                <w:sz w:val="20"/>
+              </w:rPr>
+              <w:t>Quản lý toàn diện tài khoản, danh mục, phân công Thẩm định viên riêng cho từng khóa học (1 Thẩm định viên chính hoặc Hội đồng nhiều phản biện qua modal phân công tinh gọn) và giám sát chất lượng học liệu.</w:t>
             </w:r>
           </w:p>
         </w:tc>
@@ -10858,8 +10931,14 @@
             <w:vAlign w:val="center"/>
           </w:tcPr>
           <w:p>
-            <w:r>
-              <w:t>Quy hoạch danh mục đào tạo, phân quyền tài khoản rõ ràng và phân công thẩm định kiểm soát chất lượng</w:t>
+            <w:pPr>
+              <w:spacing w:before="40" w:after="40"/>
+            </w:pPr>
+            <w:r>
+              <w:rPr>
+                <w:sz w:val="20"/>
+              </w:rPr>
+              <w:t>Quy hoạch danh mục đào tạo, phân quyền tài khoản rõ ràng, tối ưu hóa thao tác phân công và kiểm soát chặt chẽ chất lượng khóa học.</w:t>
             </w:r>
           </w:p>
         </w:tc>
@@ -10925,7 +11004,6 @@
         <w:rPr>
           <w:rFonts w:ascii="Times New Roman" w:hAnsi="Times New Roman"/>
         </w:rPr>
-        <w:lastRenderedPageBreak/>
         <w:t>4.5. Tiêu chí nghiệm thu mẫu (Acceptance Criteria)</w:t>
       </w:r>
       <w:bookmarkEnd w:id="24"/>
@@ -11524,7 +11602,11 @@
           </w:tcPr>
           <w:p>
             <w:r>
-              <w:t>Khóa học ở trạng thái 'Pending Review' thuộc danh sách Reviewer được Admin phân công</w:t>
+              <w:t xml:space="preserve">Khóa học ở trạng </w:t>
+            </w:r>
+            <w:r>
+              <w:lastRenderedPageBreak/>
+              <w:t>thái 'Pending Review' thuộc danh sách Reviewer được Admin phân công</w:t>
             </w:r>
           </w:p>
         </w:tc>
@@ -11548,7 +11630,15 @@
               <w:rPr>
                 <w:sz w:val="20"/>
               </w:rPr>
-              <w:t>Reviewer bấm 'Từ chối' (Reject) và nhập lý do phản biện</w:t>
+              <w:lastRenderedPageBreak/>
+              <w:t xml:space="preserve">Reviewer bấm 'Từ chối' </w:t>
+            </w:r>
+            <w:r>
+              <w:rPr>
+                <w:sz w:val="20"/>
+              </w:rPr>
+              <w:lastRenderedPageBreak/>
+              <w:t>(Reject) và nhập lý do phản biện</w:t>
             </w:r>
           </w:p>
         </w:tc>
@@ -11572,7 +11662,15 @@
               <w:rPr>
                 <w:sz w:val="20"/>
               </w:rPr>
-              <w:t>Khóa học chuyển trạng thái 'Rejected'; Giảng viên nhận thông báo kèm lý do phản biện để cập nhật lại.</w:t>
+              <w:lastRenderedPageBreak/>
+              <w:t xml:space="preserve">Khóa học chuyển trạng thái </w:t>
+            </w:r>
+            <w:r>
+              <w:rPr>
+                <w:sz w:val="20"/>
+              </w:rPr>
+              <w:lastRenderedPageBreak/>
+              <w:t>'Rejected'; Giảng viên nhận thông báo kèm lý do phản biện để cập nhật lại.</w:t>
             </w:r>
           </w:p>
         </w:tc>
@@ -11588,6 +11686,7 @@
         <w:rPr>
           <w:rFonts w:ascii="Times New Roman" w:hAnsi="Times New Roman"/>
         </w:rPr>
+        <w:lastRenderedPageBreak/>
         <w:t>5. THIẾT KẾ USE CASE VÀ QUY TRÌNH NGHIỆP VỤ</w:t>
       </w:r>
       <w:bookmarkEnd w:id="25"/>
@@ -11620,15 +11719,11 @@
         <w:jc w:val="center"/>
       </w:pPr>
       <w:r>
-        <w:rPr>
-          <w:noProof/>
-        </w:rPr>
-        <w:lastRenderedPageBreak/>
         <w:drawing>
-          <wp:inline distT="0" distB="0" distL="0" distR="0" wp14:anchorId="6E9620C0" wp14:editId="11F519CE">
-            <wp:extent cx="6034233" cy="4025443"/>
-            <wp:effectExtent l="0" t="0" r="5080" b="0"/>
-            <wp:docPr id="1736859843" name="Hình ảnh 3"/>
+          <wp:inline distT="0" distB="0" distL="0" distR="0" wp14:anchorId="64127989" wp14:editId="5F14E4F7">
+            <wp:extent cx="5972175" cy="4916170"/>
+            <wp:effectExtent l="0" t="0" r="9525" b="0"/>
+            <wp:docPr id="1717306136" name="Hình ảnh 1"/>
             <wp:cNvGraphicFramePr>
               <a:graphicFrameLocks xmlns:a="http://schemas.openxmlformats.org/drawingml/2006/main" noChangeAspect="1"/>
             </wp:cNvGraphicFramePr>
@@ -11636,33 +11731,23 @@
               <a:graphicData uri="http://schemas.openxmlformats.org/drawingml/2006/picture">
                 <pic:pic xmlns:pic="http://schemas.openxmlformats.org/drawingml/2006/picture">
                   <pic:nvPicPr>
-                    <pic:cNvPr id="0" name="Picture 2"/>
-                    <pic:cNvPicPr>
-                      <a:picLocks noChangeAspect="1" noChangeArrowheads="1"/>
-                    </pic:cNvPicPr>
+                    <pic:cNvPr id="1717306136" name=""/>
+                    <pic:cNvPicPr/>
                   </pic:nvPicPr>
                   <pic:blipFill>
-                    <a:blip r:embed="rId8">
-                      <a:extLst>
-                        <a:ext uri="{28A0092B-C50C-407E-A947-70E740481C1C}">
-                          <a14:useLocalDpi xmlns:a14="http://schemas.microsoft.com/office/drawing/2010/main" val="0"/>
-                        </a:ext>
-                      </a:extLst>
-                    </a:blip>
-                    <a:srcRect/>
+                    <a:blip r:embed="rId8"/>
                     <a:stretch>
                       <a:fillRect/>
                     </a:stretch>
                   </pic:blipFill>
-                  <pic:spPr bwMode="auto">
+                  <pic:spPr>
                     <a:xfrm>
                       <a:off x="0" y="0"/>
-                      <a:ext cx="6055684" cy="4039753"/>
+                      <a:ext cx="5972175" cy="4916170"/>
                     </a:xfrm>
                     <a:prstGeom prst="rect">
                       <a:avLst/>
                     </a:prstGeom>
-                    <a:noFill/>
                   </pic:spPr>
                 </pic:pic>
               </a:graphicData>
@@ -11694,6 +11779,7 @@
         <w:rPr>
           <w:rFonts w:ascii="Times New Roman" w:hAnsi="Times New Roman"/>
         </w:rPr>
+        <w:lastRenderedPageBreak/>
         <w:t>5.2. Danh mục tổng hợp Use Case hệ thống</w:t>
       </w:r>
       <w:bookmarkEnd w:id="27"/>
@@ -12412,7 +12498,6 @@
               <w:rPr>
                 <w:sz w:val="20"/>
               </w:rPr>
-              <w:lastRenderedPageBreak/>
               <w:t>UC05</w:t>
             </w:r>
           </w:p>
@@ -13123,8 +13208,14 @@
             <w:vAlign w:val="center"/>
           </w:tcPr>
           <w:p>
-            <w:r>
-              <w:t>Giảng viên tự tạo khóa học, xây dựng chương mục, bài giảng, tài liệu đính kèm và nộp duyệt (Curriculum Studio)</w:t>
+            <w:pPr>
+              <w:spacing w:before="40" w:after="40"/>
+            </w:pPr>
+            <w:r>
+              <w:rPr>
+                <w:sz w:val="20"/>
+              </w:rPr>
+              <w:t>Giảng viên tự tạo khóa học (áp dụng chính sách kiểm soát giới hạn: tối đa 5 khóa chưa duyệt, giãn cách 5 phút, chặn trùng tên), xây dựng chương mục, bài giảng, tài liệu đính kèm và nộp duyệt (Curriculum Studio).</w:t>
             </w:r>
           </w:p>
         </w:tc>
@@ -13179,6 +13270,7 @@
               <w:rPr>
                 <w:sz w:val="20"/>
               </w:rPr>
+              <w:lastRenderedPageBreak/>
               <w:t>UC11</w:t>
             </w:r>
           </w:p>
@@ -13629,8 +13721,14 @@
             <w:vAlign w:val="center"/>
           </w:tcPr>
           <w:p>
-            <w:r>
-              <w:t>Thẩm định chất lượng khóa học được phân công, thực hiện phản biện 2 chiều (Approve/Reject)</w:t>
+            <w:pPr>
+              <w:spacing w:before="40" w:after="40"/>
+            </w:pPr>
+            <w:r>
+              <w:rPr>
+                <w:sz w:val="20"/>
+              </w:rPr>
+              <w:t>Thẩm định chất lượng khóa học theo phân công riêng của Admin (1 Thẩm định viên chính hoặc Hội đồng nhiều Thẩm định viên); thực hiện phản biện 2 chiều (Approve/Reject).</w:t>
             </w:r>
           </w:p>
         </w:tc>
@@ -13873,8 +13971,14 @@
             <w:vAlign w:val="center"/>
           </w:tcPr>
           <w:p>
-            <w:r>
-              <w:t>Tạo danh mục khóa học, cấp tài khoản Giảng viên/PB, phân công Thẩm định viên kiểm duyệt và xem báo cáo</w:t>
+            <w:pPr>
+              <w:spacing w:before="40" w:after="40"/>
+            </w:pPr>
+            <w:r>
+              <w:rPr>
+                <w:sz w:val="20"/>
+              </w:rPr>
+              <w:t>Tạo danh mục khóa học, cấp tài khoản, phân công 1 hoặc nhiều Thẩm định viên cho từng khóa học qua modal quản trị tinh gọn, giám sát toàn diện hệ thống.</w:t>
             </w:r>
           </w:p>
         </w:tc>
@@ -13938,7 +14042,6 @@
         <w:rPr>
           <w:rFonts w:ascii="Times New Roman" w:hAnsi="Times New Roman"/>
         </w:rPr>
-        <w:lastRenderedPageBreak/>
         <w:t>5.3.1. Đặc tả UC01 – Đăng nhập &amp; Xác thực phân quyền</w:t>
       </w:r>
       <w:bookmarkEnd w:id="29"/>
@@ -14324,6 +14427,7 @@
               <w:rPr>
                 <w:sz w:val="20"/>
               </w:rPr>
+              <w:lastRenderedPageBreak/>
               <w:t>Luồng sự kiện chính (Normal Flow)</w:t>
             </w:r>
           </w:p>
@@ -14349,41 +14453,6 @@
                 <w:sz w:val="20"/>
               </w:rPr>
               <w:t>1. Người dùng chọn chức năng 'Đăng nhập' hoặc 'Đăng ký' trên thanh điều hướng. 2. Khách vãng lai đăng ký tài khoản mới mặc định nhận vai trò Học viên (STUDENT); tài khoản Giảng viên và Thẩm định viên do Quản trị viên (Admin) trực tiếp khởi tạo và cấp phát sau khi xác minh năng lực. 3. Người dùng nhập thông tin và nhấn nút 'Đăng nhập' (hoặc 'Đăng ký'). 4. Hệ thống kiểm tra định dạng dữ liệu phía Client và gửi POST request tới `/api/v1/auth/login` (hoặc `/api/v1/auth/register/`). 5. Backend xác thực mật khẩu qua thuật toán băm Bcrypt / PBKDF2. 6. Backend tạo cặp JWT Access Token (hạn 60 phút) và Refresh Token (hạn 7 ngày). 7. Hệ thống trả về token kèm thông tin hồ sơ và vai trò (Role: student, teacher, reviewer, admin). 8. Frontend lưu token, cập nhật trạng thái AuthContext và điều hướng tới Dashboard tương ứng.</w:t>
-            </w:r>
-            <w:r>
-              <w:rPr>
-                <w:sz w:val="20"/>
-              </w:rPr>
-            </w:r>
-            <w:r>
-              <w:rPr>
-                <w:sz w:val="20"/>
-              </w:rPr>
-            </w:r>
-            <w:r>
-              <w:rPr>
-                <w:sz w:val="20"/>
-              </w:rPr>
-            </w:r>
-            <w:r>
-              <w:rPr>
-                <w:sz w:val="20"/>
-              </w:rPr>
-            </w:r>
-            <w:r>
-              <w:rPr>
-                <w:sz w:val="20"/>
-              </w:rPr>
-            </w:r>
-            <w:r>
-              <w:rPr>
-                <w:sz w:val="20"/>
-              </w:rPr>
-            </w:r>
-            <w:r>
-              <w:rPr>
-                <w:sz w:val="20"/>
-              </w:rPr>
             </w:r>
           </w:p>
         </w:tc>
@@ -14728,7 +14797,6 @@
                 <w:sz w:val="20"/>
                 <w:lang w:val="fr-FR"/>
               </w:rPr>
-              <w:lastRenderedPageBreak/>
               <w:t>Điều kiện tiên quyết (Pre-conditions)</w:t>
             </w:r>
           </w:p>
@@ -14746,7 +14814,15 @@
             <w:vAlign w:val="center"/>
           </w:tcPr>
           <w:p>
-            <w:r>
+            <w:pPr>
+              <w:rPr>
+                <w:lang w:val="fr-FR"/>
+              </w:rPr>
+            </w:pPr>
+            <w:r>
+              <w:rPr>
+                <w:lang w:val="fr-FR"/>
+              </w:rPr>
               <w:t>Giảng viên đã đăng nhập tài khoản Teacher được Admin cấp phát.</w:t>
             </w:r>
           </w:p>
@@ -14846,8 +14922,69 @@
             <w:vAlign w:val="center"/>
           </w:tcPr>
           <w:p>
-            <w:r>
-              <w:t>1. Giảng viên vào Studio Giảng dạy, bấm 'Tạo khóa học mới', chọn Danh mục (do Admin tạo) và nhập thông tin cơ bản. 2. Giảng viên mở khóa học vừa tạo để vào Curriculum Studio (hiển thị danh sách phân trang 8 khóa học/trang). 3. Giảng viên thêm các Chương (Chapter) và các Bài học (Lesson) tương ứng. 4. Trong từng bài học, giảng viên tải tài liệu học tập (PDF/DOCX) và liên kết video bài giảng. 5. Giảng viên thêm bài kiểm tra trắc nghiệm (tạo thủ công, dùng AI Quiz hoặc Import file). 6. Giảng viên xem lại toàn bộ đề cương ở chế độ xem trước (Preview). 7. Giảng viên nhấn 'Nộp phê duyệt' (Submit for Review). 8. Hệ thống kiểm tra điều kiện tối thiểu (phải có ít nhất 1 chương và 1 bài học), đổi trạng thái khóa học sang 'PENDING' để Admin tiếp nhận và phân công Thẩm định viên xem xét.</w:t>
+            <w:pPr>
+              <w:spacing w:before="40" w:after="40"/>
+            </w:pPr>
+            <w:r>
+              <w:rPr>
+                <w:sz w:val="20"/>
+              </w:rPr>
+              <w:t>1. Giảng viên vào Studio Giảng dạy, bấm 'Tạo khóa học mới', chọn Danh mục (do Admin tạo) và nhập thông tin cơ bản. Hệ thống tự động kiểm tra chính sách giới hạn tạo khóa học (Rate Limit &amp; Anti-Spam): Giảng viên không có quá 5 khóa học đang ở trạng thái Nháp hoặc Chờ duyệt, thời gian tạo cách lần tạo gần nhất tối thiểu 5 phút, và tiêu đề không trùng lặp với các khóa học hiện có của giảng viên.</w:t>
+            </w:r>
+            <w:r>
+              <w:rPr>
+                <w:sz w:val="20"/>
+              </w:rPr>
+              <w:br/>
+              <w:t>2. Sau khi tạo thành công, hệ thống mở khóa học trong Curriculum Studio (hiển thị danh sách phân trang 8 khóa học/trang) để bắt đầu biên soạn giáo trình.</w:t>
+            </w:r>
+            <w:r>
+              <w:rPr>
+                <w:sz w:val="20"/>
+              </w:rPr>
+              <w:br/>
+            </w:r>
+            <w:r>
+              <w:rPr>
+                <w:sz w:val="20"/>
+              </w:rPr>
+              <w:lastRenderedPageBreak/>
+              <w:t>3. Giảng viên thêm các Chương (Chapter) và các Bài học (Lesson) tương ứng.</w:t>
+            </w:r>
+            <w:r>
+              <w:rPr>
+                <w:sz w:val="20"/>
+              </w:rPr>
+              <w:br/>
+              <w:t>4. Trong từng bài học, giảng viên tải tài liệu học tập (PDF/DOCX) và liên kết video bài giảng.</w:t>
+            </w:r>
+            <w:r>
+              <w:rPr>
+                <w:sz w:val="20"/>
+              </w:rPr>
+              <w:br/>
+              <w:t>5. Giảng viên thêm bài kiểm tra trắc nghiệm (tạo thủ công, dùng AI Quiz hoặc Import file).</w:t>
+            </w:r>
+            <w:r>
+              <w:rPr>
+                <w:sz w:val="20"/>
+              </w:rPr>
+              <w:br/>
+              <w:t>6. Giảng viên xem lại toàn bộ đề cương ở chế độ xem trước (Preview).</w:t>
+            </w:r>
+            <w:r>
+              <w:rPr>
+                <w:sz w:val="20"/>
+              </w:rPr>
+              <w:br/>
+              <w:t>7. Giảng viên nhấn 'Nộp phê duyệt' (Submit for Review).</w:t>
+            </w:r>
+            <w:r>
+              <w:rPr>
+                <w:sz w:val="20"/>
+              </w:rPr>
+              <w:br/>
+              <w:t>8. Hệ thống kiểm tra điều kiện tối thiểu (phải có ít nhất 1 chương và 1 bài học), đổi trạng thái khóa học sang 'PENDING' để Admin tiếp nhận và phân công Thẩm định viên xem xét.</w:t>
             </w:r>
           </w:p>
         </w:tc>
@@ -14876,6 +15013,7 @@
               <w:rPr>
                 <w:sz w:val="20"/>
               </w:rPr>
+              <w:lastRenderedPageBreak/>
               <w:t>Luồng rẽ nhánh / Ngoại lệ (Alternative / Exception Flows)</w:t>
             </w:r>
           </w:p>
@@ -14894,12 +15032,19 @@
           </w:tcPr>
           <w:p>
             <w:pPr>
-              <w:spacing w:before="30" w:after="30"/>
-            </w:pPr>
-            <w:r>
-              <w:rPr>
-                <w:sz w:val="20"/>
-              </w:rPr>
+              <w:spacing w:before="40" w:after="40"/>
+            </w:pPr>
+            <w:r>
+              <w:rPr>
+                <w:sz w:val="20"/>
+              </w:rPr>
+              <w:t>1a. Giảng viên vi phạm chính sách giới hạn tạo khóa học: (1) Nếu đang có từ 5 khóa học nháp/chờ duyệt, hệ thống từ chối và báo lỗi 'Bạn đang có 5 khóa học chưa hoàn tất hoặc đang chờ duyệt. Vui lòng hoàn thiện hoặc chờ duyệt trước khi tạo thêm!'; (2) Nếu tạo liên tiếp trong vòng dưới 5 phút, hệ thống yêu cầu 'Vui lòng chờ ít nhất 5 phút giữa hai lần tạo khóa học!'; (3) Nếu tiêu đề bị trùng, hệ thống thông báo 'Bạn đã có một khóa học với tiêu đề này. Vui lòng đặt tên khác!'. Khóa học không được khởi tạo và giữ nguyên trạng thái.</w:t>
+            </w:r>
+            <w:r>
+              <w:rPr>
+                <w:sz w:val="20"/>
+              </w:rPr>
+              <w:br/>
               <w:t>8a. Khóa học chưa đủ nội dung tối thiểu: Hệ thống cảnh báo 'Khóa học phải có ít nhất 1 chương và bài học hoàn chỉnh trước khi nộp duyệt' và giữ nguyên trạng thái 'DRAFT'.</w:t>
             </w:r>
           </w:p>
@@ -15151,8 +15296,14 @@
             <w:vAlign w:val="center"/>
           </w:tcPr>
           <w:p>
-            <w:r>
-              <w:t>Reviewer mở danh sách các khóa học được Admin phân công thẩm định và đang chờ duyệt trong Reviewer Studio.</w:t>
+            <w:pPr>
+              <w:spacing w:before="40" w:after="40"/>
+            </w:pPr>
+            <w:r>
+              <w:rPr>
+                <w:sz w:val="20"/>
+              </w:rPr>
+              <w:t>Reviewer mở danh sách các khóa học được Admin phân công thẩm định (dưới vai trò Thẩm định viên chính hoặc thành viên Hội đồng phản biện) và đang ở trạng thái 'Pending Review' trong Reviewer Studio.</w:t>
             </w:r>
           </w:p>
         </w:tc>
@@ -15202,8 +15353,18 @@
             <w:vAlign w:val="center"/>
           </w:tcPr>
           <w:p>
-            <w:r>
-              <w:t>Reviewer đã đăng nhập tài khoản có quyền Reviewer; Khóa học thuộc danh sách được Admin phân công và đang ở trạng thái 'PENDING'.</w:t>
+            <w:pPr>
+              <w:spacing w:before="40" w:after="40"/>
+              <w:rPr>
+                <w:lang w:val="fr-FR"/>
+              </w:rPr>
+            </w:pPr>
+            <w:r>
+              <w:rPr>
+                <w:sz w:val="20"/>
+                <w:lang w:val="fr-FR"/>
+              </w:rPr>
+              <w:t>Reviewer đã đăng nhập tài khoản có quyền Reviewer; Khóa học thuộc danh sách được Admin phân công riêng cho Reviewer đó (hoặc thuộc danh sách Hội đồng phản biện của khóa học) và đang ở trạng thái 'PENDING'. Thẩm định viên không thể thấy hoặc duyệt các khóa học không được Admin phân công.</w:t>
             </w:r>
           </w:p>
         </w:tc>
@@ -15302,8 +15463,56 @@
             <w:vAlign w:val="center"/>
           </w:tcPr>
           <w:p>
-            <w:r>
-              <w:t>1. Reviewer truy cập Reviewer Studio và lọc danh sách các khóa học được phân công thẩm định có trạng thái 'Pending Review'. 2. Reviewer chọn khóa học cần thẩm định để mở màn hình chi tiết. 3. Reviewer kiểm tra lần lượt: Tên, mô tả, video bài giảng, tài liệu đính kèm và ngân hàng câu hỏi. 4. Trường hợp đạt chuẩn: Reviewer nhấn 'Phê duyệt' (Approve). 5. Hệ thống cập nhật trạng thái khóa học thành 'PUBLISHED', ghi nhận reviewer_id và thời gian duyệt, hiển thị công khai trên trang chủ cho học viên ghi danh. 6. Hệ thống gửi thông báo chúc mừng tới Giảng viên phụ trách khóa học.</w:t>
+            <w:pPr>
+              <w:spacing w:before="40" w:after="40"/>
+            </w:pPr>
+            <w:r>
+              <w:rPr>
+                <w:sz w:val="20"/>
+              </w:rPr>
+              <w:t xml:space="preserve">1. Reviewer truy cập Reviewer Studio, hệ thống tự động lọc và chỉ hiển thị các khóa học mà Reviewer được Admin phân công (kèm huy hiệu vai trò: 'Trưởng thẩm định' hoặc 'Hội đồng phản biện') có trạng thái 'Pending </w:t>
+            </w:r>
+            <w:r>
+              <w:rPr>
+                <w:sz w:val="20"/>
+              </w:rPr>
+              <w:lastRenderedPageBreak/>
+              <w:t>Review'.</w:t>
+            </w:r>
+            <w:r>
+              <w:rPr>
+                <w:sz w:val="20"/>
+              </w:rPr>
+              <w:br/>
+              <w:t>2. Reviewer chọn khóa học cần thẩm định để mở màn hình chi tiết.</w:t>
+            </w:r>
+            <w:r>
+              <w:rPr>
+                <w:sz w:val="20"/>
+              </w:rPr>
+              <w:br/>
+              <w:t>3. Reviewer kiểm tra lần lượt: Tên, mô tả, video bài giảng, tài liệu đính kèm và ngân hàng câu hỏi.</w:t>
+            </w:r>
+            <w:r>
+              <w:rPr>
+                <w:sz w:val="20"/>
+              </w:rPr>
+              <w:br/>
+              <w:t>4. Trường hợp đạt chuẩn: Reviewer nhấn 'Phê duyệt' (Approve).</w:t>
+            </w:r>
+            <w:r>
+              <w:rPr>
+                <w:sz w:val="20"/>
+              </w:rPr>
+              <w:br/>
+              <w:t>5. Hệ thống cập nhật trạng thái khóa học thành 'PUBLISHED', ghi nhận reviewer_id, vai trò thẩm định và thời gian duyệt, hiển thị công khai trên trang chủ cho học viên ghi danh.</w:t>
+            </w:r>
+            <w:r>
+              <w:rPr>
+                <w:sz w:val="20"/>
+              </w:rPr>
+              <w:br/>
+              <w:t>6. Hệ thống gửi thông báo chúc mừng tới Giảng viên phụ trách khóa học.</w:t>
             </w:r>
           </w:p>
         </w:tc>
@@ -15351,12 +15560,19 @@
           </w:tcPr>
           <w:p>
             <w:pPr>
-              <w:spacing w:before="30" w:after="30"/>
-            </w:pPr>
-            <w:r>
-              <w:rPr>
-                <w:sz w:val="20"/>
-              </w:rPr>
+              <w:spacing w:before="40" w:after="40"/>
+            </w:pPr>
+            <w:r>
+              <w:rPr>
+                <w:sz w:val="20"/>
+              </w:rPr>
+              <w:t>1a. Khóa học chưa được Admin phân công thẩm định viên: Không hiển thị trong danh sách của bất kỳ Reviewer nào cho đến khi Admin thực hiện phân công trong Admin Dashboard.</w:t>
+            </w:r>
+            <w:r>
+              <w:rPr>
+                <w:sz w:val="20"/>
+              </w:rPr>
+              <w:br/>
               <w:t>4a. Trường hợp nội dung chưa đạt chuẩn hoặc cần sửa đổi: Reviewer chọn 'Yêu cầu chỉnh sửa / Từ chối' (Reject), nhập lý do phản biện cụ thể (ví dụ: 'Video bài 3 bị mất tiếng, câu hỏi 5 trắc nghiệm trùng đáp án').</w:t>
             </w:r>
             <w:r>
@@ -15831,7 +16047,14 @@
                 <w:sz w:val="20"/>
               </w:rPr>
               <w:br/>
-              <w:t>6. Gemini AI sinh dữ liệu JSON chứa: danh sách câu hỏi, 4 đáp án (A, B, C, D), chỉ số đáp án đúng và lời giải thích chi tiết.</w:t>
+              <w:t xml:space="preserve">6. Gemini AI sinh dữ liệu JSON chứa: danh sách câu hỏi, 4 đáp án (A, B, C, </w:t>
+            </w:r>
+            <w:r>
+              <w:rPr>
+                <w:sz w:val="20"/>
+              </w:rPr>
+              <w:lastRenderedPageBreak/>
+              <w:t>D), chỉ số đáp án đúng và lời giải thích chi tiết.</w:t>
             </w:r>
             <w:r>
               <w:rPr>
@@ -15881,14 +16104,8 @@
               <w:rPr>
                 <w:sz w:val="20"/>
               </w:rPr>
-              <w:t xml:space="preserve">Luồng rẽ nhánh / Ngoại lệ </w:t>
-            </w:r>
-            <w:r>
-              <w:rPr>
-                <w:sz w:val="20"/>
-              </w:rPr>
               <w:lastRenderedPageBreak/>
-              <w:t>(Alternative / Exception Flows)</w:t>
+              <w:t>Luồng rẽ nhánh / Ngoại lệ (Alternative / Exception Flows)</w:t>
             </w:r>
           </w:p>
         </w:tc>
@@ -15912,15 +16129,7 @@
               <w:rPr>
                 <w:sz w:val="20"/>
               </w:rPr>
-              <w:lastRenderedPageBreak/>
-              <w:t xml:space="preserve">7a. Phản hồi từ AI không đúng cấu trúc JSON hoặc thiếu trường dữ liệu: Backend tự động kích hoạt fallback prompt hoặc báo lỗi 'AI sinh phản hồi </w:t>
-            </w:r>
-            <w:r>
-              <w:rPr>
-                <w:sz w:val="20"/>
-              </w:rPr>
-              <w:lastRenderedPageBreak/>
-              <w:t>không hợp lệ, vui lòng thử lại'.</w:t>
+              <w:t>7a. Phản hồi từ AI không đúng cấu trúc JSON hoặc thiếu trường dữ liệu: Backend tự động kích hoạt fallback prompt hoặc báo lỗi 'AI sinh phản hồi không hợp lệ, vui lòng thử lại'.</w:t>
             </w:r>
             <w:r>
               <w:rPr>
@@ -15943,7 +16152,6 @@
         <w:rPr>
           <w:rFonts w:ascii="Times New Roman" w:hAnsi="Times New Roman"/>
         </w:rPr>
-        <w:lastRenderedPageBreak/>
         <w:t>5.3.5. Đặc tả UC05 – Soạn thảo, gửi duyệt và kiểm định bộ từ vựng Flashcard</w:t>
       </w:r>
       <w:bookmarkEnd w:id="33"/>
@@ -16462,6 +16670,12 @@
                 <w:sz w:val="20"/>
               </w:rPr>
               <w:br/>
+            </w:r>
+            <w:r>
+              <w:rPr>
+                <w:sz w:val="20"/>
+              </w:rPr>
+              <w:lastRenderedPageBreak/>
               <w:t>8a. Reviewer phát hiện phiên âm hoặc nghĩa dịch sai: Nhấn 'Từ chối' (Reject) kèm ghi chú chỉnh sửa. Giảng viên sửa lại và nộp duyệt lại.</w:t>
             </w:r>
           </w:p>
@@ -16478,6 +16692,7 @@
         <w:rPr>
           <w:rFonts w:ascii="Times New Roman" w:hAnsi="Times New Roman"/>
         </w:rPr>
+        <w:lastRenderedPageBreak/>
         <w:t>5.3.6. Đặc tả UC06 – Đánh giá năng lực và thích ứng lộ trình học tập cá nhân hóa</w:t>
       </w:r>
       <w:bookmarkEnd w:id="34"/>
@@ -16534,7 +16749,6 @@
                 <w:color w:val="FFFFFF"/>
                 <w:sz w:val="21"/>
               </w:rPr>
-              <w:lastRenderedPageBreak/>
               <w:t>Mã ca sử dụng (ID)</w:t>
             </w:r>
           </w:p>
@@ -17118,6 +17332,7 @@
               <w:rPr>
                 <w:sz w:val="20"/>
               </w:rPr>
+              <w:lastRenderedPageBreak/>
               <w:t>Tên ca sử dụng</w:t>
             </w:r>
           </w:p>
@@ -17281,7 +17496,6 @@
                 <w:sz w:val="20"/>
                 <w:lang w:val="fr-FR"/>
               </w:rPr>
-              <w:lastRenderedPageBreak/>
               <w:t>Điều kiện tiên quyết (Pre-conditions)</w:t>
             </w:r>
           </w:p>
@@ -17866,6 +18080,7 @@
               <w:rPr>
                 <w:sz w:val="20"/>
               </w:rPr>
+              <w:lastRenderedPageBreak/>
               <w:t>Điều kiện kết thúc (Post-conditions)</w:t>
             </w:r>
           </w:p>
@@ -17964,12 +18179,6 @@
                 <w:sz w:val="20"/>
               </w:rPr>
               <w:br/>
-            </w:r>
-            <w:r>
-              <w:rPr>
-                <w:sz w:val="20"/>
-              </w:rPr>
-              <w:lastRenderedPageBreak/>
               <w:t>4. Backend kích hoạt bộ phân tích cú pháp (Parser): đọc từng dòng văn bản Word hoặc các cột Excel (Question, Option A, Option B, Option C, Option D, Correct Answer, Explanation).</w:t>
             </w:r>
             <w:r>
@@ -18027,7 +18236,6 @@
               <w:rPr>
                 <w:sz w:val="20"/>
               </w:rPr>
-              <w:lastRenderedPageBreak/>
               <w:t>Luồng rẽ nhánh / Ngoại lệ (Alternative / Exception Flows)</w:t>
             </w:r>
           </w:p>
@@ -18124,7 +18332,7 @@
         <w:jc w:val="both"/>
       </w:pPr>
       <w:r>
-        <w:t>Bước 3 - Nộp thẩm định (Teacher): Sau khi hoàn thiện nội dung giáo trình đạt chuẩn tối thiểu, Giảng viên nhấn 'Nộp kiểm duyệt'. Trạng thái chuyển thành: PENDING (Chờ duyệt).</w:t>
+        <w:t>Bước 2 &amp; 3 - Tạo khóa học có kiểm soát &amp; Nộp thẩm định (Teacher): Giảng viên tự tạo khóa học với cơ chế kiểm soát giới hạn (tối đa 5 khóa học nháp/chờ duyệt, giãn cách tối thiểu 5 phút giữa 2 lần tạo và kiểm tra trùng lặp tiêu đề). Sau khi hoàn thiện nội dung giáo trình đạt chuẩn tối thiểu (ít nhất 1 chương và 1 bài học), Giảng viên nhấn 'Nộp kiểm duyệt'. Trạng thái chuyển thành: PENDING (Chờ duyệt).</w:t>
       </w:r>
     </w:p>
     <w:p>
@@ -18134,7 +18342,8 @@
         <w:jc w:val="both"/>
       </w:pPr>
       <w:r>
-        <w:t>Bước 4 - Phân công &amp; Tiếp nhận thẩm định (Admin -&gt; Reviewer): Admin tiếp nhận khóa học chờ duyệt trên bảng quản trị và phân công 01 Thẩm định viên (Reviewer) phụ trách. Reviewer được chỉ định truy cập Reviewer Studio, mở khóa học và kiểm tra toàn diện chất lượng video, học liệu và câu hỏi thi.</w:t>
+        <w:lastRenderedPageBreak/>
+        <w:t>Bước 4 - Phân công &amp; Tiếp nhận thẩm định (Admin -&gt; Reviewer): Admin tiếp nhận khóa học chờ duyệt trên bảng quản trị và mở modal phân công tinh gọn (chỉ hiển thị tóm tắt thông tin khóa học và bộ chọn thẩm định viên) để phân công riêng: 01 Thẩm định viên chính (chịu trách nhiệm chính) HOẶC Hội đồng nhiều Thẩm định viên (đồng phản biện). Chỉ những Reviewer được phân công mới nhìn thấy khóa học trong Reviewer Studio với huy hiệu vai trò tương ứng để mở khóa học và kiểm tra toàn diện chất lượng video, học liệu và câu hỏi thi.</w:t>
       </w:r>
     </w:p>
     <w:p>
@@ -18162,14 +18371,14 @@
         <w:pStyle w:val="u3"/>
         <w:spacing w:before="120" w:after="40"/>
       </w:pPr>
-      <w:bookmarkStart w:id="39" w:name="_Toc242445200"/>
+      <w:bookmarkStart w:id="38" w:name="_Toc242445200"/>
       <w:r>
         <w:rPr>
           <w:rFonts w:ascii="Times New Roman" w:hAnsi="Times New Roman"/>
         </w:rPr>
         <w:t>5.4.2. Quy trình soạn thảo và kiểm định Flashcard chất lượng</w:t>
       </w:r>
-      <w:bookmarkEnd w:id="39"/>
+      <w:bookmarkEnd w:id="38"/>
     </w:p>
     <w:p>
       <w:pPr>
@@ -18206,7 +18415,6 @@
         <w:rPr>
           <w:b/>
         </w:rPr>
-        <w:lastRenderedPageBreak/>
         <w:t>Nguyên tắc 2 - Chặn tạo từ vựng:</w:t>
       </w:r>
       <w:r>
@@ -18250,14 +18458,14 @@
         <w:pStyle w:val="u3"/>
         <w:spacing w:before="120" w:after="40"/>
       </w:pPr>
-      <w:bookmarkStart w:id="40" w:name="_Toc242445201"/>
+      <w:bookmarkStart w:id="39" w:name="_Toc242445201"/>
       <w:r>
         <w:rPr>
           <w:rFonts w:ascii="Times New Roman" w:hAnsi="Times New Roman"/>
         </w:rPr>
         <w:t>5.4.3. Quy trình đánh giá năng lực và gợi ý lộ trình thích ứng</w:t>
       </w:r>
-      <w:bookmarkEnd w:id="40"/>
+      <w:bookmarkEnd w:id="39"/>
     </w:p>
     <w:p>
       <w:pPr>
@@ -18337,28 +18545,29 @@
         <w:pStyle w:val="u1"/>
         <w:spacing w:before="280" w:after="120"/>
       </w:pPr>
-      <w:bookmarkStart w:id="41" w:name="_Toc242445202"/>
+      <w:bookmarkStart w:id="40" w:name="_Toc242445202"/>
       <w:r>
         <w:rPr>
           <w:rFonts w:ascii="Times New Roman" w:hAnsi="Times New Roman"/>
         </w:rPr>
+        <w:lastRenderedPageBreak/>
         <w:t>6. THIẾT KẾ KIẾN TRÚC HỆ THỐNG VÀ CƠ SỞ DỮ LIỆU</w:t>
       </w:r>
-      <w:bookmarkEnd w:id="41"/>
+      <w:bookmarkEnd w:id="40"/>
     </w:p>
     <w:p>
       <w:pPr>
         <w:pStyle w:val="u2"/>
         <w:spacing w:after="80"/>
       </w:pPr>
-      <w:bookmarkStart w:id="42" w:name="_Toc242445203"/>
+      <w:bookmarkStart w:id="41" w:name="_Toc242445203"/>
       <w:r>
         <w:rPr>
           <w:rFonts w:ascii="Times New Roman" w:hAnsi="Times New Roman"/>
         </w:rPr>
         <w:t>6.1. Kiến trúc hệ thống tổng thể</w:t>
       </w:r>
-      <w:bookmarkEnd w:id="42"/>
+      <w:bookmarkEnd w:id="41"/>
     </w:p>
     <w:p>
       <w:pPr>
@@ -18662,7 +18871,6 @@
               <w:rPr>
                 <w:sz w:val="20"/>
               </w:rPr>
-              <w:lastRenderedPageBreak/>
               <w:t>Business Logic Layer (Services)</w:t>
             </w:r>
           </w:p>
@@ -18878,14 +19086,14 @@
         <w:pStyle w:val="u2"/>
         <w:spacing w:after="80"/>
       </w:pPr>
-      <w:bookmarkStart w:id="43" w:name="_Toc242445204"/>
+      <w:bookmarkStart w:id="42" w:name="_Toc242445204"/>
       <w:r>
         <w:rPr>
           <w:rFonts w:ascii="Times New Roman" w:hAnsi="Times New Roman"/>
         </w:rPr>
         <w:t>6.2. Cấu trúc các Django Apps và Module nghiệp vụ backend</w:t>
       </w:r>
-      <w:bookmarkEnd w:id="43"/>
+      <w:bookmarkEnd w:id="42"/>
     </w:p>
     <w:p>
       <w:pPr>
@@ -19111,6 +19319,7 @@
               <w:rPr>
                 <w:sz w:val="20"/>
               </w:rPr>
+              <w:lastRenderedPageBreak/>
               <w:t>courses</w:t>
             </w:r>
           </w:p>
@@ -19705,14 +19914,7 @@
               <w:rPr>
                 <w:sz w:val="20"/>
               </w:rPr>
-              <w:t xml:space="preserve">Quản lý hàng đợi duyệt của Reviewer, lịch sử phản </w:t>
-            </w:r>
-            <w:r>
-              <w:rPr>
-                <w:sz w:val="20"/>
-              </w:rPr>
-              <w:lastRenderedPageBreak/>
-              <w:t>biện 2 chiều (ReviewLog) cho Course và Flashcard.</w:t>
+              <w:t>Quản lý hàng đợi duyệt của Reviewer, lịch sử phản biện 2 chiều (ReviewLog) cho Course và Flashcard.</w:t>
             </w:r>
           </w:p>
         </w:tc>
@@ -19742,7 +19944,6 @@
               <w:rPr>
                 <w:sz w:val="20"/>
               </w:rPr>
-              <w:lastRenderedPageBreak/>
               <w:t>certificates</w:t>
             </w:r>
           </w:p>
@@ -19802,14 +20003,14 @@
         <w:pStyle w:val="u2"/>
         <w:spacing w:after="80"/>
       </w:pPr>
-      <w:bookmarkStart w:id="44" w:name="_Toc242445205"/>
+      <w:bookmarkStart w:id="43" w:name="_Toc242445205"/>
       <w:r>
         <w:rPr>
           <w:rFonts w:ascii="Times New Roman" w:hAnsi="Times New Roman"/>
         </w:rPr>
         <w:t>6.3. Thiết kế cơ sở dữ liệu quan hệ (Entity Relationship)</w:t>
       </w:r>
-      <w:bookmarkEnd w:id="44"/>
+      <w:bookmarkEnd w:id="43"/>
     </w:p>
     <w:p>
       <w:pPr>
@@ -20208,8 +20409,14 @@
             <w:vAlign w:val="center"/>
           </w:tcPr>
           <w:p>
-            <w:r>
-              <w:t>PK: id, FK: teacher_id, reviewer_id, category_id</w:t>
+            <w:pPr>
+              <w:spacing w:before="40" w:after="40"/>
+            </w:pPr>
+            <w:r>
+              <w:rPr>
+                <w:sz w:val="20"/>
+              </w:rPr>
+              <w:t>PK: id, FK: teacher_id, reviewer_id, category_id, M2M: co_reviewers</w:t>
             </w:r>
           </w:p>
         </w:tc>
@@ -20226,8 +20433,21 @@
             <w:vAlign w:val="center"/>
           </w:tcPr>
           <w:p>
-            <w:r>
-              <w:t>Thông tin khóa học: title, description, thumbnail, price, status (Draft/Pending/Published/Rejected), teacher_id (Giảng viên phụ trách), reviewer_id (Thẩm định viên được phân công), rejection_reason, reviewed_at.</w:t>
+            <w:pPr>
+              <w:spacing w:before="40" w:after="40"/>
+            </w:pPr>
+            <w:r>
+              <w:rPr>
+                <w:sz w:val="20"/>
+              </w:rPr>
+              <w:t xml:space="preserve">Thông tin khóa học: title, description, thumbnail, price, status (Draft/Pending/Published/Rejected), teacher_id (Giảng viên phụ trách), reviewer_id (Thẩm định viên chính), co_reviewers (Hội đồng phản biện - ManyToMany với CustomUser), rejection_reason, reviewed_at, created_at, </w:t>
+            </w:r>
+            <w:r>
+              <w:rPr>
+                <w:sz w:val="20"/>
+              </w:rPr>
+              <w:lastRenderedPageBreak/>
+              <w:t>updated_at.</w:t>
             </w:r>
           </w:p>
         </w:tc>
@@ -20257,6 +20477,7 @@
               <w:rPr>
                 <w:sz w:val="20"/>
               </w:rPr>
+              <w:lastRenderedPageBreak/>
               <w:t>Chapter</w:t>
             </w:r>
           </w:p>
@@ -20959,7 +21180,6 @@
               <w:rPr>
                 <w:sz w:val="20"/>
               </w:rPr>
-              <w:lastRenderedPageBreak/>
               <w:t>VocabularyTopic</w:t>
             </w:r>
           </w:p>
@@ -21087,6 +21307,60 @@
                 <w:sz w:val="20"/>
               </w:rPr>
               <w:t>Thẻ từ vựng: word, ipa, part_of_speech, meaning, example_sentence, audio_url.</w:t>
+            </w:r>
+          </w:p>
+        </w:tc>
+      </w:tr>
+      <w:tr>
+        <w:trPr>
+          <w:jc w:val="center"/>
+        </w:trPr>
+        <w:tc>
+          <w:tcPr>
+            <w:tcW w:w="2160" w:type="dxa"/>
+          </w:tcPr>
+          <w:p>
+            <w:pPr>
+              <w:spacing w:before="40" w:after="40"/>
+            </w:pPr>
+            <w:r>
+              <w:rPr>
+                <w:b/>
+                <w:sz w:val="20"/>
+              </w:rPr>
+              <w:t>Certificate</w:t>
+            </w:r>
+          </w:p>
+        </w:tc>
+        <w:tc>
+          <w:tcPr>
+            <w:tcW w:w="2736" w:type="dxa"/>
+          </w:tcPr>
+          <w:p>
+            <w:pPr>
+              <w:spacing w:before="40" w:after="40"/>
+            </w:pPr>
+            <w:r>
+              <w:rPr>
+                <w:sz w:val="20"/>
+              </w:rPr>
+              <w:t>PK: id, FK: enrollment_id, student_id, course_id</w:t>
+            </w:r>
+          </w:p>
+        </w:tc>
+        <w:tc>
+          <w:tcPr>
+            <w:tcW w:w="4464" w:type="dxa"/>
+          </w:tcPr>
+          <w:p>
+            <w:pPr>
+              <w:spacing w:before="40" w:after="40"/>
+            </w:pPr>
+            <w:r>
+              <w:rPr>
+                <w:sz w:val="20"/>
+              </w:rPr>
+              <w:t>Chứng chỉ điện tử: certificate_code (mã định danh duy nhất xác thực công khai), issued_at, completion_grade, qr_code_url, pdf_url.</w:t>
             </w:r>
           </w:p>
         </w:tc>
@@ -21097,14 +21371,14 @@
         <w:pStyle w:val="u2"/>
         <w:spacing w:after="80"/>
       </w:pPr>
-      <w:bookmarkStart w:id="45" w:name="_Toc242445206"/>
+      <w:bookmarkStart w:id="44" w:name="_Toc242445206"/>
       <w:r>
         <w:rPr>
           <w:rFonts w:ascii="Times New Roman" w:hAnsi="Times New Roman"/>
         </w:rPr>
         <w:t>6.4. Các mối quan hệ dữ liệu then chốt trong hệ thống</w:t>
       </w:r>
-      <w:bookmarkEnd w:id="45"/>
+      <w:bookmarkEnd w:id="44"/>
     </w:p>
     <w:p>
       <w:pPr>
@@ -21171,6 +21445,7 @@
           <w:b/>
           <w:lang w:val="fr-FR"/>
         </w:rPr>
+        <w:lastRenderedPageBreak/>
         <w:t xml:space="preserve">Lịch sử đánh giá năng lực: </w:t>
       </w:r>
       <w:r>
@@ -21208,14 +21483,14 @@
         <w:pStyle w:val="u2"/>
         <w:spacing w:after="80"/>
       </w:pPr>
-      <w:bookmarkStart w:id="46" w:name="_Toc242445207"/>
+      <w:bookmarkStart w:id="45" w:name="_Toc242445207"/>
       <w:r>
         <w:rPr>
           <w:rFonts w:ascii="Times New Roman" w:hAnsi="Times New Roman"/>
         </w:rPr>
         <w:t>6.5. Thiết kế giao diện lập trình ứng dụng (RESTful API Specifications)</w:t>
       </w:r>
-      <w:bookmarkEnd w:id="46"/>
+      <w:bookmarkEnd w:id="45"/>
     </w:p>
     <w:p>
       <w:pPr>
@@ -21663,8 +21938,14 @@
             <w:vAlign w:val="center"/>
           </w:tcPr>
           <w:p>
-            <w:r>
-              <w:t>GET: Lấy danh sách khóa học (phân trang 8 khóa/trang); POST (Teacher): Giảng viên khởi tạo khóa học mới; Admin quản lý và gán Thẩm định viên</w:t>
+            <w:pPr>
+              <w:spacing w:before="40" w:after="40"/>
+            </w:pPr>
+            <w:r>
+              <w:rPr>
+                <w:sz w:val="20"/>
+              </w:rPr>
+              <w:t>GET: Lấy danh sách khóa học (phân trang 8 khóa/trang); POST (Teacher): Giảng viên khởi tạo khóa học mới (áp dụng Rate Limit &amp; Anti-Spam: tối đa 5 khóa chưa duyệt, giãn cách 5 phút, chặn trùng tên).</w:t>
             </w:r>
           </w:p>
         </w:tc>
@@ -21857,8 +22138,14 @@
             <w:vAlign w:val="center"/>
           </w:tcPr>
           <w:p>
-            <w:r>
-              <w:t>Reviewer phản biện khóa học được phân công: Phê duyệt (Approve) hoặc Từ chối (Reject)</w:t>
+            <w:pPr>
+              <w:spacing w:before="40" w:after="40"/>
+            </w:pPr>
+            <w:r>
+              <w:rPr>
+                <w:sz w:val="20"/>
+              </w:rPr>
+              <w:t>Reviewer được phân công (Trưởng thẩm định hoặc Hội đồng phản biện) thực hiện thẩm định: Phê duyệt (Approve) hoặc Từ chối kèm lý do phản biện (Reject).</w:t>
             </w:r>
           </w:p>
         </w:tc>
@@ -22379,6 +22666,75 @@
                 <w:sz w:val="20"/>
               </w:rPr>
               <w:t>Quản lý danh sách chủ đề từ vựng của người dùng</w:t>
+            </w:r>
+          </w:p>
+        </w:tc>
+      </w:tr>
+      <w:tr>
+        <w:trPr>
+          <w:jc w:val="center"/>
+        </w:trPr>
+        <w:tc>
+          <w:tcPr>
+            <w:tcW w:w="1728" w:type="dxa"/>
+          </w:tcPr>
+          <w:p>
+            <w:pPr>
+              <w:spacing w:before="40" w:after="40"/>
+            </w:pPr>
+            <w:r>
+              <w:rPr>
+                <w:sz w:val="20"/>
+              </w:rPr>
+              <w:t>GET</w:t>
+            </w:r>
+          </w:p>
+        </w:tc>
+        <w:tc>
+          <w:tcPr>
+            <w:tcW w:w="3168" w:type="dxa"/>
+          </w:tcPr>
+          <w:p>
+            <w:pPr>
+              <w:spacing w:before="40" w:after="40"/>
+            </w:pPr>
+            <w:r>
+              <w:rPr>
+                <w:sz w:val="20"/>
+              </w:rPr>
+              <w:t>/api/v1/learning/certificates/{code}/</w:t>
+            </w:r>
+          </w:p>
+        </w:tc>
+        <w:tc>
+          <w:tcPr>
+            <w:tcW w:w="2160" w:type="dxa"/>
+          </w:tcPr>
+          <w:p>
+            <w:pPr>
+              <w:spacing w:before="40" w:after="40"/>
+            </w:pPr>
+            <w:r>
+              <w:rPr>
+                <w:sz w:val="20"/>
+              </w:rPr>
+              <w:t>Public</w:t>
+            </w:r>
+          </w:p>
+        </w:tc>
+        <w:tc>
+          <w:tcPr>
+            <w:tcW w:w="2304" w:type="dxa"/>
+          </w:tcPr>
+          <w:p>
+            <w:pPr>
+              <w:spacing w:before="40" w:after="40"/>
+            </w:pPr>
+            <w:r>
+              <w:rPr>
+                <w:sz w:val="20"/>
+              </w:rPr>
+              <w:t>Tra cứu và xác thực tính hợp lệ của chứng chỉ điện tử theo mã tra cứu (Certificate Verification), hỗ trợ in phôi chuẩn A4 Landscape.</w:t>
             </w:r>
           </w:p>
         </w:tc>
@@ -22389,28 +22745,28 @@
         <w:pStyle w:val="u1"/>
         <w:spacing w:before="280" w:after="120"/>
       </w:pPr>
-      <w:bookmarkStart w:id="47" w:name="_Toc242445208"/>
+      <w:bookmarkStart w:id="46" w:name="_Toc242445208"/>
       <w:r>
         <w:rPr>
           <w:rFonts w:ascii="Times New Roman" w:hAnsi="Times New Roman"/>
         </w:rPr>
         <w:t>7. THIẾT KẾ VÀ TÍCH HỢP 4 TÍNH NĂNG TRÍ TUỆ NHÂN TẠO (AI) &amp; TIỆN ÍCH HỌC TẬP</w:t>
       </w:r>
-      <w:bookmarkEnd w:id="47"/>
+      <w:bookmarkEnd w:id="46"/>
     </w:p>
     <w:p>
       <w:pPr>
         <w:pStyle w:val="u2"/>
         <w:spacing w:after="80"/>
       </w:pPr>
-      <w:bookmarkStart w:id="48" w:name="_Toc242445209"/>
+      <w:bookmarkStart w:id="47" w:name="_Toc242445209"/>
       <w:r>
         <w:rPr>
           <w:rFonts w:ascii="Times New Roman" w:hAnsi="Times New Roman"/>
         </w:rPr>
         <w:t>7.1. Tính năng AI 1: AI English Tutor &amp; Explainer</w:t>
       </w:r>
-      <w:bookmarkEnd w:id="48"/>
+      <w:bookmarkEnd w:id="47"/>
     </w:p>
     <w:p>
       <w:pPr>
@@ -22474,14 +22830,15 @@
         <w:pStyle w:val="u2"/>
         <w:spacing w:after="80"/>
       </w:pPr>
-      <w:bookmarkStart w:id="49" w:name="_Toc242445210"/>
+      <w:bookmarkStart w:id="48" w:name="_Toc242445210"/>
       <w:r>
         <w:rPr>
           <w:rFonts w:ascii="Times New Roman" w:hAnsi="Times New Roman"/>
         </w:rPr>
+        <w:lastRenderedPageBreak/>
         <w:t>7.2. Tính năng AI 2: AI Quiz Generator</w:t>
       </w:r>
-      <w:bookmarkEnd w:id="49"/>
+      <w:bookmarkEnd w:id="48"/>
     </w:p>
     <w:p>
       <w:pPr>
@@ -22502,7 +22859,6 @@
         <w:rPr>
           <w:b/>
         </w:rPr>
-        <w:lastRenderedPageBreak/>
         <w:t xml:space="preserve">Đầu vào kiểm soát (Controlled Input): </w:t>
       </w:r>
       <w:r>
@@ -22546,14 +22902,14 @@
         <w:pStyle w:val="u2"/>
         <w:spacing w:after="80"/>
       </w:pPr>
-      <w:bookmarkStart w:id="50" w:name="_Toc242445211"/>
+      <w:bookmarkStart w:id="49" w:name="_Toc242445211"/>
       <w:r>
         <w:rPr>
           <w:rFonts w:ascii="Times New Roman" w:hAnsi="Times New Roman"/>
         </w:rPr>
         <w:t>7.3. Tính năng AI 3: AI Adaptive Roadmap &amp; Weak Topic Practice</w:t>
       </w:r>
-      <w:bookmarkEnd w:id="50"/>
+      <w:bookmarkEnd w:id="49"/>
     </w:p>
     <w:p>
       <w:pPr>
@@ -22633,14 +22989,14 @@
         <w:pStyle w:val="u2"/>
         <w:spacing w:after="80"/>
       </w:pPr>
-      <w:bookmarkStart w:id="51" w:name="_Toc242445212"/>
+      <w:bookmarkStart w:id="50" w:name="_Toc242445212"/>
       <w:r>
         <w:rPr>
           <w:rFonts w:ascii="Times New Roman" w:hAnsi="Times New Roman"/>
         </w:rPr>
         <w:t>7.4. Tính năng AI 4: AI Course Assistant &amp; Summarizer</w:t>
       </w:r>
-      <w:bookmarkEnd w:id="51"/>
+      <w:bookmarkEnd w:id="50"/>
     </w:p>
     <w:p>
       <w:pPr>
@@ -22704,14 +23060,15 @@
         <w:pStyle w:val="u2"/>
         <w:spacing w:after="80"/>
       </w:pPr>
-      <w:bookmarkStart w:id="52" w:name="_Toc242445213"/>
+      <w:bookmarkStart w:id="51" w:name="_Toc242445213"/>
       <w:r>
         <w:rPr>
           <w:rFonts w:ascii="Times New Roman" w:hAnsi="Times New Roman"/>
         </w:rPr>
+        <w:lastRenderedPageBreak/>
         <w:t>7.5. Phân hệ tiện ích: Import ngân hàng câu hỏi đa định dạng</w:t>
       </w:r>
-      <w:bookmarkEnd w:id="52"/>
+      <w:bookmarkEnd w:id="51"/>
     </w:p>
     <w:p>
       <w:pPr>
@@ -22732,7 +23089,6 @@
         <w:rPr>
           <w:b/>
         </w:rPr>
-        <w:lastRenderedPageBreak/>
         <w:t>Đa dạng định dạng:</w:t>
       </w:r>
       <w:r>
@@ -22776,14 +23132,14 @@
         <w:pStyle w:val="u2"/>
         <w:spacing w:after="80"/>
       </w:pPr>
-      <w:bookmarkStart w:id="53" w:name="_Toc242445214"/>
+      <w:bookmarkStart w:id="52" w:name="_Toc242445214"/>
       <w:r>
         <w:rPr>
           <w:rFonts w:ascii="Times New Roman" w:hAnsi="Times New Roman"/>
         </w:rPr>
         <w:t>7.6. Phân hệ tiện ích: Học từ vựng Flashcard &amp; Web Speech API</w:t>
       </w:r>
-      <w:bookmarkEnd w:id="53"/>
+      <w:bookmarkEnd w:id="52"/>
     </w:p>
     <w:p>
       <w:pPr>
@@ -22847,28 +23203,28 @@
         <w:pStyle w:val="u1"/>
         <w:spacing w:before="280" w:after="120"/>
       </w:pPr>
-      <w:bookmarkStart w:id="54" w:name="_Toc242445215"/>
+      <w:bookmarkStart w:id="53" w:name="_Toc242445215"/>
       <w:r>
         <w:rPr>
           <w:rFonts w:ascii="Times New Roman" w:hAnsi="Times New Roman"/>
         </w:rPr>
         <w:t>8. CÁC SƠ ĐỒ THIẾT KẾ VÀ TÀI LIỆU KỸ THUẬT CẦN HOÀN THIỆN</w:t>
       </w:r>
-      <w:bookmarkEnd w:id="54"/>
+      <w:bookmarkEnd w:id="53"/>
     </w:p>
     <w:p>
       <w:pPr>
         <w:pStyle w:val="u2"/>
         <w:spacing w:after="80"/>
       </w:pPr>
-      <w:bookmarkStart w:id="55" w:name="_Toc242445216"/>
+      <w:bookmarkStart w:id="54" w:name="_Toc242445216"/>
       <w:r>
         <w:rPr>
           <w:rFonts w:ascii="Times New Roman" w:hAnsi="Times New Roman"/>
         </w:rPr>
         <w:t>8.1. Danh mục sơ đồ UML và tài liệu kỹ thuật</w:t>
       </w:r>
-      <w:bookmarkEnd w:id="55"/>
+      <w:bookmarkEnd w:id="54"/>
     </w:p>
     <w:p>
       <w:pPr>
@@ -23353,6 +23709,7 @@
               <w:rPr>
                 <w:sz w:val="20"/>
               </w:rPr>
+              <w:lastRenderedPageBreak/>
               <w:t>4</w:t>
             </w:r>
           </w:p>
@@ -23559,7 +23916,6 @@
               <w:rPr>
                 <w:sz w:val="20"/>
               </w:rPr>
-              <w:lastRenderedPageBreak/>
               <w:t>6</w:t>
             </w:r>
           </w:p>
@@ -24262,14 +24618,14 @@
         <w:pStyle w:val="u2"/>
         <w:spacing w:after="80"/>
       </w:pPr>
-      <w:bookmarkStart w:id="56" w:name="_Toc242445217"/>
+      <w:bookmarkStart w:id="55" w:name="_Toc242445217"/>
       <w:r>
         <w:rPr>
           <w:rFonts w:ascii="Times New Roman" w:hAnsi="Times New Roman"/>
         </w:rPr>
         <w:t>8.2. Danh mục Sequence Diagram bắt buộc ưu tiên</w:t>
       </w:r>
-      <w:bookmarkEnd w:id="56"/>
+      <w:bookmarkEnd w:id="55"/>
     </w:p>
     <w:p>
       <w:pPr>
@@ -24335,28 +24691,29 @@
         <w:pStyle w:val="u1"/>
         <w:spacing w:before="280" w:after="120"/>
       </w:pPr>
-      <w:bookmarkStart w:id="57" w:name="_Toc242445218"/>
+      <w:bookmarkStart w:id="56" w:name="_Toc242445218"/>
       <w:r>
         <w:rPr>
           <w:rFonts w:ascii="Times New Roman" w:hAnsi="Times New Roman"/>
         </w:rPr>
+        <w:lastRenderedPageBreak/>
         <w:t>9. CHIẾN LƯỢC KIỂM THỬ VÀ ĐÁNH GIÁ CHẤT LƯỢNG HỆ THỐNG</w:t>
       </w:r>
-      <w:bookmarkEnd w:id="57"/>
+      <w:bookmarkEnd w:id="56"/>
     </w:p>
     <w:p>
       <w:pPr>
         <w:pStyle w:val="u2"/>
         <w:spacing w:after="80"/>
       </w:pPr>
-      <w:bookmarkStart w:id="58" w:name="_Toc242445219"/>
+      <w:bookmarkStart w:id="57" w:name="_Toc242445219"/>
       <w:r>
         <w:rPr>
           <w:rFonts w:ascii="Times New Roman" w:hAnsi="Times New Roman"/>
         </w:rPr>
         <w:t>9.1. Kế hoạch kiểm thử đa tầng</w:t>
       </w:r>
-      <w:bookmarkEnd w:id="58"/>
+      <w:bookmarkEnd w:id="57"/>
     </w:p>
     <w:p>
       <w:pPr>
@@ -24384,7 +24741,6 @@
         <w:rPr>
           <w:b/>
         </w:rPr>
-        <w:lastRenderedPageBreak/>
         <w:t xml:space="preserve">Integration &amp; API Testing (Kiểm thử tích hợp): </w:t>
       </w:r>
       <w:r>
@@ -24428,14 +24784,14 @@
         <w:pStyle w:val="u2"/>
         <w:spacing w:after="80"/>
       </w:pPr>
-      <w:bookmarkStart w:id="59" w:name="_Toc242445220"/>
+      <w:bookmarkStart w:id="58" w:name="_Toc242445220"/>
       <w:r>
         <w:rPr>
           <w:rFonts w:ascii="Times New Roman" w:hAnsi="Times New Roman"/>
         </w:rPr>
         <w:t>9.2. Tiêu chí và bộ dữ liệu đánh giá chất lượng AI (AI Evaluation Dataset)</w:t>
       </w:r>
-      <w:bookmarkEnd w:id="59"/>
+      <w:bookmarkEnd w:id="58"/>
     </w:p>
     <w:p>
       <w:pPr>
@@ -24948,7 +25304,14 @@
               <w:rPr>
                 <w:sz w:val="20"/>
               </w:rPr>
-              <w:t>Hệ thống từ chối trả lời một cách lịch sự khi người dùng hỏi các chủ đề độc hại, thù địch hoặc không liên quan đến giáo dục tiếng Anh.</w:t>
+              <w:t xml:space="preserve">Hệ thống từ chối trả lời một cách lịch sự khi người dùng hỏi các chủ đề độc hại, thù địch </w:t>
+            </w:r>
+            <w:r>
+              <w:rPr>
+                <w:sz w:val="20"/>
+              </w:rPr>
+              <w:lastRenderedPageBreak/>
+              <w:t>hoặc không liên quan đến giáo dục tiếng Anh.</w:t>
             </w:r>
           </w:p>
         </w:tc>
@@ -24959,7 +25322,7 @@
         <w:pStyle w:val="u1"/>
         <w:spacing w:before="280" w:after="120"/>
       </w:pPr>
-      <w:bookmarkStart w:id="60" w:name="_Toc242445221"/>
+      <w:bookmarkStart w:id="59" w:name="_Toc242445221"/>
       <w:r>
         <w:rPr>
           <w:rFonts w:ascii="Times New Roman" w:hAnsi="Times New Roman"/>
@@ -24967,21 +25330,21 @@
         <w:lastRenderedPageBreak/>
         <w:t>10. KẾ HOẠCH VÀ LỘ TRÌNH THỰC HIỆN ĐỒ ÁN</w:t>
       </w:r>
-      <w:bookmarkEnd w:id="60"/>
+      <w:bookmarkEnd w:id="59"/>
     </w:p>
     <w:p>
       <w:pPr>
         <w:pStyle w:val="u2"/>
         <w:spacing w:after="80"/>
       </w:pPr>
-      <w:bookmarkStart w:id="61" w:name="_Toc242445222"/>
+      <w:bookmarkStart w:id="60" w:name="_Toc242445222"/>
       <w:r>
         <w:rPr>
           <w:rFonts w:ascii="Times New Roman" w:hAnsi="Times New Roman"/>
         </w:rPr>
         <w:t>10.1. Tiêu chí hoàn thành cho từng User Story (Definition of Done - DoD)</w:t>
       </w:r>
-      <w:bookmarkEnd w:id="61"/>
+      <w:bookmarkEnd w:id="60"/>
     </w:p>
     <w:p>
       <w:pPr>
@@ -25047,14 +25410,14 @@
         <w:pStyle w:val="u2"/>
         <w:spacing w:after="80"/>
       </w:pPr>
-      <w:bookmarkStart w:id="62" w:name="_Toc242445223"/>
+      <w:bookmarkStart w:id="61" w:name="_Toc242445223"/>
       <w:r>
         <w:rPr>
           <w:rFonts w:ascii="Times New Roman" w:hAnsi="Times New Roman"/>
         </w:rPr>
         <w:t>10.2. Lộ trình triển khai chi tiết qua 5 giai đoạn</w:t>
       </w:r>
-      <w:bookmarkEnd w:id="62"/>
+      <w:bookmarkEnd w:id="61"/>
     </w:p>
     <w:p>
       <w:pPr>
@@ -25539,6 +25902,7 @@
               <w:rPr>
                 <w:sz w:val="20"/>
               </w:rPr>
+              <w:lastRenderedPageBreak/>
               <w:t>Giai đoạn 4: Tích hợp AI &amp; Tiện ích</w:t>
             </w:r>
           </w:p>
@@ -25588,14 +25952,7 @@
               <w:rPr>
                 <w:sz w:val="20"/>
               </w:rPr>
-              <w:t xml:space="preserve">Tích hợp Gemini AI (AI Tutor, AI Quiz Generator có JSON Schema, </w:t>
-            </w:r>
-            <w:r>
-              <w:rPr>
-                <w:sz w:val="20"/>
-              </w:rPr>
-              <w:lastRenderedPageBreak/>
-              <w:t>Adaptive Roadmap), phân hệ Import đề thi từ Word/Excel và Web Speech Text-to-Speech.</w:t>
+              <w:t>Tích hợp Gemini AI (AI Tutor, AI Quiz Generator có JSON Schema, Adaptive Roadmap), phân hệ Import đề thi từ Word/Excel và Web Speech Text-to-Speech.</w:t>
             </w:r>
           </w:p>
         </w:tc>
@@ -25619,15 +25976,7 @@
               <w:rPr>
                 <w:sz w:val="20"/>
               </w:rPr>
-              <w:lastRenderedPageBreak/>
-              <w:t xml:space="preserve">Hệ thống hoàn chỉnh tích hợp 4 tính năng </w:t>
-            </w:r>
-            <w:r>
-              <w:rPr>
-                <w:sz w:val="20"/>
-              </w:rPr>
-              <w:lastRenderedPageBreak/>
-              <w:t>AI, hoàn thành Sprint 4-5.</w:t>
+              <w:t>Hệ thống hoàn chỉnh tích hợp 4 tính năng AI, hoàn thành Sprint 4-5.</w:t>
             </w:r>
           </w:p>
         </w:tc>
@@ -25657,7 +26006,6 @@
               <w:rPr>
                 <w:sz w:val="20"/>
               </w:rPr>
-              <w:lastRenderedPageBreak/>
               <w:t>Giai đoạn 5: Kiểm thử, Tối ưu &amp; Tổng kết</w:t>
             </w:r>
           </w:p>
@@ -25742,14 +26090,14 @@
         <w:pStyle w:val="u1"/>
         <w:spacing w:before="280" w:after="120"/>
       </w:pPr>
-      <w:bookmarkStart w:id="63" w:name="_Toc242445224"/>
+      <w:bookmarkStart w:id="62" w:name="_Toc242445224"/>
       <w:r>
         <w:rPr>
           <w:rFonts w:ascii="Times New Roman" w:hAnsi="Times New Roman"/>
         </w:rPr>
         <w:t>11. KẾT QUẢ DỰ KIẾN VÀ SẢN PHẨM BÀN GIAO</w:t>
       </w:r>
-      <w:bookmarkEnd w:id="63"/>
+      <w:bookmarkEnd w:id="62"/>
     </w:p>
     <w:p>
       <w:pPr>
@@ -25835,14 +26183,14 @@
         <w:pStyle w:val="u1"/>
         <w:spacing w:before="280" w:after="120"/>
       </w:pPr>
-      <w:bookmarkStart w:id="64" w:name="_Toc242445225"/>
+      <w:bookmarkStart w:id="63" w:name="_Toc242445225"/>
       <w:r>
         <w:rPr>
           <w:rFonts w:ascii="Times New Roman" w:hAnsi="Times New Roman"/>
         </w:rPr>
         <w:t>12. TÀI LIỆU THAM KHẢO</w:t>
       </w:r>
-      <w:bookmarkEnd w:id="64"/>
+      <w:bookmarkEnd w:id="63"/>
     </w:p>
     <w:p>
       <w:pPr>
@@ -25895,6 +26243,7 @@
         <w:jc w:val="both"/>
       </w:pPr>
       <w:r>
+        <w:lastRenderedPageBreak/>
         <w:t>[6] Microsoft Corporation. Microsoft SQL Server &amp; Entity Framework Core Documentation. https://learn.microsoft.com/sql/</w:t>
       </w:r>
     </w:p>
@@ -25904,7 +26253,6 @@
         <w:jc w:val="both"/>
       </w:pPr>
       <w:r>
-        <w:lastRenderedPageBreak/>
         <w:t>[7] PostgreSQL Global Development Group. PostgreSQL 15+ Reference Manual. https://www.postgresql.org/docs/</w:t>
       </w:r>
     </w:p>
@@ -25940,14 +26288,14 @@
         <w:pStyle w:val="u1"/>
         <w:spacing w:before="280" w:after="120"/>
       </w:pPr>
-      <w:bookmarkStart w:id="65" w:name="_Toc242445226"/>
+      <w:bookmarkStart w:id="64" w:name="_Toc242445226"/>
       <w:r>
         <w:rPr>
           <w:rFonts w:ascii="Times New Roman" w:hAnsi="Times New Roman"/>
         </w:rPr>
         <w:t>13. TỔNG KẾT VÀ BẢN CAM KẾT CHUẨN HÓA ĐỒ ÁN</w:t>
       </w:r>
-      <w:bookmarkEnd w:id="65"/>
+      <w:bookmarkEnd w:id="64"/>
     </w:p>
     <w:p>
       <w:pPr>
@@ -25995,7 +26343,7 @@
         <w:jc w:val="both"/>
       </w:pPr>
       <w:r>
-        <w:t>Đồng bộ hóa toàn bộ quy trình nghiệp vụ thực tế: Admin tạo danh mục khóa học &amp; cấp tài khoản, Teacher tự tạo khóa học &amp; biên soạn giáo trình, Admin phân công Thẩm định viên, Reviewer thẩm định 2 chiều, chặn tạo từ vựng khi chưa có chủ đề, phân trang 8 khóa học/trang và thông báo Toast cố định góc dưới bên phải màn hình.</w:t>
+        <w:t>Đồng bộ hóa toàn bộ quy trình nghiệp vụ thực tế: Admin tạo danh mục khóa học &amp; cấp tài khoản; Giảng viên tự tạo khóa học có kiểm soát giới hạn chống spam &amp; biên soạn giáo trình; Admin phân công riêng 1 Thẩm định viên chính hoặc Hội đồng thẩm định qua giao diện tinh gọn; Reviewer được phân công thẩm định 2 chiều; chặn tạo từ vựng khi chưa có chủ đề; phân hệ tra cứu chứng chỉ công khai hỗ trợ in ấn A4 chuẩn; tiến độ học tập và XP tính toán thực tế từ CSDL; thông báo Toast cố định góc dưới bên phải màn hình.</w:t>
       </w:r>
     </w:p>
     <w:p>
@@ -26880,7 +27228,6 @@
   <w:style w:type="character" w:default="1" w:styleId="Phngmcinhcuaoanvn">
     <w:name w:val="Default Paragraph Font"/>
     <w:uiPriority w:val="1"/>
-    <w:semiHidden/>
     <w:unhideWhenUsed/>
   </w:style>
   <w:style w:type="table" w:default="1" w:styleId="BangThngthng">

</xml_diff>